<commit_message>
feat: add Grok as native A2A mesh peer
</commit_message>
<xml_diff>
--- a/assets/Manual-completo-comandos-multiagente.docx
+++ b/assets/Manual-completo-comandos-multiagente.docx
@@ -3281,12 +3281,7 @@
               <w:jc w:val="left"/>
             </w:pPr>
             <w:r>
-              <w:rPr>
-                <w:rFonts w:ascii="Lato" w:hAnsi="Lato" w:eastAsia="Lato" w:cs="Lato"/>
-                <w:color w:val="273444"/>
-                <w:sz w:val="21"/>
-              </w:rPr>
-              <w:t>Comparar três respostas rápidas</w:t>
+              <w:t>Comparar até quatro respostas rápidas</w:t>
             </w:r>
           </w:p>
         </w:tc>
@@ -3342,12 +3337,7 @@
               <w:jc w:val="left"/>
             </w:pPr>
             <w:r>
-              <w:rPr>
-                <w:rFonts w:ascii="Lato" w:hAnsi="Lato" w:eastAsia="Lato" w:cs="Lato"/>
-                <w:color w:val="273444"/>
-                <w:sz w:val="21"/>
-              </w:rPr>
-              <w:t>Dar papéis diferentes a Codex, Claude e Gemini</w:t>
+              <w:t>Dar papéis diferentes a Codex, Claude, Gemini e Grok</w:t>
             </w:r>
           </w:p>
         </w:tc>
@@ -8133,7 +8123,13 @@
           <w:color w:val="273444"/>
           <w:sz w:val="24"/>
         </w:rPr>
-        <w:t>O A2A Mesh é o caminho mais direto entre Codex, Claude e Gemini.</w:t>
+        <w:t>O A2A Mesh é o caminho mais direto entre Codex, Claude, Gemini e Grok 4.6 High.</w:t>
+      </w:r>
+    </w:p>
+    <w:p>
+      <w:pPr/>
+      <w:r>
+        <w:t>O Grok é executado exclusivamente pelo Cursor CLI, na porta 3144 e com o modelo fixo cursor-grok-4.6-high; não há fallback silencioso.</w:t>
       </w:r>
     </w:p>
     <w:p>
@@ -8151,7 +8147,7 @@
         </w:rPr>
         <w:drawing>
           <wp:inline xmlns:a="http://schemas.openxmlformats.org/drawingml/2006/main" xmlns:pic="http://schemas.openxmlformats.org/drawingml/2006/picture">
-            <wp:extent cx="5897880" cy="3663606"/>
+            <wp:extent cx="5897880" cy="3184407"/>
             <wp:docPr id="5" name="Picture 5" descr="Modos do A2A Mesh" title="Modos do A2A Mesh"/>
             <wp:cNvGraphicFramePr>
               <a:graphicFrameLocks noChangeAspect="1"/>
@@ -8172,7 +8168,7 @@
                   <pic:spPr>
                     <a:xfrm>
                       <a:off x="0" y="0"/>
-                      <a:ext cx="5897880" cy="3663606"/>
+                      <a:ext cx="5897880" cy="3184407"/>
                     </a:xfrm>
                     <a:prstGeom prst="rect"/>
                   </pic:spPr>
@@ -8239,7 +8235,7 @@
           <w:color w:val="273444"/>
           <w:sz w:val="24"/>
         </w:rPr>
-        <w:t xml:space="preserve"> verificar se os três backends estão ativos antes de um trabalho.</w:t>
+        <w:t xml:space="preserve"> verificar se quais dos quatro backends estão ativos antes de um trabalho.</w:t>
       </w:r>
     </w:p>
     <w:p>
@@ -8391,15 +8387,14 @@
           <w:sz w:val="24"/>
           <w:shd w:fill="EEF2F7"/>
         </w:rPr>
-        <w:t>codex</w:t>
-      </w:r>
-      <w:r>
-        <w:rPr>
-          <w:rFonts w:ascii="Lato" w:hAnsi="Lato" w:eastAsia="Lato" w:cs="Lato"/>
-          <w:color w:val="273444"/>
-          <w:sz w:val="24"/>
-        </w:rPr>
-        <w:t xml:space="preserve">, </w:t>
+        <w:t>codex, claude, gemini e grok</w:t>
+      </w:r>
+      <w:r>
+        <w:rPr>
+          <w:rFonts w:ascii="Lato" w:hAnsi="Lato" w:eastAsia="Lato" w:cs="Lato"/>
+          <w:color w:val="273444"/>
+          <w:sz w:val="24"/>
+        </w:rPr>
       </w:r>
       <w:r>
         <w:rPr>
@@ -8408,15 +8403,13 @@
           <w:sz w:val="24"/>
           <w:shd w:fill="EEF2F7"/>
         </w:rPr>
-        <w:t>claude</w:t>
-      </w:r>
-      <w:r>
-        <w:rPr>
-          <w:rFonts w:ascii="Lato" w:hAnsi="Lato" w:eastAsia="Lato" w:cs="Lato"/>
-          <w:color w:val="273444"/>
-          <w:sz w:val="24"/>
-        </w:rPr>
-        <w:t xml:space="preserve"> e </w:t>
+      </w:r>
+      <w:r>
+        <w:rPr>
+          <w:rFonts w:ascii="Lato" w:hAnsi="Lato" w:eastAsia="Lato" w:cs="Lato"/>
+          <w:color w:val="273444"/>
+          <w:sz w:val="24"/>
+        </w:rPr>
       </w:r>
       <w:r>
         <w:rPr>
@@ -8425,7 +8418,6 @@
           <w:sz w:val="24"/>
           <w:shd w:fill="EEF2F7"/>
         </w:rPr>
-        <w:t>gemini</w:t>
       </w:r>
       <w:r>
         <w:rPr>
@@ -8502,7 +8494,7 @@
           <w:color w:val="273444"/>
           <w:sz w:val="24"/>
         </w:rPr>
-        <w:t xml:space="preserve"> enviar o mesmo prompt aos três agentes em paralelo.</w:t>
+        <w:t xml:space="preserve"> enviar o mesmo prompt aos quatro agentes em paralelo.</w:t>
       </w:r>
     </w:p>
     <w:p>
@@ -8533,7 +8525,7 @@
           <w:color w:val="273444"/>
           <w:sz w:val="24"/>
         </w:rPr>
-        <w:t>Fluxo: um prompt → três respostas independentes → apresentação lado a lado. Não há crítica entre os agentes nem síntese obrigatória.</w:t>
+        <w:t>Fluxo: um prompt → quatro respostas independentes → apresentação lado a lado. Não há crítica entre os agentes nem síntese obrigatória.</w:t>
       </w:r>
     </w:p>
     <w:p>
@@ -8555,7 +8547,7 @@
           <w:color w:val="273444"/>
           <w:sz w:val="24"/>
         </w:rPr>
-        <w:t xml:space="preserve"> levantar rapidamente três hipóteses antes de iniciar uma investigação de código.</w:t>
+        <w:t xml:space="preserve"> levantar rapidamente hipóteses independentes antes de iniciar uma investigação de código.</w:t>
       </w:r>
     </w:p>
     <w:p>
@@ -8620,7 +8612,7 @@
           <w:color w:val="243447"/>
           <w:sz w:val="19"/>
         </w:rPr>
-        <w:t>/a2a-team codex=testador, claude=arquiteto, gemini=pesquisador. Planejem a</w:t>
+        <w:t>/a2a-team codex=testador, claude=arquiteto, gemini=pesquisador, grok=oponente. Planejem a</w:t>
         <w:br/>
         <w:t>migração do banco e consolidem um plano executável.</w:t>
       </w:r>
@@ -8657,7 +8649,7 @@
           <w:color w:val="273444"/>
           <w:sz w:val="24"/>
         </w:rPr>
-        <w:t xml:space="preserve"> Claude desenha a arquitetura, Codex cobre implementação e testes, e Gemini pesquisa compatibilidade.</w:t>
+        <w:t xml:space="preserve"> Claude desenha a arquitetura, Codex cobre implementação e testes, Gemini pesquisa compatibilidade e Grok procura pressupostos frágeis.</w:t>
       </w:r>
     </w:p>
     <w:p>
@@ -8704,7 +8696,7 @@
           <w:color w:val="273444"/>
           <w:sz w:val="24"/>
         </w:rPr>
-        <w:t xml:space="preserve"> realizar um debate em múltiplas interações entre os três agentes.</w:t>
+        <w:t xml:space="preserve"> realizar um debate em múltiplas interações entre os agentes selecionados.</w:t>
       </w:r>
     </w:p>
     <w:p>
@@ -8782,7 +8774,7 @@
           <w:color w:val="273444"/>
           <w:sz w:val="24"/>
         </w:rPr>
-        <w:t xml:space="preserve"> pedir um veredito conjunto rápido aos três agentes do mesh.</w:t>
+        <w:t xml:space="preserve"> pedir um veredito conjunto rápido aos agentes selecionados do mesh.</w:t>
       </w:r>
     </w:p>
     <w:p>
@@ -8830,7 +8822,7 @@
           <w:color w:val="273444"/>
           <w:sz w:val="24"/>
         </w:rPr>
-        <w:t xml:space="preserve"> quando precisar de hash do artefato, rodadas configuráveis, estabilidade, arquivos manifestados ou dissenso formal ponto a ponto.</w:t>
+        <w:t xml:space="preserve"> quando precisar de hash do artefato, rodadas configuráveis, estabilidade, arquivos manifestados ou dissenso formal ponto a ponto. Por padrão, o A2A exige maioria estrita de respostas válidas; o quórum pode ser configurado explicitamente.</w:t>
       </w:r>
     </w:p>
     <w:p>
@@ -8877,7 +8869,7 @@
           <w:color w:val="273444"/>
           <w:sz w:val="24"/>
         </w:rPr>
-        <w:t xml:space="preserve"> gerar código com Codex, Claude e Gemini e fazer um juiz consolidar as propostas.</w:t>
+        <w:t xml:space="preserve"> gerar código com um conjunto configurável de Codex, Claude, Gemini e Grok e fazer um juiz consolidar as propostas.</w:t>
       </w:r>
     </w:p>
     <w:p>
@@ -8910,7 +8902,7 @@
           <w:color w:val="273444"/>
           <w:sz w:val="24"/>
         </w:rPr>
-        <w:t>Aceita de 1 a 5 rodadas de revisão; Claude é o juiz padrão quando você não escolhe outro. O merge é uma síntese de código, não consenso auditado.</w:t>
+        <w:t>Aceita até 12 ciclos de revisão; Claude é o juiz padrão quando você não escolhe outro. O merge é uma síntese de código, não consenso auditado.</w:t>
       </w:r>
     </w:p>
     <w:p>
@@ -19525,7 +19517,7 @@
                 <w:color w:val="273444"/>
                 <w:sz w:val="21"/>
               </w:rPr>
-              <w:t>Três respostas paralelas</w:t>
+              <w:t>Até quatro respostas paralelas</w:t>
             </w:r>
           </w:p>
         </w:tc>
@@ -19613,7 +19605,7 @@
                 <w:color w:val="273444"/>
                 <w:sz w:val="21"/>
               </w:rPr>
-              <w:t>Equipe de três agentes com papéis</w:t>
+              <w:t>Equipe configurável de agentes com papéis</w:t>
             </w:r>
           </w:p>
         </w:tc>

</xml_diff>

<commit_message>
feat: add Qwen and selectable A2A teams
</commit_message>
<xml_diff>
--- a/assets/Manual-completo-comandos-multiagente.docx
+++ b/assets/Manual-completo-comandos-multiagente.docx
@@ -4805,7 +4805,7 @@
                 <w:sz w:val="24"/>
                 <w:szCs w:val="24"/>
               </w:rPr>
-              <w:t>Comparar até sete respostas rápidas</w:t>
+              <w:t>Comparar até oito respostas rápidas</w:t>
             </w:r>
           </w:p>
         </w:tc>
@@ -13100,55 +13100,55 @@
           <w:sz w:val="24"/>
           <w:szCs w:val="24"/>
         </w:rPr>
-        <w:t xml:space="preserve">O A2A Mesh é o caminho mais direto entre sete peers: Codex, Claude, Gemini,</w:t>
-      </w:r>
-      <w:r>
-        <w:rPr>
-          <w:rFonts w:ascii="Lato" w:hAnsi="Lato" w:eastAsia="Lato" w:cs="Lato"/>
-          <w:sz w:val="24"/>
-          <w:szCs w:val="24"/>
-        </w:rPr>
-        <w:t xml:space="preserve"> </w:t>
-      </w:r>
-      <w:r>
-        <w:rPr>
-          <w:rFonts w:ascii="Lato" w:hAnsi="Lato" w:eastAsia="Lato" w:cs="Lato"/>
-          <w:sz w:val="24"/>
-          <w:szCs w:val="24"/>
-        </w:rPr>
-        <w:t xml:space="preserve">Grok 4.6 High, GLM 5.3, DeepSeek V4 Pro e Kimi K3. O Grok usa exclusivamente</w:t>
-      </w:r>
-      <w:r>
-        <w:rPr>
-          <w:rFonts w:ascii="Lato" w:hAnsi="Lato" w:eastAsia="Lato" w:cs="Lato"/>
-          <w:sz w:val="24"/>
-          <w:szCs w:val="24"/>
-        </w:rPr>
-        <w:t xml:space="preserve"> </w:t>
-      </w:r>
-      <w:r>
-        <w:rPr>
-          <w:rFonts w:ascii="Lato" w:hAnsi="Lato" w:eastAsia="Lato" w:cs="Lato"/>
-          <w:sz w:val="24"/>
-          <w:szCs w:val="24"/>
-        </w:rPr>
-        <w:t xml:space="preserve">o Cursor CLI na porta 3144; GLM e DeepSeek usam o OpenCode Go nas portas 3145 e</w:t>
-      </w:r>
-      <w:r>
-        <w:rPr>
-          <w:rFonts w:ascii="Lato" w:hAnsi="Lato" w:eastAsia="Lato" w:cs="Lato"/>
-          <w:sz w:val="24"/>
-          <w:szCs w:val="24"/>
-        </w:rPr>
-        <w:t xml:space="preserve"> </w:t>
-      </w:r>
-      <w:r>
-        <w:rPr>
-          <w:rFonts w:ascii="Lato" w:hAnsi="Lato" w:eastAsia="Lato" w:cs="Lato"/>
-          <w:sz w:val="24"/>
-          <w:szCs w:val="24"/>
-        </w:rPr>
-        <w:t xml:space="preserve">3146, com variante</w:t>
+        <w:t xml:space="preserve">O A2A Mesh é o caminho mais direto entre oito peers: Codex, Claude, Gemini,</w:t>
+      </w:r>
+      <w:r>
+        <w:rPr>
+          <w:rFonts w:ascii="Lato" w:hAnsi="Lato" w:eastAsia="Lato" w:cs="Lato"/>
+          <w:sz w:val="24"/>
+          <w:szCs w:val="24"/>
+        </w:rPr>
+        <w:t xml:space="preserve"> </w:t>
+      </w:r>
+      <w:r>
+        <w:rPr>
+          <w:rFonts w:ascii="Lato" w:hAnsi="Lato" w:eastAsia="Lato" w:cs="Lato"/>
+          <w:sz w:val="24"/>
+          <w:szCs w:val="24"/>
+        </w:rPr>
+        <w:t xml:space="preserve">Grok 4.6 High, GLM 5.3, DeepSeek V4 Pro, Kimi K3 e Qwen 3.8 Max. O Grok usa</w:t>
+      </w:r>
+      <w:r>
+        <w:rPr>
+          <w:rFonts w:ascii="Lato" w:hAnsi="Lato" w:eastAsia="Lato" w:cs="Lato"/>
+          <w:sz w:val="24"/>
+          <w:szCs w:val="24"/>
+        </w:rPr>
+        <w:t xml:space="preserve"> </w:t>
+      </w:r>
+      <w:r>
+        <w:rPr>
+          <w:rFonts w:ascii="Lato" w:hAnsi="Lato" w:eastAsia="Lato" w:cs="Lato"/>
+          <w:sz w:val="24"/>
+          <w:szCs w:val="24"/>
+        </w:rPr>
+        <w:t xml:space="preserve">exclusivamente o Cursor CLI na porta 3144; GLM, DeepSeek e Qwen usam o OpenCode Go</w:t>
+      </w:r>
+      <w:r>
+        <w:rPr>
+          <w:rFonts w:ascii="Lato" w:hAnsi="Lato" w:eastAsia="Lato" w:cs="Lato"/>
+          <w:sz w:val="24"/>
+          <w:szCs w:val="24"/>
+        </w:rPr>
+        <w:t xml:space="preserve"> </w:t>
+      </w:r>
+      <w:r>
+        <w:rPr>
+          <w:rFonts w:ascii="Lato" w:hAnsi="Lato" w:eastAsia="Lato" w:cs="Lato"/>
+          <w:sz w:val="24"/>
+          <w:szCs w:val="24"/>
+        </w:rPr>
+        <w:t xml:space="preserve">nas portas 3145, 3146 e 3148, com variante</w:t>
       </w:r>
       <w:r>
         <w:rPr>
@@ -13173,7 +13173,23 @@
           <w:sz w:val="24"/>
           <w:szCs w:val="24"/>
         </w:rPr>
-        <w:t xml:space="preserve">; Kimi usa exclusivamente o Kimi Code na porta 3147.</w:t>
+        <w:t xml:space="preserve">; Kimi usa exclusivamente o Kimi</w:t>
+      </w:r>
+      <w:r>
+        <w:rPr>
+          <w:rFonts w:ascii="Lato" w:hAnsi="Lato" w:eastAsia="Lato" w:cs="Lato"/>
+          <w:sz w:val="24"/>
+          <w:szCs w:val="24"/>
+        </w:rPr>
+        <w:t xml:space="preserve"> </w:t>
+      </w:r>
+      <w:r>
+        <w:rPr>
+          <w:rFonts w:ascii="Lato" w:hAnsi="Lato" w:eastAsia="Lato" w:cs="Lato"/>
+          <w:sz w:val="24"/>
+          <w:szCs w:val="24"/>
+        </w:rPr>
+        <w:t xml:space="preserve">Code na porta 3147.</w:t>
       </w:r>
       <w:r>
         <w:rPr>
@@ -13190,6 +13206,155 @@
           <w:szCs w:val="24"/>
         </w:rPr>
         <w:t xml:space="preserve">Os modelos são fixos e não há fallback silencioso.</w:t>
+      </w:r>
+    </w:p>
+    <w:p>
+      <w:pPr>
+        <w:pStyle w:val="BodyText"/>
+        <w:spacing w:line="360" w:lineRule="auto" w:after="100"/>
+        <w:ind w:firstLine="504"/>
+        <w:jc w:val="both"/>
+      </w:pPr>
+      <w:r>
+        <w:rPr>
+          <w:rFonts w:ascii="Lato" w:hAnsi="Lato" w:eastAsia="Lato" w:cs="Lato"/>
+          <w:sz w:val="24"/>
+          <w:szCs w:val="24"/>
+        </w:rPr>
+        <w:t xml:space="preserve">No painel, a faixa</w:t>
+      </w:r>
+      <w:r>
+        <w:rPr>
+          <w:rFonts w:ascii="Lato" w:hAnsi="Lato" w:eastAsia="Lato" w:cs="Lato"/>
+          <w:sz w:val="24"/>
+          <w:szCs w:val="24"/>
+        </w:rPr>
+        <w:t xml:space="preserve"> </w:t>
+      </w:r>
+      <w:r>
+        <w:rPr>
+          <w:rFonts w:ascii="Lato" w:hAnsi="Lato" w:eastAsia="Lato" w:cs="Lato"/>
+          <w:b/>
+          <w:bCs/>
+          <w:sz w:val="24"/>
+          <w:szCs w:val="24"/>
+        </w:rPr>
+        <w:t xml:space="preserve">Equipe</w:t>
+      </w:r>
+      <w:r>
+        <w:rPr>
+          <w:rFonts w:ascii="Lato" w:hAnsi="Lato" w:eastAsia="Lato" w:cs="Lato"/>
+          <w:sz w:val="24"/>
+          <w:szCs w:val="24"/>
+        </w:rPr>
+        <w:t xml:space="preserve"> </w:t>
+      </w:r>
+      <w:r>
+        <w:rPr>
+          <w:rFonts w:ascii="Lato" w:hAnsi="Lato" w:eastAsia="Lato" w:cs="Lato"/>
+          <w:sz w:val="24"/>
+          <w:szCs w:val="24"/>
+        </w:rPr>
+        <w:t xml:space="preserve">permite ligar e desligar cadeiras antes do envio.</w:t>
+      </w:r>
+      <w:r>
+        <w:rPr>
+          <w:rFonts w:ascii="Lato" w:hAnsi="Lato" w:eastAsia="Lato" w:cs="Lato"/>
+          <w:sz w:val="24"/>
+          <w:szCs w:val="24"/>
+        </w:rPr>
+        <w:t xml:space="preserve"> </w:t>
+      </w:r>
+      <w:r>
+        <w:rPr>
+          <w:rFonts w:ascii="Lato" w:hAnsi="Lato" w:eastAsia="Lato" w:cs="Lato"/>
+          <w:sz w:val="24"/>
+          <w:szCs w:val="24"/>
+        </w:rPr>
+        <w:t xml:space="preserve">A seleção fica persistida no navegador e vale para broadcast, consenso, ensemble,</w:t>
+      </w:r>
+      <w:r>
+        <w:rPr>
+          <w:rFonts w:ascii="Lato" w:hAnsi="Lato" w:eastAsia="Lato" w:cs="Lato"/>
+          <w:sz w:val="24"/>
+          <w:szCs w:val="24"/>
+        </w:rPr>
+        <w:t xml:space="preserve"> </w:t>
+      </w:r>
+      <w:r>
+        <w:rPr>
+          <w:rFonts w:ascii="Lato" w:hAnsi="Lato" w:eastAsia="Lato" w:cs="Lato"/>
+          <w:sz w:val="24"/>
+          <w:szCs w:val="24"/>
+        </w:rPr>
+        <w:t xml:space="preserve">debate e team. O botão</w:t>
+      </w:r>
+      <w:r>
+        <w:rPr>
+          <w:rFonts w:ascii="Lato" w:hAnsi="Lato" w:eastAsia="Lato" w:cs="Lato"/>
+          <w:sz w:val="24"/>
+          <w:szCs w:val="24"/>
+        </w:rPr>
+        <w:t xml:space="preserve"> </w:t>
+      </w:r>
+      <w:r>
+        <w:rPr>
+          <w:rFonts w:ascii="Lato" w:hAnsi="Lato" w:eastAsia="Lato" w:cs="Lato"/>
+          <w:b/>
+          <w:bCs/>
+          <w:sz w:val="24"/>
+          <w:szCs w:val="24"/>
+        </w:rPr>
+        <w:t xml:space="preserve">Todos</w:t>
+      </w:r>
+      <w:r>
+        <w:rPr>
+          <w:rFonts w:ascii="Lato" w:hAnsi="Lato" w:eastAsia="Lato" w:cs="Lato"/>
+          <w:sz w:val="24"/>
+          <w:szCs w:val="24"/>
+        </w:rPr>
+        <w:t xml:space="preserve"> </w:t>
+      </w:r>
+      <w:r>
+        <w:rPr>
+          <w:rFonts w:ascii="Lato" w:hAnsi="Lato" w:eastAsia="Lato" w:cs="Lato"/>
+          <w:sz w:val="24"/>
+          <w:szCs w:val="24"/>
+        </w:rPr>
+        <w:t xml:space="preserve">restaura as oito cadeiras; a opção textual</w:t>
+      </w:r>
+      <w:r>
+        <w:rPr>
+          <w:rFonts w:ascii="Lato" w:hAnsi="Lato" w:eastAsia="Lato" w:cs="Lato"/>
+          <w:sz w:val="24"/>
+          <w:szCs w:val="24"/>
+        </w:rPr>
+        <w:t xml:space="preserve"> </w:t>
+      </w:r>
+      <w:r>
+        <w:rPr>
+          <w:rFonts w:ascii="Lato" w:hAnsi="Lato" w:eastAsia="Lato" w:cs="Lato"/>
+          <w:rStyle w:val="VerbatimChar"/>
+          <w:sz w:val="24"/>
+          <w:szCs w:val="24"/>
+        </w:rPr>
+        <w:t xml:space="preserve">--agents=claude,codex,qwen</w:t>
+      </w:r>
+      <w:r>
+        <w:rPr>
+          <w:rFonts w:ascii="Lato" w:hAnsi="Lato" w:eastAsia="Lato" w:cs="Lato"/>
+          <w:sz w:val="24"/>
+          <w:szCs w:val="24"/>
+        </w:rPr>
+        <w:t xml:space="preserve"> </w:t>
+      </w:r>
+      <w:r>
+        <w:rPr>
+          <w:rFonts w:ascii="Lato" w:hAnsi="Lato" w:eastAsia="Lato" w:cs="Lato"/>
+          <w:sz w:val="24"/>
+          <w:szCs w:val="24"/>
+        </w:rPr>
+        <w:t xml:space="preserve">substitui a seleção apenas na execução atual.</w:t>
       </w:r>
     </w:p>
     <w:p>
@@ -14343,7 +14508,7 @@
           <w:sz w:val="24"/>
           <w:szCs w:val="24"/>
         </w:rPr>
-        <w:t xml:space="preserve">verificar quais dos sete backends estão ativos antes de um trabalho.</w:t>
+        <w:t xml:space="preserve">verificar quais dos oito backends estão ativos antes de um trabalho.</w:t>
       </w:r>
     </w:p>
     <w:p>
@@ -14697,6 +14862,31 @@
           <w:sz w:val="24"/>
           <w:szCs w:val="24"/>
         </w:rPr>
+        <w:t xml:space="preserve">,</w:t>
+      </w:r>
+      <w:r>
+        <w:rPr>
+          <w:rFonts w:ascii="Lato" w:hAnsi="Lato" w:eastAsia="Lato" w:cs="Lato"/>
+          <w:sz w:val="24"/>
+          <w:szCs w:val="24"/>
+        </w:rPr>
+        <w:t xml:space="preserve"> </w:t>
+      </w:r>
+      <w:r>
+        <w:rPr>
+          <w:rFonts w:ascii="Lato" w:hAnsi="Lato" w:eastAsia="Lato" w:cs="Lato"/>
+          <w:rStyle w:val="VerbatimChar"/>
+          <w:sz w:val="24"/>
+          <w:szCs w:val="24"/>
+        </w:rPr>
+        <w:t xml:space="preserve">kimi</w:t>
+      </w:r>
+      <w:r>
+        <w:rPr>
+          <w:rFonts w:ascii="Lato" w:hAnsi="Lato" w:eastAsia="Lato" w:cs="Lato"/>
+          <w:sz w:val="24"/>
+          <w:szCs w:val="24"/>
+        </w:rPr>
         <w:t xml:space="preserve"> </w:t>
       </w:r>
       <w:r>
@@ -14722,7 +14912,7 @@
           <w:sz w:val="24"/>
           <w:szCs w:val="24"/>
         </w:rPr>
-        <w:t xml:space="preserve">kimi</w:t>
+        <w:t xml:space="preserve">qwen</w:t>
       </w:r>
       <w:r>
         <w:rPr>
@@ -14877,7 +15067,7 @@
           <w:sz w:val="24"/>
           <w:szCs w:val="24"/>
         </w:rPr>
-        <w:t xml:space="preserve">Fluxo: um prompt → até sete respostas independentes → apresentação lado a lado. Não</w:t>
+        <w:t xml:space="preserve">Fluxo: um prompt → até oito respostas independentes → apresentação lado a lado. Não</w:t>
       </w:r>
       <w:r>
         <w:rPr>
@@ -15493,23 +15683,23 @@
           <w:sz w:val="24"/>
           <w:szCs w:val="24"/>
         </w:rPr>
-        <w:t xml:space="preserve">gerar código com um conjunto configurável de Codex, Claude,</w:t>
-      </w:r>
-      <w:r>
-        <w:rPr>
-          <w:rFonts w:ascii="Lato" w:hAnsi="Lato" w:eastAsia="Lato" w:cs="Lato"/>
-          <w:sz w:val="24"/>
-          <w:szCs w:val="24"/>
-        </w:rPr>
-        <w:t xml:space="preserve"> </w:t>
-      </w:r>
-      <w:r>
-        <w:rPr>
-          <w:rFonts w:ascii="Lato" w:hAnsi="Lato" w:eastAsia="Lato" w:cs="Lato"/>
-          <w:sz w:val="24"/>
-          <w:szCs w:val="24"/>
-        </w:rPr>
-        <w:t xml:space="preserve">Gemini e Grok e fazer um juiz consolidar</w:t>
+        <w:t xml:space="preserve">gerar código com todos os agentes selecionados entre Codex,</w:t>
+      </w:r>
+      <w:r>
+        <w:rPr>
+          <w:rFonts w:ascii="Lato" w:hAnsi="Lato" w:eastAsia="Lato" w:cs="Lato"/>
+          <w:sz w:val="24"/>
+          <w:szCs w:val="24"/>
+        </w:rPr>
+        <w:t xml:space="preserve"> </w:t>
+      </w:r>
+      <w:r>
+        <w:rPr>
+          <w:rFonts w:ascii="Lato" w:hAnsi="Lato" w:eastAsia="Lato" w:cs="Lato"/>
+          <w:sz w:val="24"/>
+          <w:szCs w:val="24"/>
+        </w:rPr>
+        <w:t xml:space="preserve">Claude, Gemini, Grok, GLM, DeepSeek, Kimi e Qwen e fazer um juiz consolidar</w:t>
       </w:r>
       <w:r>
         <w:rPr>
@@ -28337,7 +28527,7 @@
                 <w:sz w:val="24"/>
                 <w:szCs w:val="24"/>
               </w:rPr>
-              <w:t>opencode/gpt-5.3-codex</w:t>
+              <w:t>Codex CLI · gpt-5.6-sol, esforço xhigh</w:t>
             </w:r>
           </w:p>
         </w:tc>
@@ -28381,7 +28571,7 @@
                 <w:sz w:val="24"/>
                 <w:szCs w:val="24"/>
               </w:rPr>
-              <w:t>opencode/gemini-3.1-pro</w:t>
+              <w:t>Antigravity CLI · gemini-3.7-flash-high</w:t>
             </w:r>
           </w:p>
         </w:tc>
@@ -36732,7 +36922,7 @@
                 <w:sz w:val="24"/>
                 <w:szCs w:val="24"/>
               </w:rPr>
-              <w:t>Até sete respostas paralelas</w:t>
+              <w:t>Até oito respostas paralelas</w:t>
             </w:r>
           </w:p>
         </w:tc>

</xml_diff>

<commit_message>
feat: add Qwen and selectable A2A teams (#3)
Co-authored-by: NicholasJacob1990 <NicholasJacob1990@users.noreply.github.com>
</commit_message>
<xml_diff>
--- a/assets/Manual-completo-comandos-multiagente.docx
+++ b/assets/Manual-completo-comandos-multiagente.docx
@@ -4805,7 +4805,7 @@
                 <w:sz w:val="24"/>
                 <w:szCs w:val="24"/>
               </w:rPr>
-              <w:t>Comparar até sete respostas rápidas</w:t>
+              <w:t>Comparar até oito respostas rápidas</w:t>
             </w:r>
           </w:p>
         </w:tc>
@@ -13100,55 +13100,55 @@
           <w:sz w:val="24"/>
           <w:szCs w:val="24"/>
         </w:rPr>
-        <w:t xml:space="preserve">O A2A Mesh é o caminho mais direto entre sete peers: Codex, Claude, Gemini,</w:t>
-      </w:r>
-      <w:r>
-        <w:rPr>
-          <w:rFonts w:ascii="Lato" w:hAnsi="Lato" w:eastAsia="Lato" w:cs="Lato"/>
-          <w:sz w:val="24"/>
-          <w:szCs w:val="24"/>
-        </w:rPr>
-        <w:t xml:space="preserve"> </w:t>
-      </w:r>
-      <w:r>
-        <w:rPr>
-          <w:rFonts w:ascii="Lato" w:hAnsi="Lato" w:eastAsia="Lato" w:cs="Lato"/>
-          <w:sz w:val="24"/>
-          <w:szCs w:val="24"/>
-        </w:rPr>
-        <w:t xml:space="preserve">Grok 4.6 High, GLM 5.3, DeepSeek V4 Pro e Kimi K3. O Grok usa exclusivamente</w:t>
-      </w:r>
-      <w:r>
-        <w:rPr>
-          <w:rFonts w:ascii="Lato" w:hAnsi="Lato" w:eastAsia="Lato" w:cs="Lato"/>
-          <w:sz w:val="24"/>
-          <w:szCs w:val="24"/>
-        </w:rPr>
-        <w:t xml:space="preserve"> </w:t>
-      </w:r>
-      <w:r>
-        <w:rPr>
-          <w:rFonts w:ascii="Lato" w:hAnsi="Lato" w:eastAsia="Lato" w:cs="Lato"/>
-          <w:sz w:val="24"/>
-          <w:szCs w:val="24"/>
-        </w:rPr>
-        <w:t xml:space="preserve">o Cursor CLI na porta 3144; GLM e DeepSeek usam o OpenCode Go nas portas 3145 e</w:t>
-      </w:r>
-      <w:r>
-        <w:rPr>
-          <w:rFonts w:ascii="Lato" w:hAnsi="Lato" w:eastAsia="Lato" w:cs="Lato"/>
-          <w:sz w:val="24"/>
-          <w:szCs w:val="24"/>
-        </w:rPr>
-        <w:t xml:space="preserve"> </w:t>
-      </w:r>
-      <w:r>
-        <w:rPr>
-          <w:rFonts w:ascii="Lato" w:hAnsi="Lato" w:eastAsia="Lato" w:cs="Lato"/>
-          <w:sz w:val="24"/>
-          <w:szCs w:val="24"/>
-        </w:rPr>
-        <w:t xml:space="preserve">3146, com variante</w:t>
+        <w:t xml:space="preserve">O A2A Mesh é o caminho mais direto entre oito peers: Codex, Claude, Gemini,</w:t>
+      </w:r>
+      <w:r>
+        <w:rPr>
+          <w:rFonts w:ascii="Lato" w:hAnsi="Lato" w:eastAsia="Lato" w:cs="Lato"/>
+          <w:sz w:val="24"/>
+          <w:szCs w:val="24"/>
+        </w:rPr>
+        <w:t xml:space="preserve"> </w:t>
+      </w:r>
+      <w:r>
+        <w:rPr>
+          <w:rFonts w:ascii="Lato" w:hAnsi="Lato" w:eastAsia="Lato" w:cs="Lato"/>
+          <w:sz w:val="24"/>
+          <w:szCs w:val="24"/>
+        </w:rPr>
+        <w:t xml:space="preserve">Grok 4.6 High, GLM 5.3, DeepSeek V4 Pro, Kimi K3 e Qwen 3.8 Max. O Grok usa</w:t>
+      </w:r>
+      <w:r>
+        <w:rPr>
+          <w:rFonts w:ascii="Lato" w:hAnsi="Lato" w:eastAsia="Lato" w:cs="Lato"/>
+          <w:sz w:val="24"/>
+          <w:szCs w:val="24"/>
+        </w:rPr>
+        <w:t xml:space="preserve"> </w:t>
+      </w:r>
+      <w:r>
+        <w:rPr>
+          <w:rFonts w:ascii="Lato" w:hAnsi="Lato" w:eastAsia="Lato" w:cs="Lato"/>
+          <w:sz w:val="24"/>
+          <w:szCs w:val="24"/>
+        </w:rPr>
+        <w:t xml:space="preserve">exclusivamente o Cursor CLI na porta 3144; GLM, DeepSeek e Qwen usam o OpenCode Go</w:t>
+      </w:r>
+      <w:r>
+        <w:rPr>
+          <w:rFonts w:ascii="Lato" w:hAnsi="Lato" w:eastAsia="Lato" w:cs="Lato"/>
+          <w:sz w:val="24"/>
+          <w:szCs w:val="24"/>
+        </w:rPr>
+        <w:t xml:space="preserve"> </w:t>
+      </w:r>
+      <w:r>
+        <w:rPr>
+          <w:rFonts w:ascii="Lato" w:hAnsi="Lato" w:eastAsia="Lato" w:cs="Lato"/>
+          <w:sz w:val="24"/>
+          <w:szCs w:val="24"/>
+        </w:rPr>
+        <w:t xml:space="preserve">nas portas 3145, 3146 e 3148, com variante</w:t>
       </w:r>
       <w:r>
         <w:rPr>
@@ -13173,7 +13173,23 @@
           <w:sz w:val="24"/>
           <w:szCs w:val="24"/>
         </w:rPr>
-        <w:t xml:space="preserve">; Kimi usa exclusivamente o Kimi Code na porta 3147.</w:t>
+        <w:t xml:space="preserve">; Kimi usa exclusivamente o Kimi</w:t>
+      </w:r>
+      <w:r>
+        <w:rPr>
+          <w:rFonts w:ascii="Lato" w:hAnsi="Lato" w:eastAsia="Lato" w:cs="Lato"/>
+          <w:sz w:val="24"/>
+          <w:szCs w:val="24"/>
+        </w:rPr>
+        <w:t xml:space="preserve"> </w:t>
+      </w:r>
+      <w:r>
+        <w:rPr>
+          <w:rFonts w:ascii="Lato" w:hAnsi="Lato" w:eastAsia="Lato" w:cs="Lato"/>
+          <w:sz w:val="24"/>
+          <w:szCs w:val="24"/>
+        </w:rPr>
+        <w:t xml:space="preserve">Code na porta 3147.</w:t>
       </w:r>
       <w:r>
         <w:rPr>
@@ -13190,6 +13206,155 @@
           <w:szCs w:val="24"/>
         </w:rPr>
         <w:t xml:space="preserve">Os modelos são fixos e não há fallback silencioso.</w:t>
+      </w:r>
+    </w:p>
+    <w:p>
+      <w:pPr>
+        <w:pStyle w:val="BodyText"/>
+        <w:spacing w:line="360" w:lineRule="auto" w:after="100"/>
+        <w:ind w:firstLine="504"/>
+        <w:jc w:val="both"/>
+      </w:pPr>
+      <w:r>
+        <w:rPr>
+          <w:rFonts w:ascii="Lato" w:hAnsi="Lato" w:eastAsia="Lato" w:cs="Lato"/>
+          <w:sz w:val="24"/>
+          <w:szCs w:val="24"/>
+        </w:rPr>
+        <w:t xml:space="preserve">No painel, a faixa</w:t>
+      </w:r>
+      <w:r>
+        <w:rPr>
+          <w:rFonts w:ascii="Lato" w:hAnsi="Lato" w:eastAsia="Lato" w:cs="Lato"/>
+          <w:sz w:val="24"/>
+          <w:szCs w:val="24"/>
+        </w:rPr>
+        <w:t xml:space="preserve"> </w:t>
+      </w:r>
+      <w:r>
+        <w:rPr>
+          <w:rFonts w:ascii="Lato" w:hAnsi="Lato" w:eastAsia="Lato" w:cs="Lato"/>
+          <w:b/>
+          <w:bCs/>
+          <w:sz w:val="24"/>
+          <w:szCs w:val="24"/>
+        </w:rPr>
+        <w:t xml:space="preserve">Equipe</w:t>
+      </w:r>
+      <w:r>
+        <w:rPr>
+          <w:rFonts w:ascii="Lato" w:hAnsi="Lato" w:eastAsia="Lato" w:cs="Lato"/>
+          <w:sz w:val="24"/>
+          <w:szCs w:val="24"/>
+        </w:rPr>
+        <w:t xml:space="preserve"> </w:t>
+      </w:r>
+      <w:r>
+        <w:rPr>
+          <w:rFonts w:ascii="Lato" w:hAnsi="Lato" w:eastAsia="Lato" w:cs="Lato"/>
+          <w:sz w:val="24"/>
+          <w:szCs w:val="24"/>
+        </w:rPr>
+        <w:t xml:space="preserve">permite ligar e desligar cadeiras antes do envio.</w:t>
+      </w:r>
+      <w:r>
+        <w:rPr>
+          <w:rFonts w:ascii="Lato" w:hAnsi="Lato" w:eastAsia="Lato" w:cs="Lato"/>
+          <w:sz w:val="24"/>
+          <w:szCs w:val="24"/>
+        </w:rPr>
+        <w:t xml:space="preserve"> </w:t>
+      </w:r>
+      <w:r>
+        <w:rPr>
+          <w:rFonts w:ascii="Lato" w:hAnsi="Lato" w:eastAsia="Lato" w:cs="Lato"/>
+          <w:sz w:val="24"/>
+          <w:szCs w:val="24"/>
+        </w:rPr>
+        <w:t xml:space="preserve">A seleção fica persistida no navegador e vale para broadcast, consenso, ensemble,</w:t>
+      </w:r>
+      <w:r>
+        <w:rPr>
+          <w:rFonts w:ascii="Lato" w:hAnsi="Lato" w:eastAsia="Lato" w:cs="Lato"/>
+          <w:sz w:val="24"/>
+          <w:szCs w:val="24"/>
+        </w:rPr>
+        <w:t xml:space="preserve"> </w:t>
+      </w:r>
+      <w:r>
+        <w:rPr>
+          <w:rFonts w:ascii="Lato" w:hAnsi="Lato" w:eastAsia="Lato" w:cs="Lato"/>
+          <w:sz w:val="24"/>
+          <w:szCs w:val="24"/>
+        </w:rPr>
+        <w:t xml:space="preserve">debate e team. O botão</w:t>
+      </w:r>
+      <w:r>
+        <w:rPr>
+          <w:rFonts w:ascii="Lato" w:hAnsi="Lato" w:eastAsia="Lato" w:cs="Lato"/>
+          <w:sz w:val="24"/>
+          <w:szCs w:val="24"/>
+        </w:rPr>
+        <w:t xml:space="preserve"> </w:t>
+      </w:r>
+      <w:r>
+        <w:rPr>
+          <w:rFonts w:ascii="Lato" w:hAnsi="Lato" w:eastAsia="Lato" w:cs="Lato"/>
+          <w:b/>
+          <w:bCs/>
+          <w:sz w:val="24"/>
+          <w:szCs w:val="24"/>
+        </w:rPr>
+        <w:t xml:space="preserve">Todos</w:t>
+      </w:r>
+      <w:r>
+        <w:rPr>
+          <w:rFonts w:ascii="Lato" w:hAnsi="Lato" w:eastAsia="Lato" w:cs="Lato"/>
+          <w:sz w:val="24"/>
+          <w:szCs w:val="24"/>
+        </w:rPr>
+        <w:t xml:space="preserve"> </w:t>
+      </w:r>
+      <w:r>
+        <w:rPr>
+          <w:rFonts w:ascii="Lato" w:hAnsi="Lato" w:eastAsia="Lato" w:cs="Lato"/>
+          <w:sz w:val="24"/>
+          <w:szCs w:val="24"/>
+        </w:rPr>
+        <w:t xml:space="preserve">restaura as oito cadeiras; a opção textual</w:t>
+      </w:r>
+      <w:r>
+        <w:rPr>
+          <w:rFonts w:ascii="Lato" w:hAnsi="Lato" w:eastAsia="Lato" w:cs="Lato"/>
+          <w:sz w:val="24"/>
+          <w:szCs w:val="24"/>
+        </w:rPr>
+        <w:t xml:space="preserve"> </w:t>
+      </w:r>
+      <w:r>
+        <w:rPr>
+          <w:rFonts w:ascii="Lato" w:hAnsi="Lato" w:eastAsia="Lato" w:cs="Lato"/>
+          <w:rStyle w:val="VerbatimChar"/>
+          <w:sz w:val="24"/>
+          <w:szCs w:val="24"/>
+        </w:rPr>
+        <w:t xml:space="preserve">--agents=claude,codex,qwen</w:t>
+      </w:r>
+      <w:r>
+        <w:rPr>
+          <w:rFonts w:ascii="Lato" w:hAnsi="Lato" w:eastAsia="Lato" w:cs="Lato"/>
+          <w:sz w:val="24"/>
+          <w:szCs w:val="24"/>
+        </w:rPr>
+        <w:t xml:space="preserve"> </w:t>
+      </w:r>
+      <w:r>
+        <w:rPr>
+          <w:rFonts w:ascii="Lato" w:hAnsi="Lato" w:eastAsia="Lato" w:cs="Lato"/>
+          <w:sz w:val="24"/>
+          <w:szCs w:val="24"/>
+        </w:rPr>
+        <w:t xml:space="preserve">substitui a seleção apenas na execução atual.</w:t>
       </w:r>
     </w:p>
     <w:p>
@@ -14343,7 +14508,7 @@
           <w:sz w:val="24"/>
           <w:szCs w:val="24"/>
         </w:rPr>
-        <w:t xml:space="preserve">verificar quais dos sete backends estão ativos antes de um trabalho.</w:t>
+        <w:t xml:space="preserve">verificar quais dos oito backends estão ativos antes de um trabalho.</w:t>
       </w:r>
     </w:p>
     <w:p>
@@ -14697,6 +14862,31 @@
           <w:sz w:val="24"/>
           <w:szCs w:val="24"/>
         </w:rPr>
+        <w:t xml:space="preserve">,</w:t>
+      </w:r>
+      <w:r>
+        <w:rPr>
+          <w:rFonts w:ascii="Lato" w:hAnsi="Lato" w:eastAsia="Lato" w:cs="Lato"/>
+          <w:sz w:val="24"/>
+          <w:szCs w:val="24"/>
+        </w:rPr>
+        <w:t xml:space="preserve"> </w:t>
+      </w:r>
+      <w:r>
+        <w:rPr>
+          <w:rFonts w:ascii="Lato" w:hAnsi="Lato" w:eastAsia="Lato" w:cs="Lato"/>
+          <w:rStyle w:val="VerbatimChar"/>
+          <w:sz w:val="24"/>
+          <w:szCs w:val="24"/>
+        </w:rPr>
+        <w:t xml:space="preserve">kimi</w:t>
+      </w:r>
+      <w:r>
+        <w:rPr>
+          <w:rFonts w:ascii="Lato" w:hAnsi="Lato" w:eastAsia="Lato" w:cs="Lato"/>
+          <w:sz w:val="24"/>
+          <w:szCs w:val="24"/>
+        </w:rPr>
         <w:t xml:space="preserve"> </w:t>
       </w:r>
       <w:r>
@@ -14722,7 +14912,7 @@
           <w:sz w:val="24"/>
           <w:szCs w:val="24"/>
         </w:rPr>
-        <w:t xml:space="preserve">kimi</w:t>
+        <w:t xml:space="preserve">qwen</w:t>
       </w:r>
       <w:r>
         <w:rPr>
@@ -14877,7 +15067,7 @@
           <w:sz w:val="24"/>
           <w:szCs w:val="24"/>
         </w:rPr>
-        <w:t xml:space="preserve">Fluxo: um prompt → até sete respostas independentes → apresentação lado a lado. Não</w:t>
+        <w:t xml:space="preserve">Fluxo: um prompt → até oito respostas independentes → apresentação lado a lado. Não</w:t>
       </w:r>
       <w:r>
         <w:rPr>
@@ -15493,23 +15683,23 @@
           <w:sz w:val="24"/>
           <w:szCs w:val="24"/>
         </w:rPr>
-        <w:t xml:space="preserve">gerar código com um conjunto configurável de Codex, Claude,</w:t>
-      </w:r>
-      <w:r>
-        <w:rPr>
-          <w:rFonts w:ascii="Lato" w:hAnsi="Lato" w:eastAsia="Lato" w:cs="Lato"/>
-          <w:sz w:val="24"/>
-          <w:szCs w:val="24"/>
-        </w:rPr>
-        <w:t xml:space="preserve"> </w:t>
-      </w:r>
-      <w:r>
-        <w:rPr>
-          <w:rFonts w:ascii="Lato" w:hAnsi="Lato" w:eastAsia="Lato" w:cs="Lato"/>
-          <w:sz w:val="24"/>
-          <w:szCs w:val="24"/>
-        </w:rPr>
-        <w:t xml:space="preserve">Gemini e Grok e fazer um juiz consolidar</w:t>
+        <w:t xml:space="preserve">gerar código com todos os agentes selecionados entre Codex,</w:t>
+      </w:r>
+      <w:r>
+        <w:rPr>
+          <w:rFonts w:ascii="Lato" w:hAnsi="Lato" w:eastAsia="Lato" w:cs="Lato"/>
+          <w:sz w:val="24"/>
+          <w:szCs w:val="24"/>
+        </w:rPr>
+        <w:t xml:space="preserve"> </w:t>
+      </w:r>
+      <w:r>
+        <w:rPr>
+          <w:rFonts w:ascii="Lato" w:hAnsi="Lato" w:eastAsia="Lato" w:cs="Lato"/>
+          <w:sz w:val="24"/>
+          <w:szCs w:val="24"/>
+        </w:rPr>
+        <w:t xml:space="preserve">Claude, Gemini, Grok, GLM, DeepSeek, Kimi e Qwen e fazer um juiz consolidar</w:t>
       </w:r>
       <w:r>
         <w:rPr>
@@ -28337,7 +28527,7 @@
                 <w:sz w:val="24"/>
                 <w:szCs w:val="24"/>
               </w:rPr>
-              <w:t>opencode/gpt-5.3-codex</w:t>
+              <w:t>Codex CLI · gpt-5.6-sol, esforço xhigh</w:t>
             </w:r>
           </w:p>
         </w:tc>
@@ -28381,7 +28571,7 @@
                 <w:sz w:val="24"/>
                 <w:szCs w:val="24"/>
               </w:rPr>
-              <w:t>opencode/gemini-3.1-pro</w:t>
+              <w:t>Antigravity CLI · gemini-3.7-flash-high</w:t>
             </w:r>
           </w:p>
         </w:tc>
@@ -36732,7 +36922,7 @@
                 <w:sz w:val="24"/>
                 <w:szCs w:val="24"/>
               </w:rPr>
-              <w:t>Até sete respostas paralelas</w:t>
+              <w:t>Até oito respostas paralelas</w:t>
             </w:r>
           </w:p>
         </w:tc>

</xml_diff>

<commit_message>
feat: add forced NPX upgrade flow
</commit_message>
<xml_diff>
--- a/assets/Manual-completo-comandos-multiagente.docx
+++ b/assets/Manual-completo-comandos-multiagente.docx
@@ -41163,10 +41163,312 @@
         </w:rPr>
         <w:t xml:space="preserve">--all</w:t>
       </w:r>
+      <w:r>
+        <w:rPr>
+          <w:rFonts w:ascii="Lato" w:hAnsi="Lato" w:eastAsia="Lato" w:cs="Lato"/>
+          <w:sz w:val="24"/>
+          <w:szCs w:val="24"/>
+        </w:rPr>
+        <w:br/>
+      </w:r>
+      <w:r>
+        <w:rPr>
+          <w:rFonts w:ascii="Lato" w:hAnsi="Lato" w:eastAsia="Lato" w:cs="Lato"/>
+          <w:sz w:val="24"/>
+          <w:szCs w:val="24"/>
+        </w:rPr>
+        <w:t xml:space="preserve">npx</w:t>
+      </w:r>
+      <w:r>
+        <w:rPr>
+          <w:rFonts w:ascii="Lato" w:hAnsi="Lato" w:eastAsia="Lato" w:cs="Lato"/>
+          <w:sz w:val="24"/>
+          <w:szCs w:val="24"/>
+        </w:rPr>
+        <w:t xml:space="preserve"> </w:t>
+      </w:r>
+      <w:r>
+        <w:rPr>
+          <w:rFonts w:ascii="Lato" w:hAnsi="Lato" w:eastAsia="Lato" w:cs="Lato"/>
+          <w:sz w:val="24"/>
+          <w:szCs w:val="24"/>
+        </w:rPr>
+        <w:t xml:space="preserve">--yes</w:t>
+      </w:r>
+      <w:r>
+        <w:rPr>
+          <w:rFonts w:ascii="Lato" w:hAnsi="Lato" w:eastAsia="Lato" w:cs="Lato"/>
+          <w:sz w:val="24"/>
+          <w:szCs w:val="24"/>
+        </w:rPr>
+        <w:t xml:space="preserve"> @nicholasjacob90/multiagente-consensual@latest upgrade </w:t>
+      </w:r>
+      <w:r>
+        <w:rPr>
+          <w:rFonts w:ascii="Lato" w:hAnsi="Lato" w:eastAsia="Lato" w:cs="Lato"/>
+          <w:sz w:val="24"/>
+          <w:szCs w:val="24"/>
+        </w:rPr>
+        <w:t xml:space="preserve">--all</w:t>
+      </w:r>
+      <w:r>
+        <w:rPr>
+          <w:rFonts w:ascii="Lato" w:hAnsi="Lato" w:eastAsia="Lato" w:cs="Lato"/>
+          <w:sz w:val="24"/>
+          <w:szCs w:val="24"/>
+        </w:rPr>
+        <w:t xml:space="preserve"> </w:t>
+      </w:r>
+      <w:r>
+        <w:rPr>
+          <w:rFonts w:ascii="Lato" w:hAnsi="Lato" w:eastAsia="Lato" w:cs="Lato"/>
+          <w:sz w:val="24"/>
+          <w:szCs w:val="24"/>
+        </w:rPr>
+        <w:t xml:space="preserve">--with-a2a</w:t>
+      </w:r>
     </w:p>
     <w:p>
       <w:pPr>
         <w:pStyle w:val="FirstParagraph"/>
+        <w:spacing w:line="360" w:lineRule="auto" w:after="100"/>
+        <w:ind w:firstLine="504"/>
+        <w:jc w:val="both"/>
+      </w:pPr>
+      <w:r>
+        <w:rPr>
+          <w:rFonts w:ascii="Lato" w:hAnsi="Lato" w:eastAsia="Lato" w:cs="Lato"/>
+          <w:sz w:val="24"/>
+          <w:szCs w:val="24"/>
+        </w:rPr>
+        <w:t xml:space="preserve">O comando</w:t>
+      </w:r>
+      <w:r>
+        <w:rPr>
+          <w:rFonts w:ascii="Lato" w:hAnsi="Lato" w:eastAsia="Lato" w:cs="Lato"/>
+          <w:sz w:val="24"/>
+          <w:szCs w:val="24"/>
+        </w:rPr>
+        <w:t xml:space="preserve"> </w:t>
+      </w:r>
+      <w:r>
+        <w:rPr>
+          <w:rFonts w:ascii="Lato" w:hAnsi="Lato" w:eastAsia="Lato" w:cs="Lato"/>
+          <w:rStyle w:val="VerbatimChar"/>
+          <w:sz w:val="24"/>
+          <w:szCs w:val="24"/>
+        </w:rPr>
+        <w:t xml:space="preserve">upgrade</w:t>
+      </w:r>
+      <w:r>
+        <w:rPr>
+          <w:rFonts w:ascii="Lato" w:hAnsi="Lato" w:eastAsia="Lato" w:cs="Lato"/>
+          <w:sz w:val="24"/>
+          <w:szCs w:val="24"/>
+        </w:rPr>
+        <w:t xml:space="preserve"> </w:t>
+      </w:r>
+      <w:r>
+        <w:rPr>
+          <w:rFonts w:ascii="Lato" w:hAnsi="Lato" w:eastAsia="Lato" w:cs="Lato"/>
+          <w:sz w:val="24"/>
+          <w:szCs w:val="24"/>
+        </w:rPr>
+        <w:t xml:space="preserve">é o caminho recomendado para uma atualização completa:</w:t>
+      </w:r>
+      <w:r>
+        <w:rPr>
+          <w:rFonts w:ascii="Lato" w:hAnsi="Lato" w:eastAsia="Lato" w:cs="Lato"/>
+          <w:sz w:val="24"/>
+          <w:szCs w:val="24"/>
+        </w:rPr>
+        <w:t xml:space="preserve"> </w:t>
+      </w:r>
+      <w:r>
+        <w:rPr>
+          <w:rFonts w:ascii="Lato" w:hAnsi="Lato" w:eastAsia="Lato" w:cs="Lato"/>
+          <w:rStyle w:val="VerbatimChar"/>
+          <w:sz w:val="24"/>
+          <w:szCs w:val="24"/>
+        </w:rPr>
+        <w:t xml:space="preserve">@latest</w:t>
+      </w:r>
+      <w:r>
+        <w:rPr>
+          <w:rFonts w:ascii="Lato" w:hAnsi="Lato" w:eastAsia="Lato" w:cs="Lato"/>
+          <w:sz w:val="24"/>
+          <w:szCs w:val="24"/>
+        </w:rPr>
+        <w:t xml:space="preserve"> </w:t>
+      </w:r>
+      <w:r>
+        <w:rPr>
+          <w:rFonts w:ascii="Lato" w:hAnsi="Lato" w:eastAsia="Lato" w:cs="Lato"/>
+          <w:sz w:val="24"/>
+          <w:szCs w:val="24"/>
+        </w:rPr>
+        <w:t xml:space="preserve">obriga o</w:t>
+      </w:r>
+      <w:r>
+        <w:rPr>
+          <w:rFonts w:ascii="Lato" w:hAnsi="Lato" w:eastAsia="Lato" w:cs="Lato"/>
+          <w:sz w:val="24"/>
+          <w:szCs w:val="24"/>
+        </w:rPr>
+        <w:t xml:space="preserve"> </w:t>
+      </w:r>
+      <w:r>
+        <w:rPr>
+          <w:rFonts w:ascii="Lato" w:hAnsi="Lato" w:eastAsia="Lato" w:cs="Lato"/>
+          <w:rStyle w:val="VerbatimChar"/>
+          <w:sz w:val="24"/>
+          <w:szCs w:val="24"/>
+        </w:rPr>
+        <w:t xml:space="preserve">npx</w:t>
+      </w:r>
+      <w:r>
+        <w:rPr>
+          <w:rFonts w:ascii="Lato" w:hAnsi="Lato" w:eastAsia="Lato" w:cs="Lato"/>
+          <w:sz w:val="24"/>
+          <w:szCs w:val="24"/>
+        </w:rPr>
+        <w:t xml:space="preserve"> </w:t>
+      </w:r>
+      <w:r>
+        <w:rPr>
+          <w:rFonts w:ascii="Lato" w:hAnsi="Lato" w:eastAsia="Lato" w:cs="Lato"/>
+          <w:sz w:val="24"/>
+          <w:szCs w:val="24"/>
+        </w:rPr>
+        <w:t xml:space="preserve">a resolver a versão mais recente publicada, enquanto</w:t>
+      </w:r>
+      <w:r>
+        <w:rPr>
+          <w:rFonts w:ascii="Lato" w:hAnsi="Lato" w:eastAsia="Lato" w:cs="Lato"/>
+          <w:sz w:val="24"/>
+          <w:szCs w:val="24"/>
+        </w:rPr>
+        <w:t xml:space="preserve"> </w:t>
+      </w:r>
+      <w:r>
+        <w:rPr>
+          <w:rFonts w:ascii="Lato" w:hAnsi="Lato" w:eastAsia="Lato" w:cs="Lato"/>
+          <w:rStyle w:val="VerbatimChar"/>
+          <w:sz w:val="24"/>
+          <w:szCs w:val="24"/>
+        </w:rPr>
+        <w:t xml:space="preserve">--with-a2a</w:t>
+      </w:r>
+      <w:r>
+        <w:rPr>
+          <w:rFonts w:ascii="Lato" w:hAnsi="Lato" w:eastAsia="Lato" w:cs="Lato"/>
+          <w:sz w:val="24"/>
+          <w:szCs w:val="24"/>
+        </w:rPr>
+        <w:t xml:space="preserve"> </w:t>
+      </w:r>
+      <w:r>
+        <w:rPr>
+          <w:rFonts w:ascii="Lato" w:hAnsi="Lato" w:eastAsia="Lato" w:cs="Lato"/>
+          <w:sz w:val="24"/>
+          <w:szCs w:val="24"/>
+        </w:rPr>
+        <w:t xml:space="preserve">atualiza também o A2A Mesh</w:t>
+      </w:r>
+      <w:r>
+        <w:rPr>
+          <w:rFonts w:ascii="Lato" w:hAnsi="Lato" w:eastAsia="Lato" w:cs="Lato"/>
+          <w:sz w:val="24"/>
+          <w:szCs w:val="24"/>
+        </w:rPr>
+        <w:t xml:space="preserve"> </w:t>
+      </w:r>
+      <w:r>
+        <w:rPr>
+          <w:rFonts w:ascii="Lato" w:hAnsi="Lato" w:eastAsia="Lato" w:cs="Lato"/>
+          <w:sz w:val="24"/>
+          <w:szCs w:val="24"/>
+        </w:rPr>
+        <w:t xml:space="preserve">fixado pelo instalador. O comando histórico</w:t>
+      </w:r>
+      <w:r>
+        <w:rPr>
+          <w:rFonts w:ascii="Lato" w:hAnsi="Lato" w:eastAsia="Lato" w:cs="Lato"/>
+          <w:sz w:val="24"/>
+          <w:szCs w:val="24"/>
+        </w:rPr>
+        <w:t xml:space="preserve"> </w:t>
+      </w:r>
+      <w:r>
+        <w:rPr>
+          <w:rFonts w:ascii="Lato" w:hAnsi="Lato" w:eastAsia="Lato" w:cs="Lato"/>
+          <w:rStyle w:val="VerbatimChar"/>
+          <w:sz w:val="24"/>
+          <w:szCs w:val="24"/>
+        </w:rPr>
+        <w:t xml:space="preserve">update</w:t>
+      </w:r>
+      <w:r>
+        <w:rPr>
+          <w:rFonts w:ascii="Lato" w:hAnsi="Lato" w:eastAsia="Lato" w:cs="Lato"/>
+          <w:sz w:val="24"/>
+          <w:szCs w:val="24"/>
+        </w:rPr>
+        <w:t xml:space="preserve"> </w:t>
+      </w:r>
+      <w:r>
+        <w:rPr>
+          <w:rFonts w:ascii="Lato" w:hAnsi="Lato" w:eastAsia="Lato" w:cs="Lato"/>
+          <w:sz w:val="24"/>
+          <w:szCs w:val="24"/>
+        </w:rPr>
+        <w:t xml:space="preserve">permanece aceito. Sem</w:t>
+      </w:r>
+      <w:r>
+        <w:rPr>
+          <w:rFonts w:ascii="Lato" w:hAnsi="Lato" w:eastAsia="Lato" w:cs="Lato"/>
+          <w:sz w:val="24"/>
+          <w:szCs w:val="24"/>
+        </w:rPr>
+        <w:t xml:space="preserve"> </w:t>
+      </w:r>
+      <w:r>
+        <w:rPr>
+          <w:rFonts w:ascii="Lato" w:hAnsi="Lato" w:eastAsia="Lato" w:cs="Lato"/>
+          <w:rStyle w:val="VerbatimChar"/>
+          <w:sz w:val="24"/>
+          <w:szCs w:val="24"/>
+        </w:rPr>
+        <w:t xml:space="preserve">--with-a2a</w:t>
+      </w:r>
+      <w:r>
+        <w:rPr>
+          <w:rFonts w:ascii="Lato" w:hAnsi="Lato" w:eastAsia="Lato" w:cs="Lato"/>
+          <w:sz w:val="24"/>
+          <w:szCs w:val="24"/>
+        </w:rPr>
+        <w:t xml:space="preserve">, somente o</w:t>
+      </w:r>
+      <w:r>
+        <w:rPr>
+          <w:rFonts w:ascii="Lato" w:hAnsi="Lato" w:eastAsia="Lato" w:cs="Lato"/>
+          <w:sz w:val="24"/>
+          <w:szCs w:val="24"/>
+        </w:rPr>
+        <w:t xml:space="preserve"> </w:t>
+      </w:r>
+      <w:r>
+        <w:rPr>
+          <w:rFonts w:ascii="Lato" w:hAnsi="Lato" w:eastAsia="Lato" w:cs="Lato"/>
+          <w:sz w:val="24"/>
+          <w:szCs w:val="24"/>
+        </w:rPr>
+        <w:t xml:space="preserve">plugin, as skills, os comandos e as superfícies das CLIs são atualizados.</w:t>
+      </w:r>
+    </w:p>
+    <w:p>
+      <w:pPr>
+        <w:pStyle w:val="BodyText"/>
         <w:spacing w:line="360" w:lineRule="auto" w:after="100"/>
         <w:ind w:firstLine="504"/>
         <w:jc w:val="both"/>

</xml_diff>

<commit_message>
feat: add forced NPX upgrade flow (#6)
Co-authored-by: NicholasJacob1990 <NicholasJacob1990@users.noreply.github.com>
</commit_message>
<xml_diff>
--- a/assets/Manual-completo-comandos-multiagente.docx
+++ b/assets/Manual-completo-comandos-multiagente.docx
@@ -41163,10 +41163,312 @@
         </w:rPr>
         <w:t xml:space="preserve">--all</w:t>
       </w:r>
+      <w:r>
+        <w:rPr>
+          <w:rFonts w:ascii="Lato" w:hAnsi="Lato" w:eastAsia="Lato" w:cs="Lato"/>
+          <w:sz w:val="24"/>
+          <w:szCs w:val="24"/>
+        </w:rPr>
+        <w:br/>
+      </w:r>
+      <w:r>
+        <w:rPr>
+          <w:rFonts w:ascii="Lato" w:hAnsi="Lato" w:eastAsia="Lato" w:cs="Lato"/>
+          <w:sz w:val="24"/>
+          <w:szCs w:val="24"/>
+        </w:rPr>
+        <w:t xml:space="preserve">npx</w:t>
+      </w:r>
+      <w:r>
+        <w:rPr>
+          <w:rFonts w:ascii="Lato" w:hAnsi="Lato" w:eastAsia="Lato" w:cs="Lato"/>
+          <w:sz w:val="24"/>
+          <w:szCs w:val="24"/>
+        </w:rPr>
+        <w:t xml:space="preserve"> </w:t>
+      </w:r>
+      <w:r>
+        <w:rPr>
+          <w:rFonts w:ascii="Lato" w:hAnsi="Lato" w:eastAsia="Lato" w:cs="Lato"/>
+          <w:sz w:val="24"/>
+          <w:szCs w:val="24"/>
+        </w:rPr>
+        <w:t xml:space="preserve">--yes</w:t>
+      </w:r>
+      <w:r>
+        <w:rPr>
+          <w:rFonts w:ascii="Lato" w:hAnsi="Lato" w:eastAsia="Lato" w:cs="Lato"/>
+          <w:sz w:val="24"/>
+          <w:szCs w:val="24"/>
+        </w:rPr>
+        <w:t xml:space="preserve"> @nicholasjacob90/multiagente-consensual@latest upgrade </w:t>
+      </w:r>
+      <w:r>
+        <w:rPr>
+          <w:rFonts w:ascii="Lato" w:hAnsi="Lato" w:eastAsia="Lato" w:cs="Lato"/>
+          <w:sz w:val="24"/>
+          <w:szCs w:val="24"/>
+        </w:rPr>
+        <w:t xml:space="preserve">--all</w:t>
+      </w:r>
+      <w:r>
+        <w:rPr>
+          <w:rFonts w:ascii="Lato" w:hAnsi="Lato" w:eastAsia="Lato" w:cs="Lato"/>
+          <w:sz w:val="24"/>
+          <w:szCs w:val="24"/>
+        </w:rPr>
+        <w:t xml:space="preserve"> </w:t>
+      </w:r>
+      <w:r>
+        <w:rPr>
+          <w:rFonts w:ascii="Lato" w:hAnsi="Lato" w:eastAsia="Lato" w:cs="Lato"/>
+          <w:sz w:val="24"/>
+          <w:szCs w:val="24"/>
+        </w:rPr>
+        <w:t xml:space="preserve">--with-a2a</w:t>
+      </w:r>
     </w:p>
     <w:p>
       <w:pPr>
         <w:pStyle w:val="FirstParagraph"/>
+        <w:spacing w:line="360" w:lineRule="auto" w:after="100"/>
+        <w:ind w:firstLine="504"/>
+        <w:jc w:val="both"/>
+      </w:pPr>
+      <w:r>
+        <w:rPr>
+          <w:rFonts w:ascii="Lato" w:hAnsi="Lato" w:eastAsia="Lato" w:cs="Lato"/>
+          <w:sz w:val="24"/>
+          <w:szCs w:val="24"/>
+        </w:rPr>
+        <w:t xml:space="preserve">O comando</w:t>
+      </w:r>
+      <w:r>
+        <w:rPr>
+          <w:rFonts w:ascii="Lato" w:hAnsi="Lato" w:eastAsia="Lato" w:cs="Lato"/>
+          <w:sz w:val="24"/>
+          <w:szCs w:val="24"/>
+        </w:rPr>
+        <w:t xml:space="preserve"> </w:t>
+      </w:r>
+      <w:r>
+        <w:rPr>
+          <w:rFonts w:ascii="Lato" w:hAnsi="Lato" w:eastAsia="Lato" w:cs="Lato"/>
+          <w:rStyle w:val="VerbatimChar"/>
+          <w:sz w:val="24"/>
+          <w:szCs w:val="24"/>
+        </w:rPr>
+        <w:t xml:space="preserve">upgrade</w:t>
+      </w:r>
+      <w:r>
+        <w:rPr>
+          <w:rFonts w:ascii="Lato" w:hAnsi="Lato" w:eastAsia="Lato" w:cs="Lato"/>
+          <w:sz w:val="24"/>
+          <w:szCs w:val="24"/>
+        </w:rPr>
+        <w:t xml:space="preserve"> </w:t>
+      </w:r>
+      <w:r>
+        <w:rPr>
+          <w:rFonts w:ascii="Lato" w:hAnsi="Lato" w:eastAsia="Lato" w:cs="Lato"/>
+          <w:sz w:val="24"/>
+          <w:szCs w:val="24"/>
+        </w:rPr>
+        <w:t xml:space="preserve">é o caminho recomendado para uma atualização completa:</w:t>
+      </w:r>
+      <w:r>
+        <w:rPr>
+          <w:rFonts w:ascii="Lato" w:hAnsi="Lato" w:eastAsia="Lato" w:cs="Lato"/>
+          <w:sz w:val="24"/>
+          <w:szCs w:val="24"/>
+        </w:rPr>
+        <w:t xml:space="preserve"> </w:t>
+      </w:r>
+      <w:r>
+        <w:rPr>
+          <w:rFonts w:ascii="Lato" w:hAnsi="Lato" w:eastAsia="Lato" w:cs="Lato"/>
+          <w:rStyle w:val="VerbatimChar"/>
+          <w:sz w:val="24"/>
+          <w:szCs w:val="24"/>
+        </w:rPr>
+        <w:t xml:space="preserve">@latest</w:t>
+      </w:r>
+      <w:r>
+        <w:rPr>
+          <w:rFonts w:ascii="Lato" w:hAnsi="Lato" w:eastAsia="Lato" w:cs="Lato"/>
+          <w:sz w:val="24"/>
+          <w:szCs w:val="24"/>
+        </w:rPr>
+        <w:t xml:space="preserve"> </w:t>
+      </w:r>
+      <w:r>
+        <w:rPr>
+          <w:rFonts w:ascii="Lato" w:hAnsi="Lato" w:eastAsia="Lato" w:cs="Lato"/>
+          <w:sz w:val="24"/>
+          <w:szCs w:val="24"/>
+        </w:rPr>
+        <w:t xml:space="preserve">obriga o</w:t>
+      </w:r>
+      <w:r>
+        <w:rPr>
+          <w:rFonts w:ascii="Lato" w:hAnsi="Lato" w:eastAsia="Lato" w:cs="Lato"/>
+          <w:sz w:val="24"/>
+          <w:szCs w:val="24"/>
+        </w:rPr>
+        <w:t xml:space="preserve"> </w:t>
+      </w:r>
+      <w:r>
+        <w:rPr>
+          <w:rFonts w:ascii="Lato" w:hAnsi="Lato" w:eastAsia="Lato" w:cs="Lato"/>
+          <w:rStyle w:val="VerbatimChar"/>
+          <w:sz w:val="24"/>
+          <w:szCs w:val="24"/>
+        </w:rPr>
+        <w:t xml:space="preserve">npx</w:t>
+      </w:r>
+      <w:r>
+        <w:rPr>
+          <w:rFonts w:ascii="Lato" w:hAnsi="Lato" w:eastAsia="Lato" w:cs="Lato"/>
+          <w:sz w:val="24"/>
+          <w:szCs w:val="24"/>
+        </w:rPr>
+        <w:t xml:space="preserve"> </w:t>
+      </w:r>
+      <w:r>
+        <w:rPr>
+          <w:rFonts w:ascii="Lato" w:hAnsi="Lato" w:eastAsia="Lato" w:cs="Lato"/>
+          <w:sz w:val="24"/>
+          <w:szCs w:val="24"/>
+        </w:rPr>
+        <w:t xml:space="preserve">a resolver a versão mais recente publicada, enquanto</w:t>
+      </w:r>
+      <w:r>
+        <w:rPr>
+          <w:rFonts w:ascii="Lato" w:hAnsi="Lato" w:eastAsia="Lato" w:cs="Lato"/>
+          <w:sz w:val="24"/>
+          <w:szCs w:val="24"/>
+        </w:rPr>
+        <w:t xml:space="preserve"> </w:t>
+      </w:r>
+      <w:r>
+        <w:rPr>
+          <w:rFonts w:ascii="Lato" w:hAnsi="Lato" w:eastAsia="Lato" w:cs="Lato"/>
+          <w:rStyle w:val="VerbatimChar"/>
+          <w:sz w:val="24"/>
+          <w:szCs w:val="24"/>
+        </w:rPr>
+        <w:t xml:space="preserve">--with-a2a</w:t>
+      </w:r>
+      <w:r>
+        <w:rPr>
+          <w:rFonts w:ascii="Lato" w:hAnsi="Lato" w:eastAsia="Lato" w:cs="Lato"/>
+          <w:sz w:val="24"/>
+          <w:szCs w:val="24"/>
+        </w:rPr>
+        <w:t xml:space="preserve"> </w:t>
+      </w:r>
+      <w:r>
+        <w:rPr>
+          <w:rFonts w:ascii="Lato" w:hAnsi="Lato" w:eastAsia="Lato" w:cs="Lato"/>
+          <w:sz w:val="24"/>
+          <w:szCs w:val="24"/>
+        </w:rPr>
+        <w:t xml:space="preserve">atualiza também o A2A Mesh</w:t>
+      </w:r>
+      <w:r>
+        <w:rPr>
+          <w:rFonts w:ascii="Lato" w:hAnsi="Lato" w:eastAsia="Lato" w:cs="Lato"/>
+          <w:sz w:val="24"/>
+          <w:szCs w:val="24"/>
+        </w:rPr>
+        <w:t xml:space="preserve"> </w:t>
+      </w:r>
+      <w:r>
+        <w:rPr>
+          <w:rFonts w:ascii="Lato" w:hAnsi="Lato" w:eastAsia="Lato" w:cs="Lato"/>
+          <w:sz w:val="24"/>
+          <w:szCs w:val="24"/>
+        </w:rPr>
+        <w:t xml:space="preserve">fixado pelo instalador. O comando histórico</w:t>
+      </w:r>
+      <w:r>
+        <w:rPr>
+          <w:rFonts w:ascii="Lato" w:hAnsi="Lato" w:eastAsia="Lato" w:cs="Lato"/>
+          <w:sz w:val="24"/>
+          <w:szCs w:val="24"/>
+        </w:rPr>
+        <w:t xml:space="preserve"> </w:t>
+      </w:r>
+      <w:r>
+        <w:rPr>
+          <w:rFonts w:ascii="Lato" w:hAnsi="Lato" w:eastAsia="Lato" w:cs="Lato"/>
+          <w:rStyle w:val="VerbatimChar"/>
+          <w:sz w:val="24"/>
+          <w:szCs w:val="24"/>
+        </w:rPr>
+        <w:t xml:space="preserve">update</w:t>
+      </w:r>
+      <w:r>
+        <w:rPr>
+          <w:rFonts w:ascii="Lato" w:hAnsi="Lato" w:eastAsia="Lato" w:cs="Lato"/>
+          <w:sz w:val="24"/>
+          <w:szCs w:val="24"/>
+        </w:rPr>
+        <w:t xml:space="preserve"> </w:t>
+      </w:r>
+      <w:r>
+        <w:rPr>
+          <w:rFonts w:ascii="Lato" w:hAnsi="Lato" w:eastAsia="Lato" w:cs="Lato"/>
+          <w:sz w:val="24"/>
+          <w:szCs w:val="24"/>
+        </w:rPr>
+        <w:t xml:space="preserve">permanece aceito. Sem</w:t>
+      </w:r>
+      <w:r>
+        <w:rPr>
+          <w:rFonts w:ascii="Lato" w:hAnsi="Lato" w:eastAsia="Lato" w:cs="Lato"/>
+          <w:sz w:val="24"/>
+          <w:szCs w:val="24"/>
+        </w:rPr>
+        <w:t xml:space="preserve"> </w:t>
+      </w:r>
+      <w:r>
+        <w:rPr>
+          <w:rFonts w:ascii="Lato" w:hAnsi="Lato" w:eastAsia="Lato" w:cs="Lato"/>
+          <w:rStyle w:val="VerbatimChar"/>
+          <w:sz w:val="24"/>
+          <w:szCs w:val="24"/>
+        </w:rPr>
+        <w:t xml:space="preserve">--with-a2a</w:t>
+      </w:r>
+      <w:r>
+        <w:rPr>
+          <w:rFonts w:ascii="Lato" w:hAnsi="Lato" w:eastAsia="Lato" w:cs="Lato"/>
+          <w:sz w:val="24"/>
+          <w:szCs w:val="24"/>
+        </w:rPr>
+        <w:t xml:space="preserve">, somente o</w:t>
+      </w:r>
+      <w:r>
+        <w:rPr>
+          <w:rFonts w:ascii="Lato" w:hAnsi="Lato" w:eastAsia="Lato" w:cs="Lato"/>
+          <w:sz w:val="24"/>
+          <w:szCs w:val="24"/>
+        </w:rPr>
+        <w:t xml:space="preserve"> </w:t>
+      </w:r>
+      <w:r>
+        <w:rPr>
+          <w:rFonts w:ascii="Lato" w:hAnsi="Lato" w:eastAsia="Lato" w:cs="Lato"/>
+          <w:sz w:val="24"/>
+          <w:szCs w:val="24"/>
+        </w:rPr>
+        <w:t xml:space="preserve">plugin, as skills, os comandos e as superfícies das CLIs são atualizados.</w:t>
+      </w:r>
+    </w:p>
+    <w:p>
+      <w:pPr>
+        <w:pStyle w:val="BodyText"/>
         <w:spacing w:line="360" w:lineRule="auto" w:after="100"/>
         <w:ind w:firstLine="504"/>
         <w:jc w:val="both"/>

</xml_diff>

<commit_message>
docs: improve manual typography accessibility
</commit_message>
<xml_diff>
--- a/assets/Manual-completo-comandos-multiagente.docx
+++ b/assets/Manual-completo-comandos-multiagente.docx
@@ -15,7 +15,7 @@
         <w:t xml:space="preserve">Manual completo — Multiagente Consensual</w:t>
       </w:r>
     </w:p>
-    <w:bookmarkStart w:id="154" w:name="guia-prático-dos-comandos-multiagente"/>
+    <w:bookmarkStart w:id="156" w:name="guia-prático-dos-comandos-multiagente"/>
     <w:p>
       <w:pPr>
         <w:pStyle w:val="Subtitle"/>
@@ -111,7 +111,7 @@
         <w:t xml:space="preserve">workflows.</w:t>
       </w:r>
     </w:p>
-    <w:bookmarkStart w:id="21" w:name="sobre-esta-edição"/>
+    <w:bookmarkStart w:id="23" w:name="sobre-esta-edição"/>
     <w:p>
       <w:pPr>
         <w:pStyle w:val="Heading2"/>
@@ -837,8 +837,8 @@
         <w:t xml:space="preserve">no loop podem declarar um artefato canônico aprovado.</w:t>
       </w:r>
     </w:p>
-    <w:bookmarkEnd w:id="21"/>
-    <w:bookmarkStart w:id="23" w:name="sumário"/>
+    <w:bookmarkEnd w:id="23"/>
+    <w:bookmarkStart w:id="25" w:name="sumário"/>
     <w:p>
       <w:pPr>
         <w:pStyle w:val="Heading2"/>
@@ -1133,7 +1133,7 @@
         <w:t xml:space="preserve">Instalação única com NPM/NPX</w:t>
       </w:r>
     </w:p>
-    <w:bookmarkStart w:id="22" w:name="índice-visual-dos-fluxogramas"/>
+    <w:bookmarkStart w:id="24" w:name="índice-visual-dos-fluxogramas"/>
     <w:p>
       <w:pPr>
         <w:pStyle w:val="Heading3"/>
@@ -1387,9 +1387,9 @@
         <w:t xml:space="preserve">Histórico e retomada do Agent Council</w:t>
       </w:r>
     </w:p>
-    <w:bookmarkEnd w:id="22"/>
-    <w:bookmarkEnd w:id="23"/>
-    <w:bookmarkStart w:id="29" w:name="X131adb38655cc94e95d47116666e24ad20a2075"/>
+    <w:bookmarkEnd w:id="24"/>
+    <w:bookmarkEnd w:id="25"/>
+    <w:bookmarkStart w:id="31" w:name="X131adb38655cc94e95d47116666e24ad20a2075"/>
     <w:p>
       <w:pPr>
         <w:pStyle w:val="Heading2"/>
@@ -1404,7 +1404,7 @@
         <w:t xml:space="preserve">1. Como usar em qualquer CLI</w:t>
       </w:r>
     </w:p>
-    <w:bookmarkStart w:id="24" w:name="X8d58a36b5db12620832eaa686a8d079d7f9b06b"/>
+    <w:bookmarkStart w:id="26" w:name="X8d58a36b5db12620832eaa686a8d079d7f9b06b"/>
     <w:p>
       <w:pPr>
         <w:pStyle w:val="Heading3"/>
@@ -1548,8 +1548,8 @@
         <w:t xml:space="preserve">e consenso estrito.</w:t>
       </w:r>
     </w:p>
-    <w:bookmarkEnd w:id="24"/>
-    <w:bookmarkStart w:id="25" w:name="Xfe1c65f8ea1584019b75dde5d811ad07936ec39"/>
+    <w:bookmarkEnd w:id="26"/>
+    <w:bookmarkStart w:id="27" w:name="Xfe1c65f8ea1584019b75dde5d811ad07936ec39"/>
     <w:p>
       <w:pPr>
         <w:pStyle w:val="Heading3"/>
@@ -2485,8 +2485,8 @@
         <w:t xml:space="preserve">com rota, modelo, código de saída e hashes, entra no ledger do fluxo.</w:t>
       </w:r>
     </w:p>
-    <w:bookmarkEnd w:id="25"/>
-    <w:bookmarkStart w:id="27" w:name="Xcf441519c05b6b4e741111eb299228102fc4337"/>
+    <w:bookmarkEnd w:id="27"/>
+    <w:bookmarkStart w:id="29" w:name="Xcf441519c05b6b4e741111eb299228102fc4337"/>
     <w:p>
       <w:pPr>
         <w:pStyle w:val="Heading3"/>
@@ -2837,7 +2837,7 @@
         <w:t xml:space="preserve">deve pausar; ele não pode trocar de modelo silenciosamente.</w:t>
       </w:r>
     </w:p>
-    <w:bookmarkStart w:id="26" w:name="o-que-agora-prova-consenso"/>
+    <w:bookmarkStart w:id="28" w:name="o-que-agora-prova-consenso"/>
     <w:p>
       <w:pPr>
         <w:pStyle w:val="Heading4"/>
@@ -3338,9 +3338,9 @@
         <w:t xml:space="preserve">.</w:t>
       </w:r>
     </w:p>
-    <w:bookmarkEnd w:id="26"/>
-    <w:bookmarkEnd w:id="27"/>
-    <w:bookmarkStart w:id="28" w:name="X255c30c0d533250fabe4e48742c8063af4bb4c3"/>
+    <w:bookmarkEnd w:id="28"/>
+    <w:bookmarkEnd w:id="29"/>
+    <w:bookmarkStart w:id="30" w:name="X255c30c0d533250fabe4e48742c8063af4bb4c3"/>
     <w:p>
       <w:pPr>
         <w:pStyle w:val="Heading3"/>
@@ -4502,9 +4502,9 @@
         <w:t xml:space="preserve">avança quando passa pelos gates configurados.</w:t>
       </w:r>
     </w:p>
-    <w:bookmarkEnd w:id="28"/>
-    <w:bookmarkEnd w:id="29"/>
-    <w:bookmarkStart w:id="37" w:name="Xa2eed8d5a0a052d78e57a239139d1ebb66520da"/>
+    <w:bookmarkEnd w:id="30"/>
+    <w:bookmarkEnd w:id="31"/>
+    <w:bookmarkStart w:id="39" w:name="Xa2eed8d5a0a052d78e57a239139d1ebb66520da"/>
     <w:p>
       <w:pPr>
         <w:pStyle w:val="Heading2"/>
@@ -4532,18 +4532,18 @@
           <wp:inline>
             <wp:extent cx="5715000" cy="1078851"/>
             <wp:effectExtent b="0" l="0" r="0" t="0"/>
-            <wp:docPr descr="Mapa geral dos comandos" title="" id="31" name="Picture"/>
+            <wp:docPr descr="Mapa geral dos comandos" title="" id="33" name="Picture"/>
             <a:graphic>
               <a:graphicData uri="http://schemas.openxmlformats.org/drawingml/2006/picture">
                 <pic:pic>
                   <pic:nvPicPr>
-                    <pic:cNvPr descr="diagramas-comandos-multiagente/01-mapa-geral.png" id="32" name="Picture"/>
+                    <pic:cNvPr descr="diagramas-comandos-multiagente/01-mapa-geral.png" id="34" name="Picture"/>
                     <pic:cNvPicPr>
                       <a:picLocks noChangeArrowheads="1" noChangeAspect="1"/>
                     </pic:cNvPicPr>
                   </pic:nvPicPr>
                   <pic:blipFill>
-                    <a:blip r:embed="rId30"/>
+                    <a:blip r:embed="rId32"/>
                     <a:stretch>
                       <a:fillRect/>
                     </a:stretch>
@@ -4588,7 +4588,7 @@
         <w:t xml:space="preserve">Figura 1 — Mapa geral dos comandos e das famílias de coordenação.</w:t>
       </w:r>
     </w:p>
-    <w:bookmarkStart w:id="36" w:name="qual-comando-escolher"/>
+    <w:bookmarkStart w:id="38" w:name="qual-comando-escolher"/>
     <w:p>
       <w:pPr>
         <w:pStyle w:val="Heading3"/>
@@ -4615,18 +4615,18 @@
           <wp:inline>
             <wp:extent cx="5715000" cy="4308118"/>
             <wp:effectExtent b="0" l="0" r="0" t="0"/>
-            <wp:docPr descr="Árvore de escolha rápida" title="" id="34" name="Picture"/>
+            <wp:docPr descr="Árvore de escolha rápida" title="" id="36" name="Picture"/>
             <a:graphic>
               <a:graphicData uri="http://schemas.openxmlformats.org/drawingml/2006/picture">
                 <pic:pic>
                   <pic:nvPicPr>
-                    <pic:cNvPr descr="diagramas-comandos-multiagente/02-escolha-rapida.png" id="35" name="Picture"/>
+                    <pic:cNvPr descr="diagramas-comandos-multiagente/02-escolha-rapida.png" id="37" name="Picture"/>
                     <pic:cNvPicPr>
                       <a:picLocks noChangeArrowheads="1" noChangeAspect="1"/>
                     </pic:cNvPicPr>
                   </pic:nvPicPr>
                   <pic:blipFill>
-                    <a:blip r:embed="rId33"/>
+                    <a:blip r:embed="rId35"/>
                     <a:stretch>
                       <a:fillRect/>
                     </a:stretch>
@@ -5463,9 +5463,9 @@
         </w:tc>
       </w:tr>
     </w:tbl>
-    <w:bookmarkEnd w:id="36"/>
-    <w:bookmarkEnd w:id="37"/>
-    <w:bookmarkStart w:id="55" w:name="X5b4644ddd99b4259fe07331934db9db4a1aa521"/>
+    <w:bookmarkEnd w:id="38"/>
+    <w:bookmarkEnd w:id="39"/>
+    <w:bookmarkStart w:id="57" w:name="X5b4644ddd99b4259fe07331934db9db4a1aa521"/>
     <w:p>
       <w:pPr>
         <w:pStyle w:val="Heading2"/>
@@ -5480,7 +5480,7 @@
         <w:t xml:space="preserve">3. Conceitos essenciais</w:t>
       </w:r>
     </w:p>
-    <w:bookmarkStart w:id="38" w:name="X27a8e074fa5636367455c8ff4747b876fb15a02"/>
+    <w:bookmarkStart w:id="40" w:name="X27a8e074fa5636367455c8ff4747b876fb15a02"/>
     <w:p>
       <w:pPr>
         <w:pStyle w:val="Heading3"/>
@@ -5956,8 +5956,8 @@
         <w:t xml:space="preserve">auditoria.</w:t>
       </w:r>
     </w:p>
-    <w:bookmarkEnd w:id="38"/>
-    <w:bookmarkStart w:id="39" w:name="X2cc5649f272a39098c509e8a3a571002161f4a1"/>
+    <w:bookmarkEnd w:id="40"/>
+    <w:bookmarkStart w:id="41" w:name="X2cc5649f272a39098c509e8a3a571002161f4a1"/>
     <w:p>
       <w:pPr>
         <w:pStyle w:val="Heading3"/>
@@ -6298,8 +6298,8 @@
         <w:t xml:space="preserve">mais restritivo. Runs antigos já congelados não são reescritos.</w:t>
       </w:r>
     </w:p>
-    <w:bookmarkEnd w:id="39"/>
-    <w:bookmarkStart w:id="40" w:name="Xc41abadb34a6763b88b510b2599d2fa29ef9c41"/>
+    <w:bookmarkEnd w:id="41"/>
+    <w:bookmarkStart w:id="42" w:name="Xc41abadb34a6763b88b510b2599d2fa29ef9c41"/>
     <w:p>
       <w:pPr>
         <w:pStyle w:val="Heading3"/>
@@ -6940,8 +6940,8 @@
         <w:t xml:space="preserve">informa os pontos de dissenso.</w:t>
       </w:r>
     </w:p>
-    <w:bookmarkEnd w:id="40"/>
-    <w:bookmarkStart w:id="41" w:name="X59c145421a56087824e0db65d76fc93e7e32956"/>
+    <w:bookmarkEnd w:id="42"/>
+    <w:bookmarkStart w:id="43" w:name="X59c145421a56087824e0db65d76fc93e7e32956"/>
     <w:p>
       <w:pPr>
         <w:pStyle w:val="Heading3"/>
@@ -7981,8 +7981,8 @@
         <w:t xml:space="preserve">consenso.</w:t>
       </w:r>
     </w:p>
-    <w:bookmarkEnd w:id="41"/>
-    <w:bookmarkStart w:id="45" w:name="Xb005735816e0f3866a3384d372a454c440b72f0"/>
+    <w:bookmarkEnd w:id="43"/>
+    <w:bookmarkStart w:id="47" w:name="Xb005735816e0f3866a3384d372a454c440b72f0"/>
     <w:p>
       <w:pPr>
         <w:pStyle w:val="Heading3"/>
@@ -9863,18 +9863,18 @@
           <wp:inline>
             <wp:extent cx="5151706" cy="6720840"/>
             <wp:effectExtent b="0" l="0" r="0" t="0"/>
-            <wp:docPr descr="Critérios de apuração colegiada" title="" id="43" name="Picture"/>
+            <wp:docPr descr="Critérios de apuração colegiada" title="" id="45" name="Picture"/>
             <a:graphic>
               <a:graphicData uri="http://schemas.openxmlformats.org/drawingml/2006/picture">
                 <pic:pic>
                   <pic:nvPicPr>
-                    <pic:cNvPr descr="diagramas-comandos-multiagente/10-criterios-apuracao.png" id="44" name="Picture"/>
+                    <pic:cNvPr descr="diagramas-comandos-multiagente/10-criterios-apuracao.png" id="46" name="Picture"/>
                     <pic:cNvPicPr>
                       <a:picLocks noChangeArrowheads="1" noChangeAspect="1"/>
                     </pic:cNvPicPr>
                   </pic:nvPicPr>
                   <pic:blipFill>
-                    <a:blip r:embed="rId42"/>
+                    <a:blip r:embed="rId44"/>
                     <a:stretch>
                       <a:fillRect/>
                     </a:stretch>
@@ -9919,8 +9919,8 @@
         <w:t xml:space="preserve">Figura 3 — Critérios global, analítico e híbrido para apuração colegiada.</w:t>
       </w:r>
     </w:p>
-    <w:bookmarkEnd w:id="45"/>
-    <w:bookmarkStart w:id="46" w:name="X11c50c6f3ae3b8c7652a7e2ce217e4a24a0c7cf"/>
+    <w:bookmarkEnd w:id="47"/>
+    <w:bookmarkStart w:id="48" w:name="X11c50c6f3ae3b8c7652a7e2ce217e4a24a0c7cf"/>
     <w:p>
       <w:pPr>
         <w:pStyle w:val="Heading3"/>
@@ -10204,8 +10204,8 @@
         <w:t xml:space="preserve">alterado e os dependentes materialmente afetados são reabertos.</w:t>
       </w:r>
     </w:p>
-    <w:bookmarkEnd w:id="46"/>
-    <w:bookmarkStart w:id="50" w:name="X58a08b30234a4b3717a606a9883b680ebd0d69e"/>
+    <w:bookmarkEnd w:id="48"/>
+    <w:bookmarkStart w:id="52" w:name="X58a08b30234a4b3717a606a9883b680ebd0d69e"/>
     <w:p>
       <w:pPr>
         <w:pStyle w:val="Heading3"/>
@@ -10297,18 +10297,18 @@
           <wp:inline>
             <wp:extent cx="3903065" cy="6720840"/>
             <wp:effectExtent b="0" l="0" r="0" t="0"/>
-            <wp:docPr descr="Formação de decisão colegiada" title="" id="48" name="Picture"/>
+            <wp:docPr descr="Formação de decisão colegiada" title="" id="50" name="Picture"/>
             <a:graphic>
               <a:graphicData uri="http://schemas.openxmlformats.org/drawingml/2006/picture">
                 <pic:pic>
                   <pic:nvPicPr>
-                    <pic:cNvPr descr="diagramas-comandos-multiagente/09-decisao-colegiada.png" id="49" name="Picture"/>
+                    <pic:cNvPr descr="diagramas-comandos-multiagente/09-decisao-colegiada.png" id="51" name="Picture"/>
                     <pic:cNvPicPr>
                       <a:picLocks noChangeArrowheads="1" noChangeAspect="1"/>
                     </pic:cNvPicPr>
                   </pic:nvPicPr>
                   <pic:blipFill>
-                    <a:blip r:embed="rId47"/>
+                    <a:blip r:embed="rId49"/>
                     <a:stretch>
                       <a:fillRect/>
                     </a:stretch>
@@ -10353,8 +10353,8 @@
         <w:t xml:space="preserve">Figura 4 — Formação, votação e publicação de uma decisão colegiada.</w:t>
       </w:r>
     </w:p>
-    <w:bookmarkEnd w:id="50"/>
-    <w:bookmarkStart w:id="51" w:name="Xa0ea9865774df2e47bf575ad042680c74fa1b87"/>
+    <w:bookmarkEnd w:id="52"/>
+    <w:bookmarkStart w:id="53" w:name="Xa0ea9865774df2e47bf575ad042680c74fa1b87"/>
     <w:p>
       <w:pPr>
         <w:pStyle w:val="Heading3"/>
@@ -10854,8 +10854,8 @@
         <w:t xml:space="preserve">sobrescreverem o mesmo canônico.</w:t>
       </w:r>
     </w:p>
-    <w:bookmarkEnd w:id="51"/>
-    <w:bookmarkStart w:id="52" w:name="Xe975051f3cb0aa7d3a2bcea041aa74b86a4c0b9"/>
+    <w:bookmarkEnd w:id="53"/>
+    <w:bookmarkStart w:id="54" w:name="Xe975051f3cb0aa7d3a2bcea041aa74b86a4c0b9"/>
     <w:p>
       <w:pPr>
         <w:pStyle w:val="Heading3"/>
@@ -11565,8 +11565,8 @@
         <w:t xml:space="preserve">uma alteração material no texto já concluído conta como nova versão.</w:t>
       </w:r>
     </w:p>
-    <w:bookmarkEnd w:id="52"/>
-    <w:bookmarkStart w:id="53" w:name="Xd23b47b2cec67b45caaaca2c2822c436e8da863"/>
+    <w:bookmarkEnd w:id="54"/>
+    <w:bookmarkStart w:id="55" w:name="Xd23b47b2cec67b45caaaca2c2822c436e8da863"/>
     <w:p>
       <w:pPr>
         <w:pStyle w:val="Heading3"/>
@@ -12347,8 +12347,8 @@
         <w:t xml:space="preserve">confirmado”; o sistema não declara sucesso silenciosamente.</w:t>
       </w:r>
     </w:p>
-    <w:bookmarkEnd w:id="53"/>
-    <w:bookmarkStart w:id="54" w:name="Xe7d95fb19709563856489178a827ca11879130f"/>
+    <w:bookmarkEnd w:id="55"/>
+    <w:bookmarkStart w:id="56" w:name="Xe7d95fb19709563856489178a827ca11879130f"/>
     <w:p>
       <w:pPr>
         <w:pStyle w:val="Heading3"/>
@@ -13070,9 +13070,9 @@
         <w:t xml:space="preserve">/workflow-agentes permita respostas até o teto nativo; não obrigue os agentes a usar todo o limite</w:t>
       </w:r>
     </w:p>
-    <w:bookmarkEnd w:id="54"/>
-    <w:bookmarkEnd w:id="55"/>
-    <w:bookmarkStart w:id="69" w:name="X2a5c90a40e7025096d69554bb420db787fecab5"/>
+    <w:bookmarkEnd w:id="56"/>
+    <w:bookmarkEnd w:id="57"/>
+    <w:bookmarkStart w:id="71" w:name="X2a5c90a40e7025096d69554bb420db787fecab5"/>
     <w:p>
       <w:pPr>
         <w:pStyle w:val="Heading2"/>
@@ -14323,18 +14323,18 @@
           <wp:inline>
             <wp:extent cx="5715000" cy="4314066"/>
             <wp:effectExtent b="0" l="0" r="0" t="0"/>
-            <wp:docPr descr="Streaming e execução durável" title="" id="57" name="Picture"/>
+            <wp:docPr descr="Streaming e execução durável" title="" id="59" name="Picture"/>
             <a:graphic>
               <a:graphicData uri="http://schemas.openxmlformats.org/drawingml/2006/picture">
                 <pic:pic>
                   <pic:nvPicPr>
-                    <pic:cNvPr descr="diagramas-comandos-multiagente/11-streaming-duravel.png" id="58" name="Picture"/>
+                    <pic:cNvPr descr="diagramas-comandos-multiagente/11-streaming-duravel.png" id="60" name="Picture"/>
                     <pic:cNvPicPr>
                       <a:picLocks noChangeArrowheads="1" noChangeAspect="1"/>
                     </pic:cNvPicPr>
                   </pic:nvPicPr>
                   <pic:blipFill>
-                    <a:blip r:embed="rId56"/>
+                    <a:blip r:embed="rId58"/>
                     <a:stretch>
                       <a:fillRect/>
                     </a:stretch>
@@ -14392,18 +14392,18 @@
           <wp:inline>
             <wp:extent cx="5715000" cy="3085665"/>
             <wp:effectExtent b="0" l="0" r="0" t="0"/>
-            <wp:docPr descr="Modos do A2A Mesh" title="" id="60" name="Picture"/>
+            <wp:docPr descr="Modos do A2A Mesh" title="" id="62" name="Picture"/>
             <a:graphic>
               <a:graphicData uri="http://schemas.openxmlformats.org/drawingml/2006/picture">
                 <pic:pic>
                   <pic:nvPicPr>
-                    <pic:cNvPr descr="diagramas-comandos-multiagente/03-a2a-mesh.png" id="61" name="Picture"/>
+                    <pic:cNvPr descr="diagramas-comandos-multiagente/03-a2a-mesh.png" id="63" name="Picture"/>
                     <pic:cNvPicPr>
                       <a:picLocks noChangeArrowheads="1" noChangeAspect="1"/>
                     </pic:cNvPicPr>
                   </pic:nvPicPr>
                   <pic:blipFill>
-                    <a:blip r:embed="rId59"/>
+                    <a:blip r:embed="rId61"/>
                     <a:stretch>
                       <a:fillRect/>
                     </a:stretch>
@@ -14448,7 +14448,7 @@
         <w:t xml:space="preserve">Figura 6 — Modos de convocação e colaboração disponíveis no A2A Mesh.</w:t>
       </w:r>
     </w:p>
-    <w:bookmarkStart w:id="62" w:name="Xfe2bdb38132f0fe0997cd52d1ab87a9f5b8a721"/>
+    <w:bookmarkStart w:id="64" w:name="Xfe2bdb38132f0fe0997cd52d1ab87a9f5b8a721"/>
     <w:p>
       <w:pPr>
         <w:pStyle w:val="Heading3"/>
@@ -14602,8 +14602,8 @@
         <w:t xml:space="preserve">. Use primeiro quando uma chamada A2A falhar ou parecer travada.</w:t>
       </w:r>
     </w:p>
-    <w:bookmarkEnd w:id="62"/>
-    <w:bookmarkStart w:id="63" w:name="X0496ddaf3d6c15028ba200654bc9055e976f537"/>
+    <w:bookmarkEnd w:id="64"/>
+    <w:bookmarkStart w:id="65" w:name="X0496ddaf3d6c15028ba200654bc9055e976f537"/>
     <w:p>
       <w:pPr>
         <w:pStyle w:val="Heading3"/>
@@ -14973,8 +14973,8 @@
         <w:t xml:space="preserve">Codex sobre um diff, sem convocar o restante do painel.</w:t>
       </w:r>
     </w:p>
-    <w:bookmarkEnd w:id="63"/>
-    <w:bookmarkStart w:id="64" w:name="X4f10bcdca35a24c7c7913612c3dafb3349a8e05"/>
+    <w:bookmarkEnd w:id="65"/>
+    <w:bookmarkStart w:id="66" w:name="X4f10bcdca35a24c7c7913612c3dafb3349a8e05"/>
     <w:p>
       <w:pPr>
         <w:pStyle w:val="Heading3"/>
@@ -15136,8 +15136,8 @@
         <w:t xml:space="preserve">investigação de código. Agentes podem ser selecionados caso a caso.</w:t>
       </w:r>
     </w:p>
-    <w:bookmarkEnd w:id="64"/>
-    <w:bookmarkStart w:id="65" w:name="Xef4275135b49a3647e623bc7aa77ae2e54e16fd"/>
+    <w:bookmarkEnd w:id="66"/>
+    <w:bookmarkStart w:id="67" w:name="Xef4275135b49a3647e623bc7aa77ae2e54e16fd"/>
     <w:p>
       <w:pPr>
         <w:pStyle w:val="Heading3"/>
@@ -15331,8 +15331,8 @@
         <w:t xml:space="preserve">testes, Gemini pesquisa compatibilidade e Grok procura pressupostos frágeis.</w:t>
       </w:r>
     </w:p>
-    <w:bookmarkEnd w:id="65"/>
-    <w:bookmarkStart w:id="66" w:name="X867acc06008a605f7bfb8a9fb93c4e09fa763fc"/>
+    <w:bookmarkEnd w:id="67"/>
+    <w:bookmarkStart w:id="68" w:name="X867acc06008a605f7bfb8a9fb93c4e09fa763fc"/>
     <w:p>
       <w:pPr>
         <w:pStyle w:val="Heading3"/>
@@ -15444,8 +15444,8 @@
         <w:t xml:space="preserve">argumentos; não mantém versões de um documento nem aplica meta, piso ou auditoria.</w:t>
       </w:r>
     </w:p>
-    <w:bookmarkEnd w:id="66"/>
-    <w:bookmarkStart w:id="67" w:name="Xe15c3b9d61835e1f6c11fa08090e153647a7640"/>
+    <w:bookmarkEnd w:id="68"/>
+    <w:bookmarkStart w:id="69" w:name="Xe15c3b9d61835e1f6c11fa08090e153647a7640"/>
     <w:p>
       <w:pPr>
         <w:pStyle w:val="Heading3"/>
@@ -15622,8 +15622,8 @@
         <w:t xml:space="preserve">respostas válidas; o quórum pode ser configurado explicitamente.</w:t>
       </w:r>
     </w:p>
-    <w:bookmarkEnd w:id="67"/>
-    <w:bookmarkStart w:id="68" w:name="X4c4ed554bd92e96d1040a58b77fe0c435f4c32b"/>
+    <w:bookmarkEnd w:id="69"/>
+    <w:bookmarkStart w:id="70" w:name="X4c4ed554bd92e96d1040a58b77fe0c435f4c32b"/>
     <w:p>
       <w:pPr>
         <w:pStyle w:val="Heading3"/>
@@ -15897,9 +15897,9 @@
         <w:t xml:space="preserve">notas, consenso por versão ou auditoria cega.</w:t>
       </w:r>
     </w:p>
-    <w:bookmarkEnd w:id="68"/>
-    <w:bookmarkEnd w:id="69"/>
-    <w:bookmarkStart w:id="77" w:name="X94ebaba76df4b84025f8ff751cbf11e7ec23da0"/>
+    <w:bookmarkEnd w:id="70"/>
+    <w:bookmarkEnd w:id="71"/>
+    <w:bookmarkStart w:id="79" w:name="X94ebaba76df4b84025f8ff751cbf11e7ec23da0"/>
     <w:p>
       <w:pPr>
         <w:pStyle w:val="Heading2"/>
@@ -15914,7 +15914,7 @@
         <w:t xml:space="preserve">5. Conselhos, debates e consenso</w:t>
       </w:r>
     </w:p>
-    <w:bookmarkStart w:id="70" w:name="Xed3f7a83c917a261d8508846c04692d851ee017"/>
+    <w:bookmarkStart w:id="72" w:name="Xed3f7a83c917a261d8508846c04692d851ee017"/>
     <w:p>
       <w:pPr>
         <w:pStyle w:val="Heading3"/>
@@ -16198,8 +16198,8 @@
         <w:t xml:space="preserve">obter dados de produção.</w:t>
       </w:r>
     </w:p>
-    <w:bookmarkEnd w:id="70"/>
-    <w:bookmarkStart w:id="71" w:name="X100cedc92454110f051c1bddff0dc838e464fe0"/>
+    <w:bookmarkEnd w:id="72"/>
+    <w:bookmarkStart w:id="73" w:name="X100cedc92454110f051c1bddff0dc838e464fe0"/>
     <w:p>
       <w:pPr>
         <w:pStyle w:val="Heading3"/>
@@ -16647,8 +16647,8 @@
         <w:t xml:space="preserve">risco, sistemas, produto e execução.</w:t>
       </w:r>
     </w:p>
-    <w:bookmarkEnd w:id="71"/>
-    <w:bookmarkStart w:id="72" w:name="X4d63ba5f0cf2c0b5048abc9cfc08c00aada0f01"/>
+    <w:bookmarkEnd w:id="73"/>
+    <w:bookmarkStart w:id="74" w:name="X4d63ba5f0cf2c0b5048abc9cfc08c00aada0f01"/>
     <w:p>
       <w:pPr>
         <w:pStyle w:val="Heading3"/>
@@ -17000,8 +17000,8 @@
         <w:t xml:space="preserve">devem confrontar os mesmos arquivos.</w:t>
       </w:r>
     </w:p>
-    <w:bookmarkEnd w:id="72"/>
-    <w:bookmarkStart w:id="73" w:name="X30b9b13a1c06e1f88adf1d1832c95fe23641c17"/>
+    <w:bookmarkEnd w:id="74"/>
+    <w:bookmarkStart w:id="75" w:name="X30b9b13a1c06e1f88adf1d1832c95fe23641c17"/>
     <w:p>
       <w:pPr>
         <w:pStyle w:val="Heading3"/>
@@ -17170,8 +17170,8 @@
         <w:t xml:space="preserve">outro motor.</w:t>
       </w:r>
     </w:p>
-    <w:bookmarkEnd w:id="73"/>
-    <w:bookmarkStart w:id="74" w:name="Xf71e8c97f79e767f4b4034fcbe9d4cdd269be2d"/>
+    <w:bookmarkEnd w:id="75"/>
+    <w:bookmarkStart w:id="76" w:name="Xf71e8c97f79e767f4b4034fcbe9d4cdd269be2d"/>
     <w:p>
       <w:pPr>
         <w:pStyle w:val="Heading3"/>
@@ -17333,8 +17333,8 @@
         <w:t xml:space="preserve">.</w:t>
       </w:r>
     </w:p>
-    <w:bookmarkEnd w:id="74"/>
-    <w:bookmarkStart w:id="75" w:name="Xd149903390017f4a8b29266e7cfb57593f1d0a0"/>
+    <w:bookmarkEnd w:id="76"/>
+    <w:bookmarkStart w:id="77" w:name="Xd149903390017f4a8b29266e7cfb57593f1d0a0"/>
     <w:p>
       <w:pPr>
         <w:pStyle w:val="Heading3"/>
@@ -17503,8 +17503,8 @@
         <w:t xml:space="preserve">Não use o nome para presumir que outro motor pode substituí-lo.</w:t>
       </w:r>
     </w:p>
-    <w:bookmarkEnd w:id="75"/>
-    <w:bookmarkStart w:id="76" w:name="X0336074efeb06232e8f241b2dd2c165dcd48420"/>
+    <w:bookmarkEnd w:id="77"/>
+    <w:bookmarkStart w:id="78" w:name="X0336074efeb06232e8f241b2dd2c165dcd48420"/>
     <w:p>
       <w:pPr>
         <w:pStyle w:val="Heading3"/>
@@ -17842,9 +17842,9 @@
         <w:t xml:space="preserve">.</w:t>
       </w:r>
     </w:p>
-    <w:bookmarkEnd w:id="76"/>
-    <w:bookmarkEnd w:id="77"/>
-    <w:bookmarkStart w:id="98" w:name="Xa4ec0ebccce1c5c9353a50ac9545b19d513f023"/>
+    <w:bookmarkEnd w:id="78"/>
+    <w:bookmarkEnd w:id="79"/>
+    <w:bookmarkStart w:id="100" w:name="Xa4ec0ebccce1c5c9353a50ac9545b19d513f023"/>
     <w:p>
       <w:pPr>
         <w:pStyle w:val="Heading2"/>
@@ -17859,7 +17859,7 @@
         <w:t xml:space="preserve">6. Criação e aprovação de artefatos</w:t>
       </w:r>
     </w:p>
-    <w:bookmarkStart w:id="91" w:name="X618cf9ffb0a3a59627d363408599a7334e83426"/>
+    <w:bookmarkStart w:id="93" w:name="X618cf9ffb0a3a59627d363408599a7334e83426"/>
     <w:p>
       <w:pPr>
         <w:pStyle w:val="Heading3"/>
@@ -18808,7 +18808,7 @@
         <w:t xml:space="preserve">.</w:t>
       </w:r>
     </w:p>
-    <w:bookmarkStart w:id="81" w:name="um-artefato-ou-um-pacote"/>
+    <w:bookmarkStart w:id="83" w:name="um-artefato-ou-um-pacote"/>
     <w:p>
       <w:pPr>
         <w:pStyle w:val="Heading4"/>
@@ -18999,18 +18999,18 @@
           <wp:inline>
             <wp:extent cx="4139150" cy="6720840"/>
             <wp:effectExtent b="0" l="0" r="0" t="0"/>
-            <wp:docPr descr="Fluxo de consenso dentro do loop" title="" id="79" name="Picture"/>
+            <wp:docPr descr="Fluxo de consenso dentro do loop" title="" id="81" name="Picture"/>
             <a:graphic>
               <a:graphicData uri="http://schemas.openxmlformats.org/drawingml/2006/picture">
                 <pic:pic>
                   <pic:nvPicPr>
-                    <pic:cNvPr descr="diagramas-comandos-multiagente/04-consenso-loop.png" id="80" name="Picture"/>
+                    <pic:cNvPr descr="diagramas-comandos-multiagente/04-consenso-loop.png" id="82" name="Picture"/>
                     <pic:cNvPicPr>
                       <a:picLocks noChangeArrowheads="1" noChangeAspect="1"/>
                     </pic:cNvPicPr>
                   </pic:nvPicPr>
                   <pic:blipFill>
-                    <a:blip r:embed="rId78"/>
+                    <a:blip r:embed="rId80"/>
                     <a:stretch>
                       <a:fillRect/>
                     </a:stretch>
@@ -19055,8 +19055,8 @@
         <w:t xml:space="preserve">Figura 7 — Debate, correção e novo consenso sobre cada versão do artefato.</w:t>
       </w:r>
     </w:p>
-    <w:bookmarkEnd w:id="81"/>
-    <w:bookmarkStart w:id="88" w:name="ensemble-profundo-nn"/>
+    <w:bookmarkEnd w:id="83"/>
+    <w:bookmarkStart w:id="90" w:name="ensemble-profundo-nn"/>
     <w:p>
       <w:pPr>
         <w:pStyle w:val="Heading4"/>
@@ -19083,18 +19083,18 @@
           <wp:inline>
             <wp:extent cx="5715000" cy="1166325"/>
             <wp:effectExtent b="0" l="0" r="0" t="0"/>
-            <wp:docPr descr="Fluxo do ensemble N por N" title="" id="83" name="Picture"/>
+            <wp:docPr descr="Fluxo do ensemble N por N" title="" id="85" name="Picture"/>
             <a:graphic>
               <a:graphicData uri="http://schemas.openxmlformats.org/drawingml/2006/picture">
                 <pic:pic>
                   <pic:nvPicPr>
-                    <pic:cNvPr descr="diagramas-comandos-multiagente/05-ensemble-nxn.png" id="84" name="Picture"/>
+                    <pic:cNvPr descr="diagramas-comandos-multiagente/05-ensemble-nxn.png" id="86" name="Picture"/>
                     <pic:cNvPicPr>
                       <a:picLocks noChangeArrowheads="1" noChangeAspect="1"/>
                     </pic:cNvPicPr>
                   </pic:nvPicPr>
                   <pic:blipFill>
-                    <a:blip r:embed="rId82"/>
+                    <a:blip r:embed="rId84"/>
                     <a:stretch>
                       <a:fillRect/>
                     </a:stretch>
@@ -19152,18 +19152,18 @@
           <wp:inline>
             <wp:extent cx="5715000" cy="3310561"/>
             <wp:effectExtent b="0" l="0" r="0" t="0"/>
-            <wp:docPr descr="Ensemble profundo até o canônico" title="" id="86" name="Picture"/>
+            <wp:docPr descr="Ensemble profundo até o canônico" title="" id="88" name="Picture"/>
             <a:graphic>
               <a:graphicData uri="http://schemas.openxmlformats.org/drawingml/2006/picture">
                 <pic:pic>
                   <pic:nvPicPr>
-                    <pic:cNvPr descr="diagramas-comandos-multiagente/12-ensemble-consolidacao.png" id="87" name="Picture"/>
+                    <pic:cNvPr descr="diagramas-comandos-multiagente/12-ensemble-consolidacao.png" id="89" name="Picture"/>
                     <pic:cNvPicPr>
                       <a:picLocks noChangeArrowheads="1" noChangeAspect="1"/>
                     </pic:cNvPicPr>
                   </pic:nvPicPr>
                   <pic:blipFill>
-                    <a:blip r:embed="rId85"/>
+                    <a:blip r:embed="rId87"/>
                     <a:stretch>
                       <a:fillRect/>
                     </a:stretch>
@@ -21367,8 +21367,8 @@
         <w:t xml:space="preserve">chamadas efetivas, mas não elimina nenhuma das fases lógicas.</w:t>
       </w:r>
     </w:p>
-    <w:bookmarkEnd w:id="88"/>
-    <w:bookmarkStart w:id="89" w:name="quem-faz-as-correções"/>
+    <w:bookmarkEnd w:id="90"/>
+    <w:bookmarkStart w:id="91" w:name="quem-faz-as-correções"/>
     <w:p>
       <w:pPr>
         <w:pStyle w:val="Heading4"/>
@@ -21472,8 +21472,8 @@
         <w:t xml:space="preserve">original continua responsável pelas correções.</w:t>
       </w:r>
     </w:p>
-    <w:bookmarkEnd w:id="89"/>
-    <w:bookmarkStart w:id="90" w:name="duas-ou-mais-versões-finais"/>
+    <w:bookmarkEnd w:id="91"/>
+    <w:bookmarkStart w:id="92" w:name="duas-ou-mais-versões-finais"/>
     <w:p>
       <w:pPr>
         <w:pStyle w:val="Heading4"/>
@@ -21584,9 +21584,9 @@
         <w:t xml:space="preserve">pela auditoria antes de se tornar canônica.</w:t>
       </w:r>
     </w:p>
-    <w:bookmarkEnd w:id="90"/>
-    <w:bookmarkEnd w:id="91"/>
-    <w:bookmarkStart w:id="97" w:name="X32e143e51a34054b833abaa14549f8e536712e0"/>
+    <w:bookmarkEnd w:id="92"/>
+    <w:bookmarkEnd w:id="93"/>
+    <w:bookmarkStart w:id="99" w:name="X32e143e51a34054b833abaa14549f8e536712e0"/>
     <w:p>
       <w:pPr>
         <w:pStyle w:val="Heading3"/>
@@ -21731,7 +21731,7 @@
         <w:t xml:space="preserve">manifestação, despacho, decisão, sentença, voto ou pacote jurídico rastreável.</w:t>
       </w:r>
     </w:p>
-    <w:bookmarkStart w:id="95" w:name="receitas-automáticas-sem-novas-skills"/>
+    <w:bookmarkStart w:id="97" w:name="receitas-automáticas-sem-novas-skills"/>
     <w:p>
       <w:pPr>
         <w:pStyle w:val="Heading4"/>
@@ -23681,18 +23681,18 @@
           <wp:inline>
             <wp:extent cx="3108904" cy="6720840"/>
             <wp:effectExtent b="0" l="0" r="0" t="0"/>
-            <wp:docPr descr="Fluxo de redação jurídica consensual" title="" id="93" name="Picture"/>
+            <wp:docPr descr="Fluxo de redação jurídica consensual" title="" id="95" name="Picture"/>
             <a:graphic>
               <a:graphicData uri="http://schemas.openxmlformats.org/drawingml/2006/picture">
                 <pic:pic>
                   <pic:nvPicPr>
-                    <pic:cNvPr descr="diagramas-comandos-multiagente/08-redacao-juridica.png" id="94" name="Picture"/>
+                    <pic:cNvPr descr="diagramas-comandos-multiagente/08-redacao-juridica.png" id="96" name="Picture"/>
                     <pic:cNvPicPr>
                       <a:picLocks noChangeArrowheads="1" noChangeAspect="1"/>
                     </pic:cNvPicPr>
                   </pic:nvPicPr>
                   <pic:blipFill>
-                    <a:blip r:embed="rId92"/>
+                    <a:blip r:embed="rId94"/>
                     <a:stretch>
                       <a:fillRect/>
                     </a:stretch>
@@ -24051,8 +24051,8 @@
         <w:t xml:space="preserve">pacote.</w:t>
       </w:r>
     </w:p>
-    <w:bookmarkEnd w:id="95"/>
-    <w:bookmarkStart w:id="96" w:name="Xb77eca6ef9e37e87050dc80b472a9319e61a51a"/>
+    <w:bookmarkEnd w:id="97"/>
+    <w:bookmarkStart w:id="98" w:name="Xb77eca6ef9e37e87050dc80b472a9319e61a51a"/>
     <w:p>
       <w:pPr>
         <w:pStyle w:val="Heading4"/>
@@ -25359,10 +25359,10 @@
         <w:t xml:space="preserve">na minuta.</w:t>
       </w:r>
     </w:p>
-    <w:bookmarkEnd w:id="96"/>
-    <w:bookmarkEnd w:id="97"/>
     <w:bookmarkEnd w:id="98"/>
-    <w:bookmarkStart w:id="113" w:name="Xf8bd077b9f3090ed974dd71cf1d388f4881b567"/>
+    <w:bookmarkEnd w:id="99"/>
+    <w:bookmarkEnd w:id="100"/>
+    <w:bookmarkStart w:id="115" w:name="Xf8bd077b9f3090ed974dd71cf1d388f4881b567"/>
     <w:p>
       <w:pPr>
         <w:pStyle w:val="Heading2"/>
@@ -25439,18 +25439,18 @@
           <wp:inline>
             <wp:extent cx="5715000" cy="2361810"/>
             <wp:effectExtent b="0" l="0" r="0" t="0"/>
-            <wp:docPr descr="Mapa dos workflows formais" title="" id="100" name="Picture"/>
+            <wp:docPr descr="Mapa dos workflows formais" title="" id="102" name="Picture"/>
             <a:graphic>
               <a:graphicData uri="http://schemas.openxmlformats.org/drawingml/2006/picture">
                 <pic:pic>
                   <pic:nvPicPr>
-                    <pic:cNvPr descr="diagramas-comandos-multiagente/06-workflows.png" id="101" name="Picture"/>
+                    <pic:cNvPr descr="diagramas-comandos-multiagente/06-workflows.png" id="103" name="Picture"/>
                     <pic:cNvPicPr>
                       <a:picLocks noChangeArrowheads="1" noChangeAspect="1"/>
                     </pic:cNvPicPr>
                   </pic:nvPicPr>
                   <pic:blipFill>
-                    <a:blip r:embed="rId99"/>
+                    <a:blip r:embed="rId101"/>
                     <a:stretch>
                       <a:fillRect/>
                     </a:stretch>
@@ -25495,7 +25495,7 @@
         <w:t xml:space="preserve">Figura 11 — Protocolos formais disponíveis para organizar o trabalho multiagente.</w:t>
       </w:r>
     </w:p>
-    <w:bookmarkStart w:id="102" w:name="X36ea6a046ec6115b6616d0827874b0966014537"/>
+    <w:bookmarkStart w:id="104" w:name="X36ea6a046ec6115b6616d0827874b0966014537"/>
     <w:p>
       <w:pPr>
         <w:pStyle w:val="Heading3"/>
@@ -25639,8 +25639,8 @@
         <w:t xml:space="preserve">paralelismo, limites e integração com o loop antes de executar.</w:t>
       </w:r>
     </w:p>
-    <w:bookmarkEnd w:id="102"/>
-    <w:bookmarkStart w:id="103" w:name="X0c37b730a687346266258d62512a41e5ff97fca"/>
+    <w:bookmarkEnd w:id="104"/>
+    <w:bookmarkStart w:id="105" w:name="X0c37b730a687346266258d62512a41e5ff97fca"/>
     <w:p>
       <w:pPr>
         <w:pStyle w:val="Heading3"/>
@@ -25850,8 +25850,8 @@
         <w:t xml:space="preserve">handoffs auditáveis.</w:t>
       </w:r>
     </w:p>
-    <w:bookmarkEnd w:id="103"/>
-    <w:bookmarkStart w:id="104" w:name="Xf06e994f1ea5339de242835bfb4881214148f52"/>
+    <w:bookmarkEnd w:id="105"/>
+    <w:bookmarkStart w:id="106" w:name="Xf06e994f1ea5339de242835bfb4881214148f52"/>
     <w:p>
       <w:pPr>
         <w:pStyle w:val="Heading3"/>
@@ -26062,8 +26062,8 @@
         <w:t xml:space="preserve">implementação única.</w:t>
       </w:r>
     </w:p>
-    <w:bookmarkEnd w:id="104"/>
-    <w:bookmarkStart w:id="105" w:name="X4f87cb3daeaedffadab227bcf3aebc14108d74b"/>
+    <w:bookmarkEnd w:id="106"/>
+    <w:bookmarkStart w:id="107" w:name="X4f87cb3daeaedffadab227bcf3aebc14108d74b"/>
     <w:p>
       <w:pPr>
         <w:pStyle w:val="Heading3"/>
@@ -26289,8 +26289,8 @@
         <w:t xml:space="preserve">necessárias conforme surgem evidências.</w:t>
       </w:r>
     </w:p>
-    <w:bookmarkEnd w:id="105"/>
-    <w:bookmarkStart w:id="106" w:name="Xec09126e297b3e2e325d9c84ba2e328704c4978"/>
+    <w:bookmarkEnd w:id="107"/>
+    <w:bookmarkStart w:id="108" w:name="Xec09126e297b3e2e325d9c84ba2e328704c4978"/>
     <w:p>
       <w:pPr>
         <w:pStyle w:val="Heading3"/>
@@ -26516,8 +26516,8 @@
         <w:t xml:space="preserve">de contratos.</w:t>
       </w:r>
     </w:p>
-    <w:bookmarkEnd w:id="106"/>
-    <w:bookmarkStart w:id="107" w:name="X8aebf27ab794af8facb2f04ad3f61b23997fd46"/>
+    <w:bookmarkEnd w:id="108"/>
+    <w:bookmarkStart w:id="109" w:name="X8aebf27ab794af8facb2f04ad3f61b23997fd46"/>
     <w:p>
       <w:pPr>
         <w:pStyle w:val="Heading3"/>
@@ -26761,8 +26761,8 @@
         <w:t xml:space="preserve">forma independente.</w:t>
       </w:r>
     </w:p>
-    <w:bookmarkEnd w:id="107"/>
-    <w:bookmarkStart w:id="111" w:name="X749906d43b6a6b69035ed9532b65ffb0c20d65f"/>
+    <w:bookmarkEnd w:id="109"/>
+    <w:bookmarkStart w:id="113" w:name="X749906d43b6a6b69035ed9532b65ffb0c20d65f"/>
     <w:p>
       <w:pPr>
         <w:pStyle w:val="Heading3"/>
@@ -26825,7 +26825,7 @@
         <w:t xml:space="preserve">agregar preferências por Borda, Condorcet ou Delphi.</w:t>
       </w:r>
     </w:p>
-    <w:bookmarkStart w:id="108" w:name="borda"/>
+    <w:bookmarkStart w:id="110" w:name="borda"/>
     <w:p>
       <w:pPr>
         <w:pStyle w:val="Heading4"/>
@@ -26888,8 +26888,8 @@
         <w:t xml:space="preserve">Claude, Codex e Gemini. Oculte autoria e use Kimi no desempate.</w:t>
       </w:r>
     </w:p>
-    <w:bookmarkEnd w:id="108"/>
-    <w:bookmarkStart w:id="109" w:name="condorcet"/>
+    <w:bookmarkEnd w:id="110"/>
+    <w:bookmarkStart w:id="111" w:name="condorcet"/>
     <w:p>
       <w:pPr>
         <w:pStyle w:val="Heading4"/>
@@ -26952,8 +26952,8 @@
         <w:t xml:space="preserve">vencedor; devolva a matriz e aguarde escolha humana.</w:t>
       </w:r>
     </w:p>
-    <w:bookmarkEnd w:id="109"/>
-    <w:bookmarkStart w:id="110" w:name="delphi"/>
+    <w:bookmarkEnd w:id="111"/>
+    <w:bookmarkStart w:id="112" w:name="delphi"/>
     <w:p>
       <w:pPr>
         <w:pStyle w:val="Heading4"/>
@@ -27398,9 +27398,9 @@
         <w:t xml:space="preserve">separados. São etapas combináveis, não métodos rivais.</w:t>
       </w:r>
     </w:p>
-    <w:bookmarkEnd w:id="110"/>
-    <w:bookmarkEnd w:id="111"/>
-    <w:bookmarkStart w:id="112" w:name="X222536faf40c5ad6bca88d75d1f29ee460350ef"/>
+    <w:bookmarkEnd w:id="112"/>
+    <w:bookmarkEnd w:id="113"/>
+    <w:bookmarkStart w:id="114" w:name="X222536faf40c5ad6bca88d75d1f29ee460350ef"/>
     <w:p>
       <w:pPr>
         <w:pStyle w:val="Heading3"/>
@@ -27676,9 +27676,9 @@
         <w:t xml:space="preserve">o modelo no meio de uma resposta.</w:t>
       </w:r>
     </w:p>
-    <w:bookmarkEnd w:id="112"/>
-    <w:bookmarkEnd w:id="113"/>
-    <w:bookmarkStart w:id="121" w:name="X2621f1eb1ef0652bdbef3ca7978433bd1fc6ee3"/>
+    <w:bookmarkEnd w:id="114"/>
+    <w:bookmarkEnd w:id="115"/>
+    <w:bookmarkStart w:id="123" w:name="X2621f1eb1ef0652bdbef3ca7978433bd1fc6ee3"/>
     <w:p>
       <w:pPr>
         <w:pStyle w:val="Heading2"/>
@@ -27747,18 +27747,18 @@
           <wp:inline>
             <wp:extent cx="5715000" cy="4964176"/>
             <wp:effectExtent b="0" l="0" r="0" t="0"/>
-            <wp:docPr descr="Ciclo de vida das sessões do Council" title="" id="115" name="Picture"/>
+            <wp:docPr descr="Ciclo de vida das sessões do Council" title="" id="117" name="Picture"/>
             <a:graphic>
               <a:graphicData uri="http://schemas.openxmlformats.org/drawingml/2006/picture">
                 <pic:pic>
                   <pic:nvPicPr>
-                    <pic:cNvPr descr="diagramas-comandos-multiagente/07-historico-council.png" id="116" name="Picture"/>
+                    <pic:cNvPr descr="diagramas-comandos-multiagente/07-historico-council.png" id="118" name="Picture"/>
                     <pic:cNvPicPr>
                       <a:picLocks noChangeArrowheads="1" noChangeAspect="1"/>
                     </pic:cNvPicPr>
                   </pic:nvPicPr>
                   <pic:blipFill>
-                    <a:blip r:embed="rId114"/>
+                    <a:blip r:embed="rId116"/>
                     <a:stretch>
                       <a:fillRect/>
                     </a:stretch>
@@ -27803,7 +27803,7 @@
         <w:t xml:space="preserve">Figura 12 — Persistência, retomada, replay e encerramento de sessões do Council.</w:t>
       </w:r>
     </w:p>
-    <w:bookmarkStart w:id="117" w:name="X489282723d11dd2dcac1229bd8fc614e323769a"/>
+    <w:bookmarkStart w:id="119" w:name="X489282723d11dd2dcac1229bd8fc614e323769a"/>
     <w:p>
       <w:pPr>
         <w:pStyle w:val="Heading3"/>
@@ -27897,8 +27897,8 @@
         <w:t xml:space="preserve">/council-list autenticação</w:t>
       </w:r>
     </w:p>
-    <w:bookmarkEnd w:id="117"/>
-    <w:bookmarkStart w:id="118" w:name="Xc1d1d4926778c7d380308316e6b0024952fcaab"/>
+    <w:bookmarkEnd w:id="119"/>
+    <w:bookmarkStart w:id="120" w:name="Xc1d1d4926778c7d380308316e6b0024952fcaab"/>
     <w:p>
       <w:pPr>
         <w:pStyle w:val="Heading3"/>
@@ -27992,8 +27992,8 @@
         <w:t xml:space="preserve">novo.</w:t>
       </w:r>
     </w:p>
-    <w:bookmarkEnd w:id="118"/>
-    <w:bookmarkStart w:id="119" w:name="Xbdc84c9a617c62ec7e0b6fd0c5aa6cd53688fd1"/>
+    <w:bookmarkEnd w:id="120"/>
+    <w:bookmarkStart w:id="121" w:name="Xbdc84c9a617c62ec7e0b6fd0c5aa6cd53688fd1"/>
     <w:p>
       <w:pPr>
         <w:pStyle w:val="Heading3"/>
@@ -28121,8 +28121,8 @@
         <w:t xml:space="preserve">ainda se sustenta.</w:t>
       </w:r>
     </w:p>
-    <w:bookmarkEnd w:id="119"/>
-    <w:bookmarkStart w:id="120" w:name="Xf6b74b3cb13b20e60810888def6c3cd891a7e5e"/>
+    <w:bookmarkEnd w:id="121"/>
+    <w:bookmarkStart w:id="122" w:name="Xf6b74b3cb13b20e60810888def6c3cd891a7e5e"/>
     <w:p>
       <w:pPr>
         <w:pStyle w:val="Heading3"/>
@@ -28216,9 +28216,9 @@
         <w:t xml:space="preserve">O resultado fica associado à sessão e aparece no visualizador.</w:t>
       </w:r>
     </w:p>
-    <w:bookmarkEnd w:id="120"/>
-    <w:bookmarkEnd w:id="121"/>
-    <w:bookmarkStart w:id="122" w:name="Xde38c231f395add9f5c3eacea05cefadda5baa1"/>
+    <w:bookmarkEnd w:id="122"/>
+    <w:bookmarkEnd w:id="123"/>
+    <w:bookmarkStart w:id="124" w:name="Xde38c231f395add9f5c3eacea05cefadda5baa1"/>
     <w:p>
       <w:pPr>
         <w:pStyle w:val="Heading2"/>
@@ -29788,8 +29788,8 @@
         <w:t xml:space="preserve"> provider list</w:t>
       </w:r>
     </w:p>
-    <w:bookmarkEnd w:id="122"/>
-    <w:bookmarkStart w:id="133" w:name="X0dd2f60d3fcca416ac915e019870f769ab2271a"/>
+    <w:bookmarkEnd w:id="124"/>
+    <w:bookmarkStart w:id="135" w:name="X0dd2f60d3fcca416ac915e019870f769ab2271a"/>
     <w:p>
       <w:pPr>
         <w:pStyle w:val="Heading2"/>
@@ -29804,7 +29804,7 @@
         <w:t xml:space="preserve">10. Receitas completas</w:t>
       </w:r>
     </w:p>
-    <w:bookmarkStart w:id="123" w:name="X60f29b916df2a5ebfcba893454a24c16b8f8f0d"/>
+    <w:bookmarkStart w:id="125" w:name="X60f29b916df2a5ebfcba893454a24c16b8f8f0d"/>
     <w:p>
       <w:pPr>
         <w:pStyle w:val="Heading3"/>
@@ -29916,8 +29916,8 @@
         <w:t xml:space="preserve">no repositório sustentam cada uma.</w:t>
       </w:r>
     </w:p>
-    <w:bookmarkEnd w:id="123"/>
-    <w:bookmarkStart w:id="124" w:name="X283b43de62a37acfddb43488e5aaee2f12e146d"/>
+    <w:bookmarkEnd w:id="125"/>
+    <w:bookmarkStart w:id="126" w:name="X283b43de62a37acfddb43488e5aaee2f12e146d"/>
     <w:p>
       <w:pPr>
         <w:pStyle w:val="Heading3"/>
@@ -30028,8 +30028,8 @@
         <w:t xml:space="preserve">notas, auditoria e dissensos remanescentes.</w:t>
       </w:r>
     </w:p>
-    <w:bookmarkEnd w:id="124"/>
-    <w:bookmarkStart w:id="125" w:name="X3b4add7fd6a1831e66354fe1e41bee378774eea"/>
+    <w:bookmarkEnd w:id="126"/>
+    <w:bookmarkStart w:id="127" w:name="X3b4add7fd6a1831e66354fe1e41bee378774eea"/>
     <w:p>
       <w:pPr>
         <w:pStyle w:val="Heading3"/>
@@ -30140,8 +30140,8 @@
         <w:t xml:space="preserve">invente precedente.</w:t>
       </w:r>
     </w:p>
-    <w:bookmarkEnd w:id="125"/>
-    <w:bookmarkStart w:id="126" w:name="X0e5dd61b77f5b758b8292e64c2fd602cf0e5c8e"/>
+    <w:bookmarkEnd w:id="127"/>
+    <w:bookmarkStart w:id="128" w:name="X0e5dd61b77f5b758b8292e64c2fd602cf0e5c8e"/>
     <w:p>
       <w:pPr>
         <w:pStyle w:val="Heading3"/>
@@ -30220,8 +30220,8 @@
         <w:t xml:space="preserve">cobertura. Encaminhe a candidata ao loop somente se houver correções propostas.</w:t>
       </w:r>
     </w:p>
-    <w:bookmarkEnd w:id="126"/>
-    <w:bookmarkStart w:id="127" w:name="X7494c250ea4eb1d0a3c009ff75b21b3690b71e7"/>
+    <w:bookmarkEnd w:id="128"/>
+    <w:bookmarkStart w:id="129" w:name="X7494c250ea4eb1d0a3c009ff75b21b3690b71e7"/>
     <w:p>
       <w:pPr>
         <w:pStyle w:val="Heading3"/>
@@ -30300,8 +30300,8 @@
         <w:t xml:space="preserve">cega. Preserve todas as candidatas e não confunda seleção com aprovação.</w:t>
       </w:r>
     </w:p>
-    <w:bookmarkEnd w:id="127"/>
-    <w:bookmarkStart w:id="128" w:name="X70ee7b0144d1067abd90bd0aa4db60076ab5ce3"/>
+    <w:bookmarkEnd w:id="129"/>
+    <w:bookmarkStart w:id="130" w:name="X70ee7b0144d1067abd90bd0aa4db60076ab5ce3"/>
     <w:p>
       <w:pPr>
         <w:pStyle w:val="Heading3"/>
@@ -30380,8 +30380,8 @@
         <w:t xml:space="preserve">documentação de Claude. Gemini audita o join final.</w:t>
       </w:r>
     </w:p>
-    <w:bookmarkEnd w:id="128"/>
-    <w:bookmarkStart w:id="129" w:name="Xfb75fc45793b7bb26d1b2326c47e18217407ed6"/>
+    <w:bookmarkEnd w:id="130"/>
+    <w:bookmarkStart w:id="131" w:name="Xfb75fc45793b7bb26d1b2326c47e18217407ed6"/>
     <w:p>
       <w:pPr>
         <w:pStyle w:val="Heading3"/>
@@ -30476,8 +30476,8 @@
         <w:t xml:space="preserve">avaliação e a auditoria no hash escolhido.</w:t>
       </w:r>
     </w:p>
-    <w:bookmarkEnd w:id="129"/>
-    <w:bookmarkStart w:id="130" w:name="X1f823e63a34c529d8e050fc76a6d701814507c2"/>
+    <w:bookmarkEnd w:id="131"/>
+    <w:bookmarkStart w:id="132" w:name="X1f823e63a34c529d8e050fc76a6d701814507c2"/>
     <w:p>
       <w:pPr>
         <w:pStyle w:val="Heading3"/>
@@ -30684,8 +30684,8 @@
         <w:t xml:space="preserve">gates, um artefato canônico aprovado.</w:t>
       </w:r>
     </w:p>
-    <w:bookmarkEnd w:id="130"/>
-    <w:bookmarkStart w:id="131" w:name="Xf0d6f6a82ddacc7691db6fe42c7a84183ea7726"/>
+    <w:bookmarkEnd w:id="132"/>
+    <w:bookmarkStart w:id="133" w:name="Xf0d6f6a82ddacc7691db6fe42c7a84183ea7726"/>
     <w:p>
       <w:pPr>
         <w:pStyle w:val="Heading3"/>
@@ -32961,8 +32961,8 @@
         <w:t xml:space="preserve">confirmação explícita.</w:t>
       </w:r>
     </w:p>
-    <w:bookmarkEnd w:id="131"/>
-    <w:bookmarkStart w:id="132" w:name="X190dd2cf08ecb65aa153e8036234b5980ed3ad6"/>
+    <w:bookmarkEnd w:id="133"/>
+    <w:bookmarkStart w:id="134" w:name="X190dd2cf08ecb65aa153e8036234b5980ed3ad6"/>
     <w:p>
       <w:pPr>
         <w:pStyle w:val="Heading3"/>
@@ -35433,9 +35433,9 @@
         <w:t xml:space="preserve">saídas. Aguarde minha confirmação explícita.</w:t>
       </w:r>
     </w:p>
-    <w:bookmarkEnd w:id="132"/>
-    <w:bookmarkEnd w:id="133"/>
-    <w:bookmarkStart w:id="144" w:name="Xceda5c03b08b8d727090b76aef9edb789dfd9b3"/>
+    <w:bookmarkEnd w:id="134"/>
+    <w:bookmarkEnd w:id="135"/>
+    <w:bookmarkStart w:id="146" w:name="Xceda5c03b08b8d727090b76aef9edb789dfd9b3"/>
     <w:p>
       <w:pPr>
         <w:pStyle w:val="Heading2"/>
@@ -35450,7 +35450,7 @@
         <w:t xml:space="preserve">11. Limites, falhas e solução de problemas</w:t>
       </w:r>
     </w:p>
-    <w:bookmarkStart w:id="134" w:name="o-comando-não-aparece"/>
+    <w:bookmarkStart w:id="136" w:name="o-comando-não-aparece"/>
     <w:p>
       <w:pPr>
         <w:pStyle w:val="Heading3"/>
@@ -35496,8 +35496,8 @@
         <w:t xml:space="preserve">que você está usando a instalação e o perfil corretos do CLI.</w:t>
       </w:r>
     </w:p>
-    <w:bookmarkEnd w:id="134"/>
-    <w:bookmarkStart w:id="135" w:name="um-mcp-está-indisponível"/>
+    <w:bookmarkEnd w:id="136"/>
+    <w:bookmarkStart w:id="137" w:name="um-mcp-está-indisponível"/>
     <w:p>
       <w:pPr>
         <w:pStyle w:val="Heading3"/>
@@ -35659,8 +35659,8 @@
         <w:t xml:space="preserve">não devem mudar de motor silenciosamente.</w:t>
       </w:r>
     </w:p>
-    <w:bookmarkEnd w:id="135"/>
-    <w:bookmarkStart w:id="136" w:name="um-modelo-do-opencode-não-responde"/>
+    <w:bookmarkEnd w:id="137"/>
+    <w:bookmarkStart w:id="138" w:name="um-modelo-do-opencode-não-responde"/>
     <w:p>
       <w:pPr>
         <w:pStyle w:val="Heading3"/>
@@ -35722,8 +35722,8 @@
         <w:t xml:space="preserve">conta atual.</w:t>
       </w:r>
     </w:p>
-    <w:bookmarkEnd w:id="136"/>
-    <w:bookmarkStart w:id="137" w:name="o-documento-mudou-depois-da-aprovação"/>
+    <w:bookmarkEnd w:id="138"/>
+    <w:bookmarkStart w:id="139" w:name="o-documento-mudou-depois-da-aprovação"/>
     <w:p>
       <w:pPr>
         <w:pStyle w:val="Heading3"/>
@@ -35785,8 +35785,8 @@
         <w:t xml:space="preserve">reabra também os dependentes materialmente afetados, não os itens independentes.</w:t>
       </w:r>
     </w:p>
-    <w:bookmarkEnd w:id="137"/>
-    <w:bookmarkStart w:id="138" w:name="o-comparativo-do-word-não-foi-gerado"/>
+    <w:bookmarkEnd w:id="139"/>
+    <w:bookmarkStart w:id="140" w:name="o-comparativo-do-word-não-foi-gerado"/>
     <w:p>
       <w:pPr>
         <w:pStyle w:val="Heading3"/>
@@ -35978,8 +35978,8 @@
         <w:t xml:space="preserve">devem ser resolvidas e salvas como DOCX limpo antes de nova comparação.</w:t>
       </w:r>
     </w:p>
-    <w:bookmarkEnd w:id="138"/>
-    <w:bookmarkStart w:id="139" w:name="editei-a-cópia-com-alterações-no-word"/>
+    <w:bookmarkEnd w:id="140"/>
+    <w:bookmarkStart w:id="141" w:name="editei-a-cópia-com-alterações-no-word"/>
     <w:p>
       <w:pPr>
         <w:pStyle w:val="Heading3"/>
@@ -36057,8 +36057,8 @@
         <w:t xml:space="preserve">alterações nunca substitui silenciosamente o canônico limpo.</w:t>
       </w:r>
     </w:p>
-    <w:bookmarkEnd w:id="139"/>
-    <w:bookmarkStart w:id="140" w:name="o-painel-não-chegou-a-consenso"/>
+    <w:bookmarkEnd w:id="141"/>
+    <w:bookmarkStart w:id="142" w:name="o-painel-não-chegou-a-consenso"/>
     <w:p>
       <w:pPr>
         <w:pStyle w:val="Heading3"/>
@@ -36368,8 +36368,8 @@
         <w:t xml:space="preserve">divergência em consenso estrito.</w:t>
       </w:r>
     </w:p>
-    <w:bookmarkEnd w:id="140"/>
-    <w:bookmarkStart w:id="141" w:name="houve-maioria-mas-não-existe-ratio-comum"/>
+    <w:bookmarkEnd w:id="142"/>
+    <w:bookmarkStart w:id="143" w:name="houve-maioria-mas-não-existe-ratio-comum"/>
     <w:p>
       <w:pPr>
         <w:pStyle w:val="Heading3"/>
@@ -36472,8 +36472,8 @@
         <w:t xml:space="preserve">rótulo de consenso.</w:t>
       </w:r>
     </w:p>
-    <w:bookmarkEnd w:id="141"/>
-    <w:bookmarkStart w:id="142" w:name="custos-e-tempo-cresceram-demais"/>
+    <w:bookmarkEnd w:id="143"/>
+    <w:bookmarkStart w:id="144" w:name="custos-e-tempo-cresceram-demais"/>
     <w:p>
       <w:pPr>
         <w:pStyle w:val="Heading3"/>
@@ -36593,8 +36593,8 @@
         <w:t xml:space="preserve">por ciclo.</w:t>
       </w:r>
     </w:p>
-    <w:bookmarkEnd w:id="142"/>
-    <w:bookmarkStart w:id="143" w:name="segurança-de-arquivos-locais"/>
+    <w:bookmarkEnd w:id="144"/>
+    <w:bookmarkStart w:id="145" w:name="segurança-de-arquivos-locais"/>
     <w:p>
       <w:pPr>
         <w:pStyle w:val="Heading3"/>
@@ -36681,9 +36681,9 @@
         <w:t xml:space="preserve">sigilosos em prompts enviados a provedores não autorizados.</w:t>
       </w:r>
     </w:p>
-    <w:bookmarkEnd w:id="143"/>
-    <w:bookmarkEnd w:id="144"/>
-    <w:bookmarkStart w:id="145" w:name="X47ecb5644ff48162425c9b9e85cd800ccf52a9f"/>
+    <w:bookmarkEnd w:id="145"/>
+    <w:bookmarkEnd w:id="146"/>
+    <w:bookmarkStart w:id="147" w:name="X47ecb5644ff48162425c9b9e85cd800ccf52a9f"/>
     <w:p>
       <w:pPr>
         <w:pStyle w:val="Heading2"/>
@@ -38722,8 +38722,8 @@
         </w:tc>
       </w:tr>
     </w:tbl>
-    <w:bookmarkEnd w:id="145"/>
-    <w:bookmarkStart w:id="151" w:name="X45c3b78d603c0eeea63251a8ee629cd0423f08a"/>
+    <w:bookmarkEnd w:id="147"/>
+    <w:bookmarkStart w:id="153" w:name="X45c3b78d603c0eeea63251a8ee629cd0423f08a"/>
     <w:p>
       <w:pPr>
         <w:pStyle w:val="Heading2"/>
@@ -38738,7 +38738,7 @@
         <w:t xml:space="preserve">13. Uso no Claude Cowork</w:t>
       </w:r>
     </w:p>
-    <w:bookmarkStart w:id="146" w:name="X66defe96cf8f3bc532082ff913fcf22e66ab664"/>
+    <w:bookmarkStart w:id="148" w:name="X66defe96cf8f3bc532082ff913fcf22e66ab664"/>
     <w:p>
       <w:pPr>
         <w:pStyle w:val="Heading3"/>
@@ -39029,8 +39029,8 @@
         <w:t xml:space="preserve">.</w:t>
       </w:r>
     </w:p>
-    <w:bookmarkEnd w:id="146"/>
-    <w:bookmarkStart w:id="147" w:name="X4a38bad67bbc539642f90d4f5cd2bd32786f54d"/>
+    <w:bookmarkEnd w:id="148"/>
+    <w:bookmarkStart w:id="149" w:name="X4a38bad67bbc539642f90d4f5cd2bd32786f54d"/>
     <w:p>
       <w:pPr>
         <w:pStyle w:val="Heading3"/>
@@ -39525,8 +39525,8 @@
         <w:t xml:space="preserve">--deep</w:t>
       </w:r>
     </w:p>
-    <w:bookmarkEnd w:id="147"/>
-    <w:bookmarkStart w:id="148" w:name="X464af9c21609fd53319565bd86f2960ab965a4d"/>
+    <w:bookmarkEnd w:id="149"/>
+    <w:bookmarkStart w:id="150" w:name="X464af9c21609fd53319565bd86f2960ab965a4d"/>
     <w:p>
       <w:pPr>
         <w:pStyle w:val="Heading3"/>
@@ -39774,8 +39774,8 @@
         <w:t xml:space="preserve">.</w:t>
       </w:r>
     </w:p>
-    <w:bookmarkEnd w:id="148"/>
-    <w:bookmarkStart w:id="149" w:name="X73761d4bad6399085ad6d882508c16b62ef8210"/>
+    <w:bookmarkEnd w:id="150"/>
+    <w:bookmarkStart w:id="151" w:name="X73761d4bad6399085ad6d882508c16b62ef8210"/>
     <w:p>
       <w:pPr>
         <w:pStyle w:val="Heading3"/>
@@ -40008,8 +40008,8 @@
         <w:t xml:space="preserve">há substituição silenciosa.</w:t>
       </w:r>
     </w:p>
-    <w:bookmarkEnd w:id="149"/>
-    <w:bookmarkStart w:id="150" w:name="X596f6c93ee2511f1cbb1f494c0174cb56a42ada"/>
+    <w:bookmarkEnd w:id="151"/>
+    <w:bookmarkStart w:id="152" w:name="X596f6c93ee2511f1cbb1f494c0174cb56a42ada"/>
     <w:p>
       <w:pPr>
         <w:pStyle w:val="Heading3"/>
@@ -40679,9 +40679,9 @@
         <w:t xml:space="preserve">mesma conta.</w:t>
       </w:r>
     </w:p>
-    <w:bookmarkEnd w:id="150"/>
-    <w:bookmarkEnd w:id="151"/>
-    <w:bookmarkStart w:id="152" w:name="Xbb34652e63d407bf15197bae95a6b32b576a2e0"/>
+    <w:bookmarkEnd w:id="152"/>
+    <w:bookmarkEnd w:id="153"/>
+    <w:bookmarkStart w:id="154" w:name="Xbb34652e63d407bf15197bae95a6b32b576a2e0"/>
     <w:p>
       <w:pPr>
         <w:pStyle w:val="Heading2"/>
@@ -41621,8 +41621,8 @@
         <w:t xml:space="preserve">manualmente no Claude Cowork.</w:t>
       </w:r>
     </w:p>
-    <w:bookmarkEnd w:id="152"/>
-    <w:bookmarkStart w:id="153" w:name="apêndice-localização-e-artefatos"/>
+    <w:bookmarkEnd w:id="154"/>
+    <w:bookmarkStart w:id="155" w:name="apêndice-localização-e-artefatos"/>
     <w:p>
       <w:pPr>
         <w:pStyle w:val="Heading2"/>
@@ -41774,13 +41774,15 @@
         <w:t xml:space="preserve">.</w:t>
       </w:r>
     </w:p>
-    <w:bookmarkEnd w:id="153"/>
-    <w:bookmarkEnd w:id="154"/>
+    <w:bookmarkEnd w:id="155"/>
+    <w:bookmarkEnd w:id="156"/>
     <w:sectPr>
       <w:headerReference r:id="rId9" w:type="first"/>
       <w:footerReference r:id="rId10" w:type="first"/>
       <w:headerReference r:id="rId11" w:type="default"/>
-      <w:footerReference r:id="rId12" w:type="default"/>
+      <w:headerReference r:id="rId12" w:type="even"/>
+      <w:footerReference r:id="rId13" w:type="default"/>
+      <w:footerReference r:id="rId14" w:type="even"/>
       <w:pgSz w:h="15840" w:w="12240"/>
       <w:pgMar w:bottom="1440" w:footer="648" w:gutter="0" w:header="648" w:left="1440" w:right="1440" w:top="1440"/>
       <w:cols w:space="720"/>
@@ -41816,16 +41818,32 @@
       <w:rPr>
         <w:rFonts w:ascii="Lato" w:hAnsi="Lato" w:eastAsia="Lato" w:cs="Lato"/>
         <w:color w:val="4B5563"/>
-        <w:sz w:val="19"/>
+        <w:sz w:val="24"/>
+        <w:szCs w:val="24"/>
       </w:rPr>
       <w:t xml:space="preserve">Edição 16  •  Agosto de 2026  •  Página </w:t>
     </w:r>
     <w:r>
+      <w:rPr>
+        <w:rFonts w:ascii="Lato" w:hAnsi="Lato" w:eastAsia="Lato" w:cs="Lato"/>
+        <w:sz w:val="24"/>
+        <w:szCs w:val="24"/>
+      </w:rPr>
       <w:fldChar w:fldCharType="begin"/>
       <w:instrText xml:space="preserve">PAGE</w:instrText>
       <w:fldChar w:fldCharType="separate"/>
       <w:fldChar w:fldCharType="end"/>
     </w:r>
+  </w:p>
+</w:ftr>
+</file>
+
+<file path=word/footer3.xml><?xml version="1.0" encoding="utf-8"?>
+<w:ftr xmlns:m="http://schemas.openxmlformats.org/officeDocument/2006/math" xmlns:mc="http://schemas.openxmlformats.org/markup-compatibility/2006" xmlns:mo="http://schemas.microsoft.com/office/mac/office/2008/main" xmlns:mv="urn:schemas-microsoft-com:mac:vml" xmlns:o="urn:schemas-microsoft-com:office:office" xmlns:r="http://schemas.openxmlformats.org/officeDocument/2006/relationships" xmlns:v="urn:schemas-microsoft-com:vml" xmlns:w10="urn:schemas-microsoft-com:office:word" xmlns:w14="http://schemas.microsoft.com/office/word/2010/wordml" xmlns:w="http://schemas.openxmlformats.org/wordprocessingml/2006/main" xmlns:wne="http://schemas.microsoft.com/office/word/2006/wordml" xmlns:wp14="http://schemas.microsoft.com/office/word/2010/wordprocessingDrawing" xmlns:wp="http://schemas.openxmlformats.org/drawingml/2006/wordprocessingDrawing" xmlns:wpc="http://schemas.microsoft.com/office/word/2010/wordprocessingCanvas" xmlns:wpg="http://schemas.microsoft.com/office/word/2010/wordprocessingGroup" xmlns:wpi="http://schemas.microsoft.com/office/word/2010/wordprocessingInk" xmlns:wps="http://schemas.microsoft.com/office/word/2010/wordprocessingShape" mc:Ignorable="w14 wp14">
+  <w:p>
+    <w:pPr>
+      <w:pStyle w:val="Footer"/>
+    </w:pPr>
   </w:p>
 </w:ftr>
 </file>
@@ -41871,10 +41889,21 @@
         <w:rFonts w:ascii="Lato" w:hAnsi="Lato" w:eastAsia="Lato" w:cs="Lato"/>
         <w:b/>
         <w:color w:val="4B5563"/>
-        <w:sz w:val="19"/>
+        <w:sz w:val="24"/>
+        <w:szCs w:val="24"/>
       </w:rPr>
       <w:t>MANUAL MULTIAGENTE  •  REFERÊNCIA PRÁTICA</w:t>
     </w:r>
+  </w:p>
+</w:hdr>
+</file>
+
+<file path=word/header3.xml><?xml version="1.0" encoding="utf-8"?>
+<w:hdr xmlns:m="http://schemas.openxmlformats.org/officeDocument/2006/math" xmlns:mc="http://schemas.openxmlformats.org/markup-compatibility/2006" xmlns:mo="http://schemas.microsoft.com/office/mac/office/2008/main" xmlns:mv="urn:schemas-microsoft-com:mac:vml" xmlns:o="urn:schemas-microsoft-com:office:office" xmlns:r="http://schemas.openxmlformats.org/officeDocument/2006/relationships" xmlns:v="urn:schemas-microsoft-com:vml" xmlns:w10="urn:schemas-microsoft-com:office:word" xmlns:w14="http://schemas.microsoft.com/office/word/2010/wordml" xmlns:w="http://schemas.openxmlformats.org/wordprocessingml/2006/main" xmlns:wne="http://schemas.microsoft.com/office/word/2006/wordml" xmlns:wp14="http://schemas.microsoft.com/office/word/2010/wordprocessingDrawing" xmlns:wp="http://schemas.openxmlformats.org/drawingml/2006/wordprocessingDrawing" xmlns:wpc="http://schemas.microsoft.com/office/word/2010/wordprocessingCanvas" xmlns:wpg="http://schemas.microsoft.com/office/word/2010/wordprocessingGroup" xmlns:wpi="http://schemas.microsoft.com/office/word/2010/wordprocessingInk" xmlns:wps="http://schemas.microsoft.com/office/word/2010/wordprocessingShape" mc:Ignorable="w14 wp14">
+  <w:p>
+    <w:pPr>
+      <w:pStyle w:val="Header"/>
+    </w:pPr>
   </w:p>
 </w:hdr>
 </file>
@@ -42594,9 +42623,9 @@
   <w:docDefaults>
     <w:rPrDefault>
       <w:rPr>
-        <w:rFonts w:asciiTheme="minorHAnsi" w:cstheme="minorBidi" w:eastAsiaTheme="minorEastAsia" w:hAnsiTheme="minorHAnsi"/>
-        <w:sz w:val="22"/>
-        <w:szCs w:val="22"/>
+        <w:rFonts w:ascii="Lato" w:asciiTheme="minorHAnsi" w:cs="Lato" w:cstheme="minorBidi" w:eastAsia="Lato" w:eastAsiaTheme="minorEastAsia" w:hAnsi="Lato" w:hAnsiTheme="minorHAnsi"/>
+        <w:sz w:val="24"/>
+        <w:szCs w:val="24"/>
         <w:lang w:bidi="ar-SA" w:eastAsia="en-US" w:val="en-US"/>
       </w:rPr>
     </w:rPrDefault>
@@ -42758,6 +42787,7 @@
       <w:rFonts w:ascii="Lato" w:cs="Lato" w:eastAsia="Lato" w:hAnsi="Lato"/>
       <w:color w:val="1F2937"/>
       <w:sz w:val="24"/>
+      <w:szCs w:val="24"/>
     </w:rPr>
   </w:style>
   <w:style w:styleId="Header" w:type="paragraph">
@@ -42774,6 +42804,11 @@
       </w:tabs>
       <w:spacing w:after="0" w:line="240" w:lineRule="auto"/>
     </w:pPr>
+    <w:rPr>
+      <w:rFonts w:ascii="Lato" w:cs="Lato" w:eastAsia="Lato" w:hAnsi="Lato"/>
+      <w:sz w:val="24"/>
+      <w:szCs w:val="24"/>
+    </w:rPr>
   </w:style>
   <w:style w:customStyle="1" w:styleId="HeaderChar" w:type="character">
     <w:name w:val="Header Char"/>
@@ -42781,6 +42816,11 @@
     <w:link w:val="Header"/>
     <w:uiPriority w:val="99"/>
     <w:rsid w:val="00E618BF"/>
+    <w:rPr>
+      <w:rFonts w:ascii="Lato" w:cs="Lato" w:eastAsia="Lato" w:hAnsi="Lato"/>
+      <w:sz w:val="24"/>
+      <w:szCs w:val="24"/>
+    </w:rPr>
   </w:style>
   <w:style w:styleId="Footer" w:type="paragraph">
     <w:name w:val="footer"/>
@@ -42796,6 +42836,11 @@
       </w:tabs>
       <w:spacing w:after="0" w:line="240" w:lineRule="auto"/>
     </w:pPr>
+    <w:rPr>
+      <w:rFonts w:ascii="Lato" w:cs="Lato" w:eastAsia="Lato" w:hAnsi="Lato"/>
+      <w:sz w:val="24"/>
+      <w:szCs w:val="24"/>
+    </w:rPr>
   </w:style>
   <w:style w:customStyle="1" w:styleId="FooterChar" w:type="character">
     <w:name w:val="Footer Char"/>
@@ -42803,6 +42848,11 @@
     <w:link w:val="Footer"/>
     <w:uiPriority w:val="99"/>
     <w:rsid w:val="00E618BF"/>
+    <w:rPr>
+      <w:rFonts w:ascii="Lato" w:cs="Lato" w:eastAsia="Lato" w:hAnsi="Lato"/>
+      <w:sz w:val="24"/>
+      <w:szCs w:val="24"/>
+    </w:rPr>
   </w:style>
   <w:style w:styleId="Heading1" w:type="paragraph">
     <w:name w:val="heading 1"/>
@@ -42826,7 +42876,7 @@
       <w:bCs/>
       <w:color w:val="1E40AF"/>
       <w:sz w:val="40"/>
-      <w:szCs w:val="28"/>
+      <w:szCs w:val="40"/>
     </w:rPr>
   </w:style>
   <w:style w:styleId="Heading2" w:type="paragraph">
@@ -42852,7 +42902,7 @@
       <w:bCs/>
       <w:color w:val="1E40AF"/>
       <w:sz w:val="34"/>
-      <w:szCs w:val="26"/>
+      <w:szCs w:val="34"/>
     </w:rPr>
   </w:style>
   <w:style w:styleId="Heading3" w:type="paragraph">
@@ -42878,6 +42928,7 @@
       <w:bCs/>
       <w:color w:val="4B5563"/>
       <w:sz w:val="29"/>
+      <w:szCs w:val="29"/>
     </w:rPr>
   </w:style>
   <w:style w:styleId="Heading4" w:type="paragraph">
@@ -42906,6 +42957,7 @@
       <w:iCs/>
       <w:color w:val="4B5563"/>
       <w:sz w:val="25"/>
+      <w:szCs w:val="25"/>
     </w:rPr>
   </w:style>
   <w:style w:styleId="Heading5" w:type="paragraph">
@@ -42925,8 +42977,10 @@
       <w:outlineLvl w:val="4"/>
     </w:pPr>
     <w:rPr>
-      <w:rFonts w:asciiTheme="majorHAnsi" w:cstheme="majorBidi" w:eastAsiaTheme="majorEastAsia" w:hAnsiTheme="majorHAnsi"/>
+      <w:rFonts w:ascii="Lato" w:asciiTheme="majorHAnsi" w:cs="Lato" w:cstheme="majorBidi" w:eastAsia="Lato" w:eastAsiaTheme="majorEastAsia" w:hAnsi="Lato" w:hAnsiTheme="majorHAnsi"/>
       <w:color w:themeColor="accent1" w:themeShade="7F" w:val="243F60"/>
+      <w:sz w:val="24"/>
+      <w:szCs w:val="24"/>
     </w:rPr>
   </w:style>
   <w:style w:styleId="Heading6" w:type="paragraph">
@@ -42946,10 +43000,12 @@
       <w:outlineLvl w:val="5"/>
     </w:pPr>
     <w:rPr>
-      <w:rFonts w:asciiTheme="majorHAnsi" w:cstheme="majorBidi" w:eastAsiaTheme="majorEastAsia" w:hAnsiTheme="majorHAnsi"/>
+      <w:rFonts w:ascii="Lato" w:asciiTheme="majorHAnsi" w:cs="Lato" w:cstheme="majorBidi" w:eastAsia="Lato" w:eastAsiaTheme="majorEastAsia" w:hAnsi="Lato" w:hAnsiTheme="majorHAnsi"/>
       <w:i/>
       <w:iCs/>
       <w:color w:themeColor="accent1" w:themeShade="7F" w:val="243F60"/>
+      <w:sz w:val="24"/>
+      <w:szCs w:val="24"/>
     </w:rPr>
   </w:style>
   <w:style w:styleId="Heading7" w:type="paragraph">
@@ -42969,10 +43025,12 @@
       <w:outlineLvl w:val="6"/>
     </w:pPr>
     <w:rPr>
-      <w:rFonts w:asciiTheme="majorHAnsi" w:cstheme="majorBidi" w:eastAsiaTheme="majorEastAsia" w:hAnsiTheme="majorHAnsi"/>
+      <w:rFonts w:ascii="Lato" w:asciiTheme="majorHAnsi" w:cs="Lato" w:cstheme="majorBidi" w:eastAsia="Lato" w:eastAsiaTheme="majorEastAsia" w:hAnsi="Lato" w:hAnsiTheme="majorHAnsi"/>
       <w:i/>
       <w:iCs/>
       <w:color w:themeColor="text1" w:themeTint="BF" w:val="404040"/>
+      <w:sz w:val="24"/>
+      <w:szCs w:val="24"/>
     </w:rPr>
   </w:style>
   <w:style w:styleId="Heading8" w:type="paragraph">
@@ -42992,10 +43050,10 @@
       <w:outlineLvl w:val="7"/>
     </w:pPr>
     <w:rPr>
-      <w:rFonts w:asciiTheme="majorHAnsi" w:cstheme="majorBidi" w:eastAsiaTheme="majorEastAsia" w:hAnsiTheme="majorHAnsi"/>
+      <w:rFonts w:ascii="Lato" w:asciiTheme="majorHAnsi" w:cs="Lato" w:cstheme="majorBidi" w:eastAsia="Lato" w:eastAsiaTheme="majorEastAsia" w:hAnsi="Lato" w:hAnsiTheme="majorHAnsi"/>
       <w:color w:themeColor="accent1" w:val="4F81BD"/>
-      <w:sz w:val="20"/>
-      <w:szCs w:val="20"/>
+      <w:sz w:val="24"/>
+      <w:szCs w:val="24"/>
     </w:rPr>
   </w:style>
   <w:style w:styleId="Heading9" w:type="paragraph">
@@ -43015,12 +43073,12 @@
       <w:outlineLvl w:val="8"/>
     </w:pPr>
     <w:rPr>
-      <w:rFonts w:asciiTheme="majorHAnsi" w:cstheme="majorBidi" w:eastAsiaTheme="majorEastAsia" w:hAnsiTheme="majorHAnsi"/>
+      <w:rFonts w:ascii="Lato" w:asciiTheme="majorHAnsi" w:cs="Lato" w:cstheme="majorBidi" w:eastAsia="Lato" w:eastAsiaTheme="majorEastAsia" w:hAnsi="Lato" w:hAnsiTheme="majorHAnsi"/>
       <w:i/>
       <w:iCs/>
       <w:color w:themeColor="text1" w:themeTint="BF" w:val="404040"/>
-      <w:sz w:val="20"/>
-      <w:szCs w:val="20"/>
+      <w:sz w:val="24"/>
+      <w:szCs w:val="24"/>
     </w:rPr>
   </w:style>
   <w:style w:default="1" w:styleId="DefaultParagraphFont" w:type="character">
@@ -43032,6 +43090,7 @@
       <w:rFonts w:ascii="Lato" w:cs="Lato" w:eastAsia="Lato" w:hAnsi="Lato"/>
       <w:color w:val="1F2937"/>
       <w:sz w:val="24"/>
+      <w:szCs w:val="24"/>
     </w:rPr>
   </w:style>
   <w:style w:default="1" w:styleId="TableNormal" w:type="table">
@@ -43039,6 +43098,11 @@
     <w:uiPriority w:val="99"/>
     <w:semiHidden/>
     <w:unhideWhenUsed/>
+    <w:rPr>
+      <w:rFonts w:ascii="Lato" w:cs="Lato" w:eastAsia="Lato" w:hAnsi="Lato"/>
+      <w:sz w:val="24"/>
+      <w:szCs w:val="24"/>
+    </w:rPr>
     <w:tblPr>
       <w:tblInd w:type="dxa" w:w="0"/>
       <w:tblCellMar>
@@ -43054,6 +43118,11 @@
     <w:uiPriority w:val="99"/>
     <w:semiHidden/>
     <w:unhideWhenUsed/>
+    <w:rPr>
+      <w:rFonts w:ascii="Lato" w:cs="Lato" w:eastAsia="Lato" w:hAnsi="Lato"/>
+      <w:sz w:val="24"/>
+      <w:szCs w:val="24"/>
+    </w:rPr>
   </w:style>
   <w:style w:styleId="NoSpacing" w:type="paragraph">
     <w:name w:val="No Spacing"/>
@@ -43063,6 +43132,11 @@
     <w:pPr>
       <w:spacing w:after="0" w:line="240" w:lineRule="auto"/>
     </w:pPr>
+    <w:rPr>
+      <w:rFonts w:ascii="Lato" w:cs="Lato" w:eastAsia="Lato" w:hAnsi="Lato"/>
+      <w:sz w:val="24"/>
+      <w:szCs w:val="24"/>
+    </w:rPr>
   </w:style>
   <w:style w:customStyle="1" w:styleId="Heading1Char" w:type="character">
     <w:name w:val="Heading 1 Char"/>
@@ -43071,7 +43145,7 @@
     <w:uiPriority w:val="9"/>
     <w:rsid w:val="00FC693F"/>
     <w:rPr>
-      <w:rFonts w:asciiTheme="majorHAnsi" w:cstheme="majorBidi" w:eastAsiaTheme="majorEastAsia" w:hAnsiTheme="majorHAnsi"/>
+      <w:rFonts w:ascii="Lato" w:asciiTheme="majorHAnsi" w:cs="Lato" w:cstheme="majorBidi" w:eastAsia="Lato" w:eastAsiaTheme="majorEastAsia" w:hAnsi="Lato" w:hAnsiTheme="majorHAnsi"/>
       <w:b/>
       <w:bCs/>
       <w:color w:themeColor="accent1" w:themeShade="BF" w:val="365F91"/>
@@ -43086,7 +43160,7 @@
     <w:uiPriority w:val="9"/>
     <w:rsid w:val="00FC693F"/>
     <w:rPr>
-      <w:rFonts w:asciiTheme="majorHAnsi" w:cstheme="majorBidi" w:eastAsiaTheme="majorEastAsia" w:hAnsiTheme="majorHAnsi"/>
+      <w:rFonts w:ascii="Lato" w:asciiTheme="majorHAnsi" w:cs="Lato" w:cstheme="majorBidi" w:eastAsia="Lato" w:eastAsiaTheme="majorEastAsia" w:hAnsi="Lato" w:hAnsiTheme="majorHAnsi"/>
       <w:b/>
       <w:bCs/>
       <w:color w:themeColor="accent1" w:val="4F81BD"/>
@@ -43101,10 +43175,12 @@
     <w:uiPriority w:val="9"/>
     <w:rsid w:val="00FC693F"/>
     <w:rPr>
-      <w:rFonts w:asciiTheme="majorHAnsi" w:cstheme="majorBidi" w:eastAsiaTheme="majorEastAsia" w:hAnsiTheme="majorHAnsi"/>
+      <w:rFonts w:ascii="Lato" w:asciiTheme="majorHAnsi" w:cs="Lato" w:cstheme="majorBidi" w:eastAsia="Lato" w:eastAsiaTheme="majorEastAsia" w:hAnsi="Lato" w:hAnsiTheme="majorHAnsi"/>
       <w:b/>
       <w:bCs/>
       <w:color w:themeColor="accent1" w:val="4F81BD"/>
+      <w:sz w:val="24"/>
+      <w:szCs w:val="24"/>
     </w:rPr>
   </w:style>
   <w:style w:styleId="Title" w:type="paragraph">
@@ -43132,7 +43208,7 @@
       <w:spacing w:val="5"/>
       <w:kern w:val="28"/>
       <w:sz w:val="56"/>
-      <w:szCs w:val="52"/>
+      <w:szCs w:val="56"/>
     </w:rPr>
   </w:style>
   <w:style w:customStyle="1" w:styleId="TitleChar" w:type="character">
@@ -43142,7 +43218,7 @@
     <w:uiPriority w:val="10"/>
     <w:rsid w:val="00FC693F"/>
     <w:rPr>
-      <w:rFonts w:asciiTheme="majorHAnsi" w:cstheme="majorBidi" w:eastAsiaTheme="majorEastAsia" w:hAnsiTheme="majorHAnsi"/>
+      <w:rFonts w:ascii="Lato" w:asciiTheme="majorHAnsi" w:cs="Lato" w:cstheme="majorBidi" w:eastAsia="Lato" w:eastAsiaTheme="majorEastAsia" w:hAnsi="Lato" w:hAnsiTheme="majorHAnsi"/>
       <w:color w:themeColor="text2" w:themeShade="BF" w:val="17365D"/>
       <w:spacing w:val="5"/>
       <w:kern w:val="28"/>
@@ -43175,7 +43251,7 @@
       <w:color w:val="4B5563"/>
       <w:spacing w:val="15"/>
       <w:sz w:val="30"/>
-      <w:szCs w:val="24"/>
+      <w:szCs w:val="30"/>
     </w:rPr>
   </w:style>
   <w:style w:customStyle="1" w:styleId="SubtitleChar" w:type="character">
@@ -43185,7 +43261,7 @@
     <w:uiPriority w:val="11"/>
     <w:rsid w:val="00FC693F"/>
     <w:rPr>
-      <w:rFonts w:asciiTheme="majorHAnsi" w:cstheme="majorBidi" w:eastAsiaTheme="majorEastAsia" w:hAnsiTheme="majorHAnsi"/>
+      <w:rFonts w:ascii="Lato" w:asciiTheme="majorHAnsi" w:cs="Lato" w:cstheme="majorBidi" w:eastAsia="Lato" w:eastAsiaTheme="majorEastAsia" w:hAnsi="Lato" w:hAnsiTheme="majorHAnsi"/>
       <w:i/>
       <w:iCs/>
       <w:color w:themeColor="accent1" w:val="4F81BD"/>
@@ -43204,6 +43280,11 @@
       <w:ind w:left="720"/>
       <w:contextualSpacing/>
     </w:pPr>
+    <w:rPr>
+      <w:rFonts w:ascii="Lato" w:cs="Lato" w:eastAsia="Lato" w:hAnsi="Lato"/>
+      <w:sz w:val="24"/>
+      <w:szCs w:val="24"/>
+    </w:rPr>
   </w:style>
   <w:style w:styleId="BodyText" w:type="paragraph">
     <w:name w:val="Body Text"/>
@@ -43221,6 +43302,7 @@
       <w:rFonts w:ascii="Lato" w:cs="Lato" w:eastAsia="Lato" w:hAnsi="Lato"/>
       <w:color w:val="1F2937"/>
       <w:sz w:val="24"/>
+      <w:szCs w:val="24"/>
     </w:rPr>
   </w:style>
   <w:style w:customStyle="1" w:styleId="BodyTextChar" w:type="character">
@@ -43229,6 +43311,11 @@
     <w:link w:val="BodyText"/>
     <w:uiPriority w:val="99"/>
     <w:rsid w:val="00AA1D8D"/>
+    <w:rPr>
+      <w:rFonts w:ascii="Lato" w:cs="Lato" w:eastAsia="Lato" w:hAnsi="Lato"/>
+      <w:sz w:val="24"/>
+      <w:szCs w:val="24"/>
+    </w:rPr>
   </w:style>
   <w:style w:styleId="BodyText2" w:type="paragraph">
     <w:name w:val="Body Text 2"/>
@@ -43240,6 +43327,11 @@
     <w:pPr>
       <w:spacing w:after="120" w:line="480" w:lineRule="auto"/>
     </w:pPr>
+    <w:rPr>
+      <w:rFonts w:ascii="Lato" w:cs="Lato" w:eastAsia="Lato" w:hAnsi="Lato"/>
+      <w:sz w:val="24"/>
+      <w:szCs w:val="24"/>
+    </w:rPr>
   </w:style>
   <w:style w:customStyle="1" w:styleId="BodyText2Char" w:type="character">
     <w:name w:val="Body Text 2 Char"/>
@@ -43247,6 +43339,11 @@
     <w:link w:val="BodyText2"/>
     <w:uiPriority w:val="99"/>
     <w:rsid w:val="00AA1D8D"/>
+    <w:rPr>
+      <w:rFonts w:ascii="Lato" w:cs="Lato" w:eastAsia="Lato" w:hAnsi="Lato"/>
+      <w:sz w:val="24"/>
+      <w:szCs w:val="24"/>
+    </w:rPr>
   </w:style>
   <w:style w:styleId="BodyText3" w:type="paragraph">
     <w:name w:val="Body Text 3"/>
@@ -43259,8 +43356,9 @@
       <w:spacing w:after="120"/>
     </w:pPr>
     <w:rPr>
-      <w:sz w:val="16"/>
-      <w:szCs w:val="16"/>
+      <w:rFonts w:ascii="Lato" w:cs="Lato" w:eastAsia="Lato" w:hAnsi="Lato"/>
+      <w:sz w:val="24"/>
+      <w:szCs w:val="24"/>
     </w:rPr>
   </w:style>
   <w:style w:customStyle="1" w:styleId="BodyText3Char" w:type="character">
@@ -43270,8 +43368,9 @@
     <w:uiPriority w:val="99"/>
     <w:rsid w:val="00AA1D8D"/>
     <w:rPr>
-      <w:sz w:val="16"/>
-      <w:szCs w:val="16"/>
+      <w:rFonts w:ascii="Lato" w:cs="Lato" w:eastAsia="Lato" w:hAnsi="Lato"/>
+      <w:sz w:val="24"/>
+      <w:szCs w:val="24"/>
     </w:rPr>
   </w:style>
   <w:style w:styleId="List" w:type="paragraph">
@@ -43284,6 +43383,11 @@
       <w:ind w:hanging="360" w:left="360"/>
       <w:contextualSpacing/>
     </w:pPr>
+    <w:rPr>
+      <w:rFonts w:ascii="Lato" w:cs="Lato" w:eastAsia="Lato" w:hAnsi="Lato"/>
+      <w:sz w:val="24"/>
+      <w:szCs w:val="24"/>
+    </w:rPr>
   </w:style>
   <w:style w:styleId="List2" w:type="paragraph">
     <w:name w:val="List 2"/>
@@ -43295,6 +43399,11 @@
       <w:ind w:hanging="360" w:left="720"/>
       <w:contextualSpacing/>
     </w:pPr>
+    <w:rPr>
+      <w:rFonts w:ascii="Lato" w:cs="Lato" w:eastAsia="Lato" w:hAnsi="Lato"/>
+      <w:sz w:val="24"/>
+      <w:szCs w:val="24"/>
+    </w:rPr>
   </w:style>
   <w:style w:styleId="List3" w:type="paragraph">
     <w:name w:val="List 3"/>
@@ -43306,6 +43415,11 @@
       <w:ind w:hanging="360" w:left="1080"/>
       <w:contextualSpacing/>
     </w:pPr>
+    <w:rPr>
+      <w:rFonts w:ascii="Lato" w:cs="Lato" w:eastAsia="Lato" w:hAnsi="Lato"/>
+      <w:sz w:val="24"/>
+      <w:szCs w:val="24"/>
+    </w:rPr>
   </w:style>
   <w:style w:styleId="ListBullet" w:type="paragraph">
     <w:name w:val="List Bullet"/>
@@ -43324,6 +43438,7 @@
       <w:rFonts w:ascii="Lato" w:cs="Lato" w:eastAsia="Lato" w:hAnsi="Lato"/>
       <w:color w:val="1F2937"/>
       <w:sz w:val="24"/>
+      <w:szCs w:val="24"/>
     </w:rPr>
   </w:style>
   <w:style w:styleId="ListBullet2" w:type="paragraph">
@@ -43343,6 +43458,7 @@
       <w:rFonts w:ascii="Lato" w:cs="Lato" w:eastAsia="Lato" w:hAnsi="Lato"/>
       <w:color w:val="1F2937"/>
       <w:sz w:val="24"/>
+      <w:szCs w:val="24"/>
     </w:rPr>
   </w:style>
   <w:style w:styleId="ListBullet3" w:type="paragraph">
@@ -43362,6 +43478,7 @@
       <w:rFonts w:ascii="Lato" w:cs="Lato" w:eastAsia="Lato" w:hAnsi="Lato"/>
       <w:color w:val="1F2937"/>
       <w:sz w:val="24"/>
+      <w:szCs w:val="24"/>
     </w:rPr>
   </w:style>
   <w:style w:styleId="ListNumber" w:type="paragraph">
@@ -43381,6 +43498,7 @@
       <w:rFonts w:ascii="Lato" w:cs="Lato" w:eastAsia="Lato" w:hAnsi="Lato"/>
       <w:color w:val="1F2937"/>
       <w:sz w:val="24"/>
+      <w:szCs w:val="24"/>
     </w:rPr>
   </w:style>
   <w:style w:styleId="ListNumber2" w:type="paragraph">
@@ -43400,6 +43518,7 @@
       <w:rFonts w:ascii="Lato" w:cs="Lato" w:eastAsia="Lato" w:hAnsi="Lato"/>
       <w:color w:val="1F2937"/>
       <w:sz w:val="24"/>
+      <w:szCs w:val="24"/>
     </w:rPr>
   </w:style>
   <w:style w:styleId="ListNumber3" w:type="paragraph">
@@ -43419,6 +43538,7 @@
       <w:rFonts w:ascii="Lato" w:cs="Lato" w:eastAsia="Lato" w:hAnsi="Lato"/>
       <w:color w:val="1F2937"/>
       <w:sz w:val="24"/>
+      <w:szCs w:val="24"/>
     </w:rPr>
   </w:style>
   <w:style w:styleId="ListContinue" w:type="paragraph">
@@ -43432,6 +43552,11 @@
       <w:ind w:left="360"/>
       <w:contextualSpacing/>
     </w:pPr>
+    <w:rPr>
+      <w:rFonts w:ascii="Lato" w:cs="Lato" w:eastAsia="Lato" w:hAnsi="Lato"/>
+      <w:sz w:val="24"/>
+      <w:szCs w:val="24"/>
+    </w:rPr>
   </w:style>
   <w:style w:styleId="ListContinue2" w:type="paragraph">
     <w:name w:val="List Continue 2"/>
@@ -43444,6 +43569,11 @@
       <w:ind w:left="720"/>
       <w:contextualSpacing/>
     </w:pPr>
+    <w:rPr>
+      <w:rFonts w:ascii="Lato" w:cs="Lato" w:eastAsia="Lato" w:hAnsi="Lato"/>
+      <w:sz w:val="24"/>
+      <w:szCs w:val="24"/>
+    </w:rPr>
   </w:style>
   <w:style w:styleId="ListContinue3" w:type="paragraph">
     <w:name w:val="List Continue 3"/>
@@ -43456,6 +43586,11 @@
       <w:ind w:left="1080"/>
       <w:contextualSpacing/>
     </w:pPr>
+    <w:rPr>
+      <w:rFonts w:ascii="Lato" w:cs="Lato" w:eastAsia="Lato" w:hAnsi="Lato"/>
+      <w:sz w:val="24"/>
+      <w:szCs w:val="24"/>
+    </w:rPr>
   </w:style>
   <w:style w:styleId="MacroText" w:type="paragraph">
     <w:name w:val="macro"/>
@@ -43475,9 +43610,9 @@
       </w:tabs>
     </w:pPr>
     <w:rPr>
-      <w:rFonts w:ascii="Courier" w:hAnsi="Courier"/>
-      <w:sz w:val="20"/>
-      <w:szCs w:val="20"/>
+      <w:rFonts w:ascii="Lato" w:cs="Lato" w:eastAsia="Lato" w:hAnsi="Lato"/>
+      <w:sz w:val="24"/>
+      <w:szCs w:val="24"/>
     </w:rPr>
   </w:style>
   <w:style w:customStyle="1" w:styleId="MacroTextChar" w:type="character">
@@ -43487,9 +43622,9 @@
     <w:uiPriority w:val="99"/>
     <w:rsid w:val="0029639D"/>
     <w:rPr>
-      <w:rFonts w:ascii="Courier" w:hAnsi="Courier"/>
-      <w:sz w:val="20"/>
-      <w:szCs w:val="20"/>
+      <w:rFonts w:ascii="Lato" w:cs="Lato" w:eastAsia="Lato" w:hAnsi="Lato"/>
+      <w:sz w:val="24"/>
+      <w:szCs w:val="24"/>
     </w:rPr>
   </w:style>
   <w:style w:styleId="Quote" w:type="paragraph">
@@ -43510,6 +43645,7 @@
       <w:iCs/>
       <w:color w:val="4B5563"/>
       <w:sz w:val="24"/>
+      <w:szCs w:val="24"/>
     </w:rPr>
   </w:style>
   <w:style w:customStyle="1" w:styleId="QuoteChar" w:type="character">
@@ -43519,9 +43655,12 @@
     <w:uiPriority w:val="29"/>
     <w:rsid w:val="00FC693F"/>
     <w:rPr>
+      <w:rFonts w:ascii="Lato" w:cs="Lato" w:eastAsia="Lato" w:hAnsi="Lato"/>
       <w:i/>
       <w:iCs/>
       <w:color w:themeColor="text1" w:val="000000"/>
+      <w:sz w:val="24"/>
+      <w:szCs w:val="24"/>
     </w:rPr>
   </w:style>
   <w:style w:customStyle="1" w:styleId="Heading4Char" w:type="character">
@@ -43532,12 +43671,14 @@
     <w:semiHidden/>
     <w:rsid w:val="00FC693F"/>
     <w:rPr>
-      <w:rFonts w:asciiTheme="majorHAnsi" w:cstheme="majorBidi" w:eastAsiaTheme="majorEastAsia" w:hAnsiTheme="majorHAnsi"/>
+      <w:rFonts w:ascii="Lato" w:asciiTheme="majorHAnsi" w:cs="Lato" w:cstheme="majorBidi" w:eastAsia="Lato" w:eastAsiaTheme="majorEastAsia" w:hAnsi="Lato" w:hAnsiTheme="majorHAnsi"/>
       <w:b/>
       <w:bCs/>
       <w:i/>
       <w:iCs/>
       <w:color w:themeColor="accent1" w:val="4F81BD"/>
+      <w:sz w:val="24"/>
+      <w:szCs w:val="24"/>
     </w:rPr>
   </w:style>
   <w:style w:customStyle="1" w:styleId="Heading5Char" w:type="character">
@@ -43548,8 +43689,10 @@
     <w:semiHidden/>
     <w:rsid w:val="00FC693F"/>
     <w:rPr>
-      <w:rFonts w:asciiTheme="majorHAnsi" w:cstheme="majorBidi" w:eastAsiaTheme="majorEastAsia" w:hAnsiTheme="majorHAnsi"/>
+      <w:rFonts w:ascii="Lato" w:asciiTheme="majorHAnsi" w:cs="Lato" w:cstheme="majorBidi" w:eastAsia="Lato" w:eastAsiaTheme="majorEastAsia" w:hAnsi="Lato" w:hAnsiTheme="majorHAnsi"/>
       <w:color w:themeColor="accent1" w:themeShade="7F" w:val="243F60"/>
+      <w:sz w:val="24"/>
+      <w:szCs w:val="24"/>
     </w:rPr>
   </w:style>
   <w:style w:customStyle="1" w:styleId="Heading6Char" w:type="character">
@@ -43560,10 +43703,12 @@
     <w:semiHidden/>
     <w:rsid w:val="00FC693F"/>
     <w:rPr>
-      <w:rFonts w:asciiTheme="majorHAnsi" w:cstheme="majorBidi" w:eastAsiaTheme="majorEastAsia" w:hAnsiTheme="majorHAnsi"/>
+      <w:rFonts w:ascii="Lato" w:asciiTheme="majorHAnsi" w:cs="Lato" w:cstheme="majorBidi" w:eastAsia="Lato" w:eastAsiaTheme="majorEastAsia" w:hAnsi="Lato" w:hAnsiTheme="majorHAnsi"/>
       <w:i/>
       <w:iCs/>
       <w:color w:themeColor="accent1" w:themeShade="7F" w:val="243F60"/>
+      <w:sz w:val="24"/>
+      <w:szCs w:val="24"/>
     </w:rPr>
   </w:style>
   <w:style w:customStyle="1" w:styleId="Heading7Char" w:type="character">
@@ -43574,10 +43719,12 @@
     <w:semiHidden/>
     <w:rsid w:val="00FC693F"/>
     <w:rPr>
-      <w:rFonts w:asciiTheme="majorHAnsi" w:cstheme="majorBidi" w:eastAsiaTheme="majorEastAsia" w:hAnsiTheme="majorHAnsi"/>
+      <w:rFonts w:ascii="Lato" w:asciiTheme="majorHAnsi" w:cs="Lato" w:cstheme="majorBidi" w:eastAsia="Lato" w:eastAsiaTheme="majorEastAsia" w:hAnsi="Lato" w:hAnsiTheme="majorHAnsi"/>
       <w:i/>
       <w:iCs/>
       <w:color w:themeColor="text1" w:themeTint="BF" w:val="404040"/>
+      <w:sz w:val="24"/>
+      <w:szCs w:val="24"/>
     </w:rPr>
   </w:style>
   <w:style w:customStyle="1" w:styleId="Heading8Char" w:type="character">
@@ -43588,10 +43735,10 @@
     <w:semiHidden/>
     <w:rsid w:val="00FC693F"/>
     <w:rPr>
-      <w:rFonts w:asciiTheme="majorHAnsi" w:cstheme="majorBidi" w:eastAsiaTheme="majorEastAsia" w:hAnsiTheme="majorHAnsi"/>
+      <w:rFonts w:ascii="Lato" w:asciiTheme="majorHAnsi" w:cs="Lato" w:cstheme="majorBidi" w:eastAsia="Lato" w:eastAsiaTheme="majorEastAsia" w:hAnsi="Lato" w:hAnsiTheme="majorHAnsi"/>
       <w:color w:themeColor="accent1" w:val="4F81BD"/>
-      <w:sz w:val="20"/>
-      <w:szCs w:val="20"/>
+      <w:sz w:val="24"/>
+      <w:szCs w:val="24"/>
     </w:rPr>
   </w:style>
   <w:style w:customStyle="1" w:styleId="Heading9Char" w:type="character">
@@ -43602,12 +43749,12 @@
     <w:semiHidden/>
     <w:rsid w:val="00FC693F"/>
     <w:rPr>
-      <w:rFonts w:asciiTheme="majorHAnsi" w:cstheme="majorBidi" w:eastAsiaTheme="majorEastAsia" w:hAnsiTheme="majorHAnsi"/>
+      <w:rFonts w:ascii="Lato" w:asciiTheme="majorHAnsi" w:cs="Lato" w:cstheme="majorBidi" w:eastAsia="Lato" w:eastAsiaTheme="majorEastAsia" w:hAnsi="Lato" w:hAnsiTheme="majorHAnsi"/>
       <w:i/>
       <w:iCs/>
       <w:color w:themeColor="text1" w:themeTint="BF" w:val="404040"/>
-      <w:sz w:val="20"/>
-      <w:szCs w:val="20"/>
+      <w:sz w:val="24"/>
+      <w:szCs w:val="24"/>
     </w:rPr>
   </w:style>
   <w:style w:styleId="Caption" w:type="paragraph">
@@ -43631,7 +43778,7 @@
       <w:i/>
       <w:color w:val="4B5563"/>
       <w:sz w:val="24"/>
-      <w:szCs w:val="18"/>
+      <w:szCs w:val="24"/>
     </w:rPr>
   </w:style>
   <w:style w:styleId="Strong" w:type="character">
@@ -43641,8 +43788,11 @@
     <w:qFormat/>
     <w:rsid w:val="00FC693F"/>
     <w:rPr>
+      <w:rFonts w:ascii="Lato" w:cs="Lato" w:eastAsia="Lato" w:hAnsi="Lato"/>
       <w:b/>
       <w:bCs/>
+      <w:sz w:val="24"/>
+      <w:szCs w:val="24"/>
     </w:rPr>
   </w:style>
   <w:style w:styleId="Emphasis" w:type="character">
@@ -43652,8 +43802,11 @@
     <w:qFormat/>
     <w:rsid w:val="00FC693F"/>
     <w:rPr>
+      <w:rFonts w:ascii="Lato" w:cs="Lato" w:eastAsia="Lato" w:hAnsi="Lato"/>
       <w:i/>
       <w:iCs/>
+      <w:sz w:val="24"/>
+      <w:szCs w:val="24"/>
     </w:rPr>
   </w:style>
   <w:style w:styleId="IntenseQuote" w:type="paragraph">
@@ -43679,6 +43832,7 @@
       <w:iCs/>
       <w:color w:val="4B5563"/>
       <w:sz w:val="24"/>
+      <w:szCs w:val="24"/>
     </w:rPr>
   </w:style>
   <w:style w:customStyle="1" w:styleId="IntenseQuoteChar" w:type="character">
@@ -43688,11 +43842,14 @@
     <w:uiPriority w:val="30"/>
     <w:rsid w:val="00FC693F"/>
     <w:rPr>
+      <w:rFonts w:ascii="Lato" w:cs="Lato" w:eastAsia="Lato" w:hAnsi="Lato"/>
       <w:b/>
       <w:bCs/>
       <w:i/>
       <w:iCs/>
       <w:color w:themeColor="accent1" w:val="4F81BD"/>
+      <w:sz w:val="24"/>
+      <w:szCs w:val="24"/>
     </w:rPr>
   </w:style>
   <w:style w:styleId="SubtleEmphasis" w:type="character">
@@ -43702,9 +43859,12 @@
     <w:qFormat/>
     <w:rsid w:val="00FC693F"/>
     <w:rPr>
+      <w:rFonts w:ascii="Lato" w:cs="Lato" w:eastAsia="Lato" w:hAnsi="Lato"/>
       <w:i/>
       <w:iCs/>
       <w:color w:themeColor="text1" w:themeTint="7F" w:val="808080"/>
+      <w:sz w:val="24"/>
+      <w:szCs w:val="24"/>
     </w:rPr>
   </w:style>
   <w:style w:styleId="IntenseEmphasis" w:type="character">
@@ -43714,11 +43874,14 @@
     <w:qFormat/>
     <w:rsid w:val="00FC693F"/>
     <w:rPr>
+      <w:rFonts w:ascii="Lato" w:cs="Lato" w:eastAsia="Lato" w:hAnsi="Lato"/>
       <w:b/>
       <w:bCs/>
       <w:i/>
       <w:iCs/>
       <w:color w:themeColor="accent1" w:val="4F81BD"/>
+      <w:sz w:val="24"/>
+      <w:szCs w:val="24"/>
     </w:rPr>
   </w:style>
   <w:style w:styleId="SubtleReference" w:type="character">
@@ -43728,9 +43891,12 @@
     <w:qFormat/>
     <w:rsid w:val="00FC693F"/>
     <w:rPr>
+      <w:rFonts w:ascii="Lato" w:cs="Lato" w:eastAsia="Lato" w:hAnsi="Lato"/>
       <w:smallCaps/>
       <w:color w:themeColor="accent2" w:val="C0504D"/>
       <w:u w:val="single"/>
+      <w:sz w:val="24"/>
+      <w:szCs w:val="24"/>
     </w:rPr>
   </w:style>
   <w:style w:styleId="IntenseReference" w:type="character">
@@ -43740,12 +43906,15 @@
     <w:qFormat/>
     <w:rsid w:val="00FC693F"/>
     <w:rPr>
+      <w:rFonts w:ascii="Lato" w:cs="Lato" w:eastAsia="Lato" w:hAnsi="Lato"/>
       <w:b/>
       <w:bCs/>
       <w:smallCaps/>
       <w:color w:themeColor="accent2" w:val="C0504D"/>
       <w:spacing w:val="5"/>
       <w:u w:val="single"/>
+      <w:sz w:val="24"/>
+      <w:szCs w:val="24"/>
     </w:rPr>
   </w:style>
   <w:style w:styleId="BookTitle" w:type="character">
@@ -43755,10 +43924,13 @@
     <w:qFormat/>
     <w:rsid w:val="00FC693F"/>
     <w:rPr>
+      <w:rFonts w:ascii="Lato" w:cs="Lato" w:eastAsia="Lato" w:hAnsi="Lato"/>
       <w:b/>
       <w:bCs/>
       <w:smallCaps/>
       <w:spacing w:val="5"/>
+      <w:sz w:val="24"/>
+      <w:szCs w:val="24"/>
     </w:rPr>
   </w:style>
   <w:style w:styleId="TOCHeading" w:type="paragraph">
@@ -43773,6 +43945,11 @@
     <w:pPr>
       <w:outlineLvl w:val="9"/>
     </w:pPr>
+    <w:rPr>
+      <w:rFonts w:ascii="Lato" w:cs="Lato" w:eastAsia="Lato" w:hAnsi="Lato"/>
+      <w:sz w:val="24"/>
+      <w:szCs w:val="24"/>
+    </w:rPr>
   </w:style>
   <w:style w:styleId="TableGrid" w:type="table">
     <w:name w:val="Table Grid"/>
@@ -43782,6 +43959,11 @@
     <w:pPr>
       <w:spacing w:after="0" w:line="240" w:lineRule="auto"/>
     </w:pPr>
+    <w:rPr>
+      <w:rFonts w:ascii="Lato" w:cs="Lato" w:eastAsia="Lato" w:hAnsi="Lato"/>
+      <w:sz w:val="24"/>
+      <w:szCs w:val="24"/>
+    </w:rPr>
     <w:tblPr>
       <w:tblInd w:type="dxa" w:w="0"/>
       <w:tblBorders>
@@ -43809,7 +43991,10 @@
       <w:spacing w:after="0" w:line="240" w:lineRule="auto"/>
     </w:pPr>
     <w:rPr>
+      <w:rFonts w:ascii="Lato" w:cs="Lato" w:eastAsia="Lato" w:hAnsi="Lato"/>
       <w:color w:themeColor="text1" w:themeShade="BF" w:val="000000"/>
+      <w:sz w:val="24"/>
+      <w:szCs w:val="24"/>
     </w:rPr>
     <w:tblPr>
       <w:tblStyleRowBandSize w:val="1"/>
@@ -43912,7 +44097,10 @@
       <w:spacing w:after="0" w:line="240" w:lineRule="auto"/>
     </w:pPr>
     <w:rPr>
+      <w:rFonts w:ascii="Lato" w:cs="Lato" w:eastAsia="Lato" w:hAnsi="Lato"/>
       <w:color w:themeColor="accent1" w:themeShade="BF" w:val="365F91"/>
+      <w:sz w:val="24"/>
+      <w:szCs w:val="24"/>
     </w:rPr>
     <w:tblPr>
       <w:tblStyleRowBandSize w:val="1"/>
@@ -44015,7 +44203,10 @@
       <w:spacing w:after="0" w:line="240" w:lineRule="auto"/>
     </w:pPr>
     <w:rPr>
+      <w:rFonts w:ascii="Lato" w:cs="Lato" w:eastAsia="Lato" w:hAnsi="Lato"/>
       <w:color w:themeColor="accent2" w:themeShade="BF" w:val="943634"/>
+      <w:sz w:val="24"/>
+      <w:szCs w:val="24"/>
     </w:rPr>
     <w:tblPr>
       <w:tblStyleRowBandSize w:val="1"/>
@@ -44118,7 +44309,10 @@
       <w:spacing w:after="0" w:line="240" w:lineRule="auto"/>
     </w:pPr>
     <w:rPr>
+      <w:rFonts w:ascii="Lato" w:cs="Lato" w:eastAsia="Lato" w:hAnsi="Lato"/>
       <w:color w:themeColor="accent3" w:themeShade="BF" w:val="76923C"/>
+      <w:sz w:val="24"/>
+      <w:szCs w:val="24"/>
     </w:rPr>
     <w:tblPr>
       <w:tblStyleRowBandSize w:val="1"/>
@@ -44221,7 +44415,10 @@
       <w:spacing w:after="0" w:line="240" w:lineRule="auto"/>
     </w:pPr>
     <w:rPr>
+      <w:rFonts w:ascii="Lato" w:cs="Lato" w:eastAsia="Lato" w:hAnsi="Lato"/>
       <w:color w:themeColor="accent4" w:themeShade="BF" w:val="5F497A"/>
+      <w:sz w:val="24"/>
+      <w:szCs w:val="24"/>
     </w:rPr>
     <w:tblPr>
       <w:tblStyleRowBandSize w:val="1"/>
@@ -44324,7 +44521,10 @@
       <w:spacing w:after="0" w:line="240" w:lineRule="auto"/>
     </w:pPr>
     <w:rPr>
+      <w:rFonts w:ascii="Lato" w:cs="Lato" w:eastAsia="Lato" w:hAnsi="Lato"/>
       <w:color w:themeColor="accent5" w:themeShade="BF" w:val="31849B"/>
+      <w:sz w:val="24"/>
+      <w:szCs w:val="24"/>
     </w:rPr>
     <w:tblPr>
       <w:tblStyleRowBandSize w:val="1"/>
@@ -44427,7 +44627,10 @@
       <w:spacing w:after="0" w:line="240" w:lineRule="auto"/>
     </w:pPr>
     <w:rPr>
+      <w:rFonts w:ascii="Lato" w:cs="Lato" w:eastAsia="Lato" w:hAnsi="Lato"/>
       <w:color w:themeColor="accent6" w:themeShade="BF" w:val="E36C0A"/>
+      <w:sz w:val="24"/>
+      <w:szCs w:val="24"/>
     </w:rPr>
     <w:tblPr>
       <w:tblStyleRowBandSize w:val="1"/>
@@ -44529,6 +44732,11 @@
     <w:pPr>
       <w:spacing w:after="0" w:line="240" w:lineRule="auto"/>
     </w:pPr>
+    <w:rPr>
+      <w:rFonts w:ascii="Lato" w:cs="Lato" w:eastAsia="Lato" w:hAnsi="Lato"/>
+      <w:sz w:val="24"/>
+      <w:szCs w:val="24"/>
+    </w:rPr>
     <w:tblPr>
       <w:tblStyleRowBandSize w:val="1"/>
       <w:tblStyleColBandSize w:val="1"/>
@@ -44621,6 +44829,11 @@
     <w:pPr>
       <w:spacing w:after="0" w:line="240" w:lineRule="auto"/>
     </w:pPr>
+    <w:rPr>
+      <w:rFonts w:ascii="Lato" w:cs="Lato" w:eastAsia="Lato" w:hAnsi="Lato"/>
+      <w:sz w:val="24"/>
+      <w:szCs w:val="24"/>
+    </w:rPr>
     <w:tblPr>
       <w:tblStyleRowBandSize w:val="1"/>
       <w:tblStyleColBandSize w:val="1"/>
@@ -44713,6 +44926,11 @@
     <w:pPr>
       <w:spacing w:after="0" w:line="240" w:lineRule="auto"/>
     </w:pPr>
+    <w:rPr>
+      <w:rFonts w:ascii="Lato" w:cs="Lato" w:eastAsia="Lato" w:hAnsi="Lato"/>
+      <w:sz w:val="24"/>
+      <w:szCs w:val="24"/>
+    </w:rPr>
     <w:tblPr>
       <w:tblStyleRowBandSize w:val="1"/>
       <w:tblStyleColBandSize w:val="1"/>
@@ -44805,6 +45023,11 @@
     <w:pPr>
       <w:spacing w:after="0" w:line="240" w:lineRule="auto"/>
     </w:pPr>
+    <w:rPr>
+      <w:rFonts w:ascii="Lato" w:cs="Lato" w:eastAsia="Lato" w:hAnsi="Lato"/>
+      <w:sz w:val="24"/>
+      <w:szCs w:val="24"/>
+    </w:rPr>
     <w:tblPr>
       <w:tblStyleRowBandSize w:val="1"/>
       <w:tblStyleColBandSize w:val="1"/>
@@ -44897,6 +45120,11 @@
     <w:pPr>
       <w:spacing w:after="0" w:line="240" w:lineRule="auto"/>
     </w:pPr>
+    <w:rPr>
+      <w:rFonts w:ascii="Lato" w:cs="Lato" w:eastAsia="Lato" w:hAnsi="Lato"/>
+      <w:sz w:val="24"/>
+      <w:szCs w:val="24"/>
+    </w:rPr>
     <w:tblPr>
       <w:tblStyleRowBandSize w:val="1"/>
       <w:tblStyleColBandSize w:val="1"/>
@@ -44989,6 +45217,11 @@
     <w:pPr>
       <w:spacing w:after="0" w:line="240" w:lineRule="auto"/>
     </w:pPr>
+    <w:rPr>
+      <w:rFonts w:ascii="Lato" w:cs="Lato" w:eastAsia="Lato" w:hAnsi="Lato"/>
+      <w:sz w:val="24"/>
+      <w:szCs w:val="24"/>
+    </w:rPr>
     <w:tblPr>
       <w:tblStyleRowBandSize w:val="1"/>
       <w:tblStyleColBandSize w:val="1"/>
@@ -45081,6 +45314,11 @@
     <w:pPr>
       <w:spacing w:after="0" w:line="240" w:lineRule="auto"/>
     </w:pPr>
+    <w:rPr>
+      <w:rFonts w:ascii="Lato" w:cs="Lato" w:eastAsia="Lato" w:hAnsi="Lato"/>
+      <w:sz w:val="24"/>
+      <w:szCs w:val="24"/>
+    </w:rPr>
     <w:tblPr>
       <w:tblStyleRowBandSize w:val="1"/>
       <w:tblStyleColBandSize w:val="1"/>
@@ -45173,6 +45411,11 @@
     <w:pPr>
       <w:spacing w:after="0" w:line="240" w:lineRule="auto"/>
     </w:pPr>
+    <w:rPr>
+      <w:rFonts w:ascii="Lato" w:cs="Lato" w:eastAsia="Lato" w:hAnsi="Lato"/>
+      <w:sz w:val="24"/>
+      <w:szCs w:val="24"/>
+    </w:rPr>
     <w:tblPr>
       <w:tblStyleRowBandSize w:val="1"/>
       <w:tblStyleColBandSize w:val="1"/>
@@ -45303,6 +45546,11 @@
     <w:pPr>
       <w:spacing w:after="0" w:line="240" w:lineRule="auto"/>
     </w:pPr>
+    <w:rPr>
+      <w:rFonts w:ascii="Lato" w:cs="Lato" w:eastAsia="Lato" w:hAnsi="Lato"/>
+      <w:sz w:val="24"/>
+      <w:szCs w:val="24"/>
+    </w:rPr>
     <w:tblPr>
       <w:tblStyleRowBandSize w:val="1"/>
       <w:tblStyleColBandSize w:val="1"/>
@@ -45433,6 +45681,11 @@
     <w:pPr>
       <w:spacing w:after="0" w:line="240" w:lineRule="auto"/>
     </w:pPr>
+    <w:rPr>
+      <w:rFonts w:ascii="Lato" w:cs="Lato" w:eastAsia="Lato" w:hAnsi="Lato"/>
+      <w:sz w:val="24"/>
+      <w:szCs w:val="24"/>
+    </w:rPr>
     <w:tblPr>
       <w:tblStyleRowBandSize w:val="1"/>
       <w:tblStyleColBandSize w:val="1"/>
@@ -45563,6 +45816,11 @@
     <w:pPr>
       <w:spacing w:after="0" w:line="240" w:lineRule="auto"/>
     </w:pPr>
+    <w:rPr>
+      <w:rFonts w:ascii="Lato" w:cs="Lato" w:eastAsia="Lato" w:hAnsi="Lato"/>
+      <w:sz w:val="24"/>
+      <w:szCs w:val="24"/>
+    </w:rPr>
     <w:tblPr>
       <w:tblStyleRowBandSize w:val="1"/>
       <w:tblStyleColBandSize w:val="1"/>
@@ -45693,6 +45951,11 @@
     <w:pPr>
       <w:spacing w:after="0" w:line="240" w:lineRule="auto"/>
     </w:pPr>
+    <w:rPr>
+      <w:rFonts w:ascii="Lato" w:cs="Lato" w:eastAsia="Lato" w:hAnsi="Lato"/>
+      <w:sz w:val="24"/>
+      <w:szCs w:val="24"/>
+    </w:rPr>
     <w:tblPr>
       <w:tblStyleRowBandSize w:val="1"/>
       <w:tblStyleColBandSize w:val="1"/>
@@ -45823,6 +46086,11 @@
     <w:pPr>
       <w:spacing w:after="0" w:line="240" w:lineRule="auto"/>
     </w:pPr>
+    <w:rPr>
+      <w:rFonts w:ascii="Lato" w:cs="Lato" w:eastAsia="Lato" w:hAnsi="Lato"/>
+      <w:sz w:val="24"/>
+      <w:szCs w:val="24"/>
+    </w:rPr>
     <w:tblPr>
       <w:tblStyleRowBandSize w:val="1"/>
       <w:tblStyleColBandSize w:val="1"/>
@@ -45953,6 +46221,11 @@
     <w:pPr>
       <w:spacing w:after="0" w:line="240" w:lineRule="auto"/>
     </w:pPr>
+    <w:rPr>
+      <w:rFonts w:ascii="Lato" w:cs="Lato" w:eastAsia="Lato" w:hAnsi="Lato"/>
+      <w:sz w:val="24"/>
+      <w:szCs w:val="24"/>
+    </w:rPr>
     <w:tblPr>
       <w:tblStyleRowBandSize w:val="1"/>
       <w:tblStyleColBandSize w:val="1"/>
@@ -46083,6 +46356,11 @@
     <w:pPr>
       <w:spacing w:after="0" w:line="240" w:lineRule="auto"/>
     </w:pPr>
+    <w:rPr>
+      <w:rFonts w:ascii="Lato" w:cs="Lato" w:eastAsia="Lato" w:hAnsi="Lato"/>
+      <w:sz w:val="24"/>
+      <w:szCs w:val="24"/>
+    </w:rPr>
     <w:tblPr>
       <w:tblStyleRowBandSize w:val="1"/>
       <w:tblStyleColBandSize w:val="1"/>
@@ -46189,6 +46467,11 @@
     <w:pPr>
       <w:spacing w:after="0" w:line="240" w:lineRule="auto"/>
     </w:pPr>
+    <w:rPr>
+      <w:rFonts w:ascii="Lato" w:cs="Lato" w:eastAsia="Lato" w:hAnsi="Lato"/>
+      <w:sz w:val="24"/>
+      <w:szCs w:val="24"/>
+    </w:rPr>
     <w:tblPr>
       <w:tblStyleRowBandSize w:val="1"/>
       <w:tblStyleColBandSize w:val="1"/>
@@ -46295,6 +46578,11 @@
     <w:pPr>
       <w:spacing w:after="0" w:line="240" w:lineRule="auto"/>
     </w:pPr>
+    <w:rPr>
+      <w:rFonts w:ascii="Lato" w:cs="Lato" w:eastAsia="Lato" w:hAnsi="Lato"/>
+      <w:sz w:val="24"/>
+      <w:szCs w:val="24"/>
+    </w:rPr>
     <w:tblPr>
       <w:tblStyleRowBandSize w:val="1"/>
       <w:tblStyleColBandSize w:val="1"/>
@@ -46401,6 +46689,11 @@
     <w:pPr>
       <w:spacing w:after="0" w:line="240" w:lineRule="auto"/>
     </w:pPr>
+    <w:rPr>
+      <w:rFonts w:ascii="Lato" w:cs="Lato" w:eastAsia="Lato" w:hAnsi="Lato"/>
+      <w:sz w:val="24"/>
+      <w:szCs w:val="24"/>
+    </w:rPr>
     <w:tblPr>
       <w:tblStyleRowBandSize w:val="1"/>
       <w:tblStyleColBandSize w:val="1"/>
@@ -46507,6 +46800,11 @@
     <w:pPr>
       <w:spacing w:after="0" w:line="240" w:lineRule="auto"/>
     </w:pPr>
+    <w:rPr>
+      <w:rFonts w:ascii="Lato" w:cs="Lato" w:eastAsia="Lato" w:hAnsi="Lato"/>
+      <w:sz w:val="24"/>
+      <w:szCs w:val="24"/>
+    </w:rPr>
     <w:tblPr>
       <w:tblStyleRowBandSize w:val="1"/>
       <w:tblStyleColBandSize w:val="1"/>
@@ -46613,6 +46911,11 @@
     <w:pPr>
       <w:spacing w:after="0" w:line="240" w:lineRule="auto"/>
     </w:pPr>
+    <w:rPr>
+      <w:rFonts w:ascii="Lato" w:cs="Lato" w:eastAsia="Lato" w:hAnsi="Lato"/>
+      <w:sz w:val="24"/>
+      <w:szCs w:val="24"/>
+    </w:rPr>
     <w:tblPr>
       <w:tblStyleRowBandSize w:val="1"/>
       <w:tblStyleColBandSize w:val="1"/>
@@ -46719,6 +47022,11 @@
     <w:pPr>
       <w:spacing w:after="0" w:line="240" w:lineRule="auto"/>
     </w:pPr>
+    <w:rPr>
+      <w:rFonts w:ascii="Lato" w:cs="Lato" w:eastAsia="Lato" w:hAnsi="Lato"/>
+      <w:sz w:val="24"/>
+      <w:szCs w:val="24"/>
+    </w:rPr>
     <w:tblPr>
       <w:tblStyleRowBandSize w:val="1"/>
       <w:tblStyleColBandSize w:val="1"/>
@@ -46825,6 +47133,11 @@
     <w:pPr>
       <w:spacing w:after="0" w:line="240" w:lineRule="auto"/>
     </w:pPr>
+    <w:rPr>
+      <w:rFonts w:ascii="Lato" w:cs="Lato" w:eastAsia="Lato" w:hAnsi="Lato"/>
+      <w:sz w:val="24"/>
+      <w:szCs w:val="24"/>
+    </w:rPr>
     <w:tblPr>
       <w:tblStyleRowBandSize w:val="1"/>
       <w:tblStyleColBandSize w:val="1"/>
@@ -46974,6 +47287,11 @@
     <w:pPr>
       <w:spacing w:after="0" w:line="240" w:lineRule="auto"/>
     </w:pPr>
+    <w:rPr>
+      <w:rFonts w:ascii="Lato" w:cs="Lato" w:eastAsia="Lato" w:hAnsi="Lato"/>
+      <w:sz w:val="24"/>
+      <w:szCs w:val="24"/>
+    </w:rPr>
     <w:tblPr>
       <w:tblStyleRowBandSize w:val="1"/>
       <w:tblStyleColBandSize w:val="1"/>
@@ -47123,6 +47441,11 @@
     <w:pPr>
       <w:spacing w:after="0" w:line="240" w:lineRule="auto"/>
     </w:pPr>
+    <w:rPr>
+      <w:rFonts w:ascii="Lato" w:cs="Lato" w:eastAsia="Lato" w:hAnsi="Lato"/>
+      <w:sz w:val="24"/>
+      <w:szCs w:val="24"/>
+    </w:rPr>
     <w:tblPr>
       <w:tblStyleRowBandSize w:val="1"/>
       <w:tblStyleColBandSize w:val="1"/>
@@ -47272,6 +47595,11 @@
     <w:pPr>
       <w:spacing w:after="0" w:line="240" w:lineRule="auto"/>
     </w:pPr>
+    <w:rPr>
+      <w:rFonts w:ascii="Lato" w:cs="Lato" w:eastAsia="Lato" w:hAnsi="Lato"/>
+      <w:sz w:val="24"/>
+      <w:szCs w:val="24"/>
+    </w:rPr>
     <w:tblPr>
       <w:tblStyleRowBandSize w:val="1"/>
       <w:tblStyleColBandSize w:val="1"/>
@@ -47421,6 +47749,11 @@
     <w:pPr>
       <w:spacing w:after="0" w:line="240" w:lineRule="auto"/>
     </w:pPr>
+    <w:rPr>
+      <w:rFonts w:ascii="Lato" w:cs="Lato" w:eastAsia="Lato" w:hAnsi="Lato"/>
+      <w:sz w:val="24"/>
+      <w:szCs w:val="24"/>
+    </w:rPr>
     <w:tblPr>
       <w:tblStyleRowBandSize w:val="1"/>
       <w:tblStyleColBandSize w:val="1"/>
@@ -47570,6 +47903,11 @@
     <w:pPr>
       <w:spacing w:after="0" w:line="240" w:lineRule="auto"/>
     </w:pPr>
+    <w:rPr>
+      <w:rFonts w:ascii="Lato" w:cs="Lato" w:eastAsia="Lato" w:hAnsi="Lato"/>
+      <w:sz w:val="24"/>
+      <w:szCs w:val="24"/>
+    </w:rPr>
     <w:tblPr>
       <w:tblStyleRowBandSize w:val="1"/>
       <w:tblStyleColBandSize w:val="1"/>
@@ -47719,6 +48057,11 @@
     <w:pPr>
       <w:spacing w:after="0" w:line="240" w:lineRule="auto"/>
     </w:pPr>
+    <w:rPr>
+      <w:rFonts w:ascii="Lato" w:cs="Lato" w:eastAsia="Lato" w:hAnsi="Lato"/>
+      <w:sz w:val="24"/>
+      <w:szCs w:val="24"/>
+    </w:rPr>
     <w:tblPr>
       <w:tblStyleRowBandSize w:val="1"/>
       <w:tblStyleColBandSize w:val="1"/>
@@ -47869,7 +48212,10 @@
       <w:spacing w:after="0" w:line="240" w:lineRule="auto"/>
     </w:pPr>
     <w:rPr>
+      <w:rFonts w:ascii="Lato" w:cs="Lato" w:eastAsia="Lato" w:hAnsi="Lato"/>
       <w:color w:themeColor="text1" w:val="000000"/>
+      <w:sz w:val="24"/>
+      <w:szCs w:val="24"/>
     </w:rPr>
     <w:tblPr>
       <w:tblStyleRowBandSize w:val="1"/>
@@ -47953,7 +48299,10 @@
       <w:spacing w:after="0" w:line="240" w:lineRule="auto"/>
     </w:pPr>
     <w:rPr>
+      <w:rFonts w:ascii="Lato" w:cs="Lato" w:eastAsia="Lato" w:hAnsi="Lato"/>
       <w:color w:themeColor="text1" w:val="000000"/>
+      <w:sz w:val="24"/>
+      <w:szCs w:val="24"/>
     </w:rPr>
     <w:tblPr>
       <w:tblStyleRowBandSize w:val="1"/>
@@ -48037,7 +48386,10 @@
       <w:spacing w:after="0" w:line="240" w:lineRule="auto"/>
     </w:pPr>
     <w:rPr>
+      <w:rFonts w:ascii="Lato" w:cs="Lato" w:eastAsia="Lato" w:hAnsi="Lato"/>
       <w:color w:themeColor="text1" w:val="000000"/>
+      <w:sz w:val="24"/>
+      <w:szCs w:val="24"/>
     </w:rPr>
     <w:tblPr>
       <w:tblStyleRowBandSize w:val="1"/>
@@ -48121,7 +48473,10 @@
       <w:spacing w:after="0" w:line="240" w:lineRule="auto"/>
     </w:pPr>
     <w:rPr>
+      <w:rFonts w:ascii="Lato" w:cs="Lato" w:eastAsia="Lato" w:hAnsi="Lato"/>
       <w:color w:themeColor="text1" w:val="000000"/>
+      <w:sz w:val="24"/>
+      <w:szCs w:val="24"/>
     </w:rPr>
     <w:tblPr>
       <w:tblStyleRowBandSize w:val="1"/>
@@ -48205,7 +48560,10 @@
       <w:spacing w:after="0" w:line="240" w:lineRule="auto"/>
     </w:pPr>
     <w:rPr>
+      <w:rFonts w:ascii="Lato" w:cs="Lato" w:eastAsia="Lato" w:hAnsi="Lato"/>
       <w:color w:themeColor="text1" w:val="000000"/>
+      <w:sz w:val="24"/>
+      <w:szCs w:val="24"/>
     </w:rPr>
     <w:tblPr>
       <w:tblStyleRowBandSize w:val="1"/>
@@ -48289,7 +48647,10 @@
       <w:spacing w:after="0" w:line="240" w:lineRule="auto"/>
     </w:pPr>
     <w:rPr>
+      <w:rFonts w:ascii="Lato" w:cs="Lato" w:eastAsia="Lato" w:hAnsi="Lato"/>
       <w:color w:themeColor="text1" w:val="000000"/>
+      <w:sz w:val="24"/>
+      <w:szCs w:val="24"/>
     </w:rPr>
     <w:tblPr>
       <w:tblStyleRowBandSize w:val="1"/>
@@ -48373,7 +48734,10 @@
       <w:spacing w:after="0" w:line="240" w:lineRule="auto"/>
     </w:pPr>
     <w:rPr>
+      <w:rFonts w:ascii="Lato" w:cs="Lato" w:eastAsia="Lato" w:hAnsi="Lato"/>
       <w:color w:themeColor="text1" w:val="000000"/>
+      <w:sz w:val="24"/>
+      <w:szCs w:val="24"/>
     </w:rPr>
     <w:tblPr>
       <w:tblStyleRowBandSize w:val="1"/>
@@ -48457,8 +48821,10 @@
       <w:spacing w:after="0" w:line="240" w:lineRule="auto"/>
     </w:pPr>
     <w:rPr>
-      <w:rFonts w:asciiTheme="majorHAnsi" w:cstheme="majorBidi" w:eastAsiaTheme="majorEastAsia" w:hAnsiTheme="majorHAnsi"/>
+      <w:rFonts w:ascii="Lato" w:asciiTheme="majorHAnsi" w:cs="Lato" w:cstheme="majorBidi" w:eastAsia="Lato" w:eastAsiaTheme="majorEastAsia" w:hAnsi="Lato" w:hAnsiTheme="majorHAnsi"/>
       <w:color w:themeColor="text1" w:val="000000"/>
+      <w:sz w:val="24"/>
+      <w:szCs w:val="24"/>
     </w:rPr>
     <w:tblPr>
       <w:tblStyleRowBandSize w:val="1"/>
@@ -48585,8 +48951,10 @@
       <w:spacing w:after="0" w:line="240" w:lineRule="auto"/>
     </w:pPr>
     <w:rPr>
-      <w:rFonts w:asciiTheme="majorHAnsi" w:cstheme="majorBidi" w:eastAsiaTheme="majorEastAsia" w:hAnsiTheme="majorHAnsi"/>
+      <w:rFonts w:ascii="Lato" w:asciiTheme="majorHAnsi" w:cs="Lato" w:cstheme="majorBidi" w:eastAsia="Lato" w:eastAsiaTheme="majorEastAsia" w:hAnsi="Lato" w:hAnsiTheme="majorHAnsi"/>
       <w:color w:themeColor="text1" w:val="000000"/>
+      <w:sz w:val="24"/>
+      <w:szCs w:val="24"/>
     </w:rPr>
     <w:tblPr>
       <w:tblStyleRowBandSize w:val="1"/>
@@ -48713,8 +49081,10 @@
       <w:spacing w:after="0" w:line="240" w:lineRule="auto"/>
     </w:pPr>
     <w:rPr>
-      <w:rFonts w:asciiTheme="majorHAnsi" w:cstheme="majorBidi" w:eastAsiaTheme="majorEastAsia" w:hAnsiTheme="majorHAnsi"/>
+      <w:rFonts w:ascii="Lato" w:asciiTheme="majorHAnsi" w:cs="Lato" w:cstheme="majorBidi" w:eastAsia="Lato" w:eastAsiaTheme="majorEastAsia" w:hAnsi="Lato" w:hAnsiTheme="majorHAnsi"/>
       <w:color w:themeColor="text1" w:val="000000"/>
+      <w:sz w:val="24"/>
+      <w:szCs w:val="24"/>
     </w:rPr>
     <w:tblPr>
       <w:tblStyleRowBandSize w:val="1"/>
@@ -48841,8 +49211,10 @@
       <w:spacing w:after="0" w:line="240" w:lineRule="auto"/>
     </w:pPr>
     <w:rPr>
-      <w:rFonts w:asciiTheme="majorHAnsi" w:cstheme="majorBidi" w:eastAsiaTheme="majorEastAsia" w:hAnsiTheme="majorHAnsi"/>
+      <w:rFonts w:ascii="Lato" w:asciiTheme="majorHAnsi" w:cs="Lato" w:cstheme="majorBidi" w:eastAsia="Lato" w:eastAsiaTheme="majorEastAsia" w:hAnsi="Lato" w:hAnsiTheme="majorHAnsi"/>
       <w:color w:themeColor="text1" w:val="000000"/>
+      <w:sz w:val="24"/>
+      <w:szCs w:val="24"/>
     </w:rPr>
     <w:tblPr>
       <w:tblStyleRowBandSize w:val="1"/>
@@ -48969,8 +49341,10 @@
       <w:spacing w:after="0" w:line="240" w:lineRule="auto"/>
     </w:pPr>
     <w:rPr>
-      <w:rFonts w:asciiTheme="majorHAnsi" w:cstheme="majorBidi" w:eastAsiaTheme="majorEastAsia" w:hAnsiTheme="majorHAnsi"/>
+      <w:rFonts w:ascii="Lato" w:asciiTheme="majorHAnsi" w:cs="Lato" w:cstheme="majorBidi" w:eastAsia="Lato" w:eastAsiaTheme="majorEastAsia" w:hAnsi="Lato" w:hAnsiTheme="majorHAnsi"/>
       <w:color w:themeColor="text1" w:val="000000"/>
+      <w:sz w:val="24"/>
+      <w:szCs w:val="24"/>
     </w:rPr>
     <w:tblPr>
       <w:tblStyleRowBandSize w:val="1"/>
@@ -49097,8 +49471,10 @@
       <w:spacing w:after="0" w:line="240" w:lineRule="auto"/>
     </w:pPr>
     <w:rPr>
-      <w:rFonts w:asciiTheme="majorHAnsi" w:cstheme="majorBidi" w:eastAsiaTheme="majorEastAsia" w:hAnsiTheme="majorHAnsi"/>
+      <w:rFonts w:ascii="Lato" w:asciiTheme="majorHAnsi" w:cs="Lato" w:cstheme="majorBidi" w:eastAsia="Lato" w:eastAsiaTheme="majorEastAsia" w:hAnsi="Lato" w:hAnsiTheme="majorHAnsi"/>
       <w:color w:themeColor="text1" w:val="000000"/>
+      <w:sz w:val="24"/>
+      <w:szCs w:val="24"/>
     </w:rPr>
     <w:tblPr>
       <w:tblStyleRowBandSize w:val="1"/>
@@ -49225,8 +49601,10 @@
       <w:spacing w:after="0" w:line="240" w:lineRule="auto"/>
     </w:pPr>
     <w:rPr>
-      <w:rFonts w:asciiTheme="majorHAnsi" w:cstheme="majorBidi" w:eastAsiaTheme="majorEastAsia" w:hAnsiTheme="majorHAnsi"/>
+      <w:rFonts w:ascii="Lato" w:asciiTheme="majorHAnsi" w:cs="Lato" w:cstheme="majorBidi" w:eastAsia="Lato" w:eastAsiaTheme="majorEastAsia" w:hAnsi="Lato" w:hAnsiTheme="majorHAnsi"/>
       <w:color w:themeColor="text1" w:val="000000"/>
+      <w:sz w:val="24"/>
+      <w:szCs w:val="24"/>
     </w:rPr>
     <w:tblPr>
       <w:tblStyleRowBandSize w:val="1"/>
@@ -49352,6 +49730,11 @@
     <w:pPr>
       <w:spacing w:after="0" w:line="240" w:lineRule="auto"/>
     </w:pPr>
+    <w:rPr>
+      <w:rFonts w:ascii="Lato" w:cs="Lato" w:eastAsia="Lato" w:hAnsi="Lato"/>
+      <w:sz w:val="24"/>
+      <w:szCs w:val="24"/>
+    </w:rPr>
     <w:tblPr>
       <w:tblStyleRowBandSize w:val="1"/>
       <w:tblStyleColBandSize w:val="1"/>
@@ -49425,6 +49808,11 @@
     <w:pPr>
       <w:spacing w:after="0" w:line="240" w:lineRule="auto"/>
     </w:pPr>
+    <w:rPr>
+      <w:rFonts w:ascii="Lato" w:cs="Lato" w:eastAsia="Lato" w:hAnsi="Lato"/>
+      <w:sz w:val="24"/>
+      <w:szCs w:val="24"/>
+    </w:rPr>
     <w:tblPr>
       <w:tblStyleRowBandSize w:val="1"/>
       <w:tblStyleColBandSize w:val="1"/>
@@ -49498,6 +49886,11 @@
     <w:pPr>
       <w:spacing w:after="0" w:line="240" w:lineRule="auto"/>
     </w:pPr>
+    <w:rPr>
+      <w:rFonts w:ascii="Lato" w:cs="Lato" w:eastAsia="Lato" w:hAnsi="Lato"/>
+      <w:sz w:val="24"/>
+      <w:szCs w:val="24"/>
+    </w:rPr>
     <w:tblPr>
       <w:tblStyleRowBandSize w:val="1"/>
       <w:tblStyleColBandSize w:val="1"/>
@@ -49571,6 +49964,11 @@
     <w:pPr>
       <w:spacing w:after="0" w:line="240" w:lineRule="auto"/>
     </w:pPr>
+    <w:rPr>
+      <w:rFonts w:ascii="Lato" w:cs="Lato" w:eastAsia="Lato" w:hAnsi="Lato"/>
+      <w:sz w:val="24"/>
+      <w:szCs w:val="24"/>
+    </w:rPr>
     <w:tblPr>
       <w:tblStyleRowBandSize w:val="1"/>
       <w:tblStyleColBandSize w:val="1"/>
@@ -49644,6 +50042,11 @@
     <w:pPr>
       <w:spacing w:after="0" w:line="240" w:lineRule="auto"/>
     </w:pPr>
+    <w:rPr>
+      <w:rFonts w:ascii="Lato" w:cs="Lato" w:eastAsia="Lato" w:hAnsi="Lato"/>
+      <w:sz w:val="24"/>
+      <w:szCs w:val="24"/>
+    </w:rPr>
     <w:tblPr>
       <w:tblStyleRowBandSize w:val="1"/>
       <w:tblStyleColBandSize w:val="1"/>
@@ -49717,6 +50120,11 @@
     <w:pPr>
       <w:spacing w:after="0" w:line="240" w:lineRule="auto"/>
     </w:pPr>
+    <w:rPr>
+      <w:rFonts w:ascii="Lato" w:cs="Lato" w:eastAsia="Lato" w:hAnsi="Lato"/>
+      <w:sz w:val="24"/>
+      <w:szCs w:val="24"/>
+    </w:rPr>
     <w:tblPr>
       <w:tblStyleRowBandSize w:val="1"/>
       <w:tblStyleColBandSize w:val="1"/>
@@ -49790,6 +50198,11 @@
     <w:pPr>
       <w:spacing w:after="0" w:line="240" w:lineRule="auto"/>
     </w:pPr>
+    <w:rPr>
+      <w:rFonts w:ascii="Lato" w:cs="Lato" w:eastAsia="Lato" w:hAnsi="Lato"/>
+      <w:sz w:val="24"/>
+      <w:szCs w:val="24"/>
+    </w:rPr>
     <w:tblPr>
       <w:tblStyleRowBandSize w:val="1"/>
       <w:tblStyleColBandSize w:val="1"/>
@@ -49864,8 +50277,10 @@
       <w:spacing w:after="0" w:line="240" w:lineRule="auto"/>
     </w:pPr>
     <w:rPr>
-      <w:rFonts w:asciiTheme="majorHAnsi" w:cstheme="majorBidi" w:eastAsiaTheme="majorEastAsia" w:hAnsiTheme="majorHAnsi"/>
+      <w:rFonts w:ascii="Lato" w:asciiTheme="majorHAnsi" w:cs="Lato" w:cstheme="majorBidi" w:eastAsia="Lato" w:eastAsiaTheme="majorEastAsia" w:hAnsi="Lato" w:hAnsiTheme="majorHAnsi"/>
       <w:color w:themeColor="text1" w:val="000000"/>
+      <w:sz w:val="24"/>
+      <w:szCs w:val="24"/>
     </w:rPr>
     <w:tblPr>
       <w:tblStyleRowBandSize w:val="1"/>
@@ -49989,8 +50404,10 @@
       <w:spacing w:after="0" w:line="240" w:lineRule="auto"/>
     </w:pPr>
     <w:rPr>
-      <w:rFonts w:asciiTheme="majorHAnsi" w:cstheme="majorBidi" w:eastAsiaTheme="majorEastAsia" w:hAnsiTheme="majorHAnsi"/>
+      <w:rFonts w:ascii="Lato" w:asciiTheme="majorHAnsi" w:cs="Lato" w:cstheme="majorBidi" w:eastAsia="Lato" w:eastAsiaTheme="majorEastAsia" w:hAnsi="Lato" w:hAnsiTheme="majorHAnsi"/>
       <w:color w:themeColor="text1" w:val="000000"/>
+      <w:sz w:val="24"/>
+      <w:szCs w:val="24"/>
     </w:rPr>
     <w:tblPr>
       <w:tblStyleRowBandSize w:val="1"/>
@@ -50114,8 +50531,10 @@
       <w:spacing w:after="0" w:line="240" w:lineRule="auto"/>
     </w:pPr>
     <w:rPr>
-      <w:rFonts w:asciiTheme="majorHAnsi" w:cstheme="majorBidi" w:eastAsiaTheme="majorEastAsia" w:hAnsiTheme="majorHAnsi"/>
+      <w:rFonts w:ascii="Lato" w:asciiTheme="majorHAnsi" w:cs="Lato" w:cstheme="majorBidi" w:eastAsia="Lato" w:eastAsiaTheme="majorEastAsia" w:hAnsi="Lato" w:hAnsiTheme="majorHAnsi"/>
       <w:color w:themeColor="text1" w:val="000000"/>
+      <w:sz w:val="24"/>
+      <w:szCs w:val="24"/>
     </w:rPr>
     <w:tblPr>
       <w:tblStyleRowBandSize w:val="1"/>
@@ -50239,8 +50658,10 @@
       <w:spacing w:after="0" w:line="240" w:lineRule="auto"/>
     </w:pPr>
     <w:rPr>
-      <w:rFonts w:asciiTheme="majorHAnsi" w:cstheme="majorBidi" w:eastAsiaTheme="majorEastAsia" w:hAnsiTheme="majorHAnsi"/>
+      <w:rFonts w:ascii="Lato" w:asciiTheme="majorHAnsi" w:cs="Lato" w:cstheme="majorBidi" w:eastAsia="Lato" w:eastAsiaTheme="majorEastAsia" w:hAnsi="Lato" w:hAnsiTheme="majorHAnsi"/>
       <w:color w:themeColor="text1" w:val="000000"/>
+      <w:sz w:val="24"/>
+      <w:szCs w:val="24"/>
     </w:rPr>
     <w:tblPr>
       <w:tblStyleRowBandSize w:val="1"/>
@@ -50364,8 +50785,10 @@
       <w:spacing w:after="0" w:line="240" w:lineRule="auto"/>
     </w:pPr>
     <w:rPr>
-      <w:rFonts w:asciiTheme="majorHAnsi" w:cstheme="majorBidi" w:eastAsiaTheme="majorEastAsia" w:hAnsiTheme="majorHAnsi"/>
+      <w:rFonts w:ascii="Lato" w:asciiTheme="majorHAnsi" w:cs="Lato" w:cstheme="majorBidi" w:eastAsia="Lato" w:eastAsiaTheme="majorEastAsia" w:hAnsi="Lato" w:hAnsiTheme="majorHAnsi"/>
       <w:color w:themeColor="text1" w:val="000000"/>
+      <w:sz w:val="24"/>
+      <w:szCs w:val="24"/>
     </w:rPr>
     <w:tblPr>
       <w:tblStyleRowBandSize w:val="1"/>
@@ -50489,8 +50912,10 @@
       <w:spacing w:after="0" w:line="240" w:lineRule="auto"/>
     </w:pPr>
     <w:rPr>
-      <w:rFonts w:asciiTheme="majorHAnsi" w:cstheme="majorBidi" w:eastAsiaTheme="majorEastAsia" w:hAnsiTheme="majorHAnsi"/>
+      <w:rFonts w:ascii="Lato" w:asciiTheme="majorHAnsi" w:cs="Lato" w:cstheme="majorBidi" w:eastAsia="Lato" w:eastAsiaTheme="majorEastAsia" w:hAnsi="Lato" w:hAnsiTheme="majorHAnsi"/>
       <w:color w:themeColor="text1" w:val="000000"/>
+      <w:sz w:val="24"/>
+      <w:szCs w:val="24"/>
     </w:rPr>
     <w:tblPr>
       <w:tblStyleRowBandSize w:val="1"/>
@@ -50614,8 +51039,10 @@
       <w:spacing w:after="0" w:line="240" w:lineRule="auto"/>
     </w:pPr>
     <w:rPr>
-      <w:rFonts w:asciiTheme="majorHAnsi" w:cstheme="majorBidi" w:eastAsiaTheme="majorEastAsia" w:hAnsiTheme="majorHAnsi"/>
+      <w:rFonts w:ascii="Lato" w:asciiTheme="majorHAnsi" w:cs="Lato" w:cstheme="majorBidi" w:eastAsia="Lato" w:eastAsiaTheme="majorEastAsia" w:hAnsi="Lato" w:hAnsiTheme="majorHAnsi"/>
       <w:color w:themeColor="text1" w:val="000000"/>
+      <w:sz w:val="24"/>
+      <w:szCs w:val="24"/>
     </w:rPr>
     <w:tblPr>
       <w:tblStyleRowBandSize w:val="1"/>
@@ -50738,6 +51165,11 @@
     <w:pPr>
       <w:spacing w:after="0" w:line="240" w:lineRule="auto"/>
     </w:pPr>
+    <w:rPr>
+      <w:rFonts w:ascii="Lato" w:cs="Lato" w:eastAsia="Lato" w:hAnsi="Lato"/>
+      <w:sz w:val="24"/>
+      <w:szCs w:val="24"/>
+    </w:rPr>
     <w:tblPr>
       <w:tblStyleRowBandSize w:val="1"/>
       <w:tblStyleColBandSize w:val="1"/>
@@ -50879,6 +51311,11 @@
     <w:pPr>
       <w:spacing w:after="0" w:line="240" w:lineRule="auto"/>
     </w:pPr>
+    <w:rPr>
+      <w:rFonts w:ascii="Lato" w:cs="Lato" w:eastAsia="Lato" w:hAnsi="Lato"/>
+      <w:sz w:val="24"/>
+      <w:szCs w:val="24"/>
+    </w:rPr>
     <w:tblPr>
       <w:tblStyleRowBandSize w:val="1"/>
       <w:tblStyleColBandSize w:val="1"/>
@@ -51020,6 +51457,11 @@
     <w:pPr>
       <w:spacing w:after="0" w:line="240" w:lineRule="auto"/>
     </w:pPr>
+    <w:rPr>
+      <w:rFonts w:ascii="Lato" w:cs="Lato" w:eastAsia="Lato" w:hAnsi="Lato"/>
+      <w:sz w:val="24"/>
+      <w:szCs w:val="24"/>
+    </w:rPr>
     <w:tblPr>
       <w:tblStyleRowBandSize w:val="1"/>
       <w:tblStyleColBandSize w:val="1"/>
@@ -51161,6 +51603,11 @@
     <w:pPr>
       <w:spacing w:after="0" w:line="240" w:lineRule="auto"/>
     </w:pPr>
+    <w:rPr>
+      <w:rFonts w:ascii="Lato" w:cs="Lato" w:eastAsia="Lato" w:hAnsi="Lato"/>
+      <w:sz w:val="24"/>
+      <w:szCs w:val="24"/>
+    </w:rPr>
     <w:tblPr>
       <w:tblStyleRowBandSize w:val="1"/>
       <w:tblStyleColBandSize w:val="1"/>
@@ -51302,6 +51749,11 @@
     <w:pPr>
       <w:spacing w:after="0" w:line="240" w:lineRule="auto"/>
     </w:pPr>
+    <w:rPr>
+      <w:rFonts w:ascii="Lato" w:cs="Lato" w:eastAsia="Lato" w:hAnsi="Lato"/>
+      <w:sz w:val="24"/>
+      <w:szCs w:val="24"/>
+    </w:rPr>
     <w:tblPr>
       <w:tblStyleRowBandSize w:val="1"/>
       <w:tblStyleColBandSize w:val="1"/>
@@ -51443,6 +51895,11 @@
     <w:pPr>
       <w:spacing w:after="0" w:line="240" w:lineRule="auto"/>
     </w:pPr>
+    <w:rPr>
+      <w:rFonts w:ascii="Lato" w:cs="Lato" w:eastAsia="Lato" w:hAnsi="Lato"/>
+      <w:sz w:val="24"/>
+      <w:szCs w:val="24"/>
+    </w:rPr>
     <w:tblPr>
       <w:tblStyleRowBandSize w:val="1"/>
       <w:tblStyleColBandSize w:val="1"/>
@@ -51584,6 +52041,11 @@
     <w:pPr>
       <w:spacing w:after="0" w:line="240" w:lineRule="auto"/>
     </w:pPr>
+    <w:rPr>
+      <w:rFonts w:ascii="Lato" w:cs="Lato" w:eastAsia="Lato" w:hAnsi="Lato"/>
+      <w:sz w:val="24"/>
+      <w:szCs w:val="24"/>
+    </w:rPr>
     <w:tblPr>
       <w:tblStyleRowBandSize w:val="1"/>
       <w:tblStyleColBandSize w:val="1"/>
@@ -51726,7 +52188,10 @@
       <w:spacing w:after="0" w:line="240" w:lineRule="auto"/>
     </w:pPr>
     <w:rPr>
+      <w:rFonts w:ascii="Lato" w:cs="Lato" w:eastAsia="Lato" w:hAnsi="Lato"/>
       <w:color w:themeColor="background1" w:val="FFFFFF"/>
+      <w:sz w:val="24"/>
+      <w:szCs w:val="24"/>
     </w:rPr>
     <w:tblPr>
       <w:tblStyleRowBandSize w:val="1"/>
@@ -51840,7 +52305,10 @@
       <w:spacing w:after="0" w:line="240" w:lineRule="auto"/>
     </w:pPr>
     <w:rPr>
+      <w:rFonts w:ascii="Lato" w:cs="Lato" w:eastAsia="Lato" w:hAnsi="Lato"/>
       <w:color w:themeColor="background1" w:val="FFFFFF"/>
+      <w:sz w:val="24"/>
+      <w:szCs w:val="24"/>
     </w:rPr>
     <w:tblPr>
       <w:tblStyleRowBandSize w:val="1"/>
@@ -51954,7 +52422,10 @@
       <w:spacing w:after="0" w:line="240" w:lineRule="auto"/>
     </w:pPr>
     <w:rPr>
+      <w:rFonts w:ascii="Lato" w:cs="Lato" w:eastAsia="Lato" w:hAnsi="Lato"/>
       <w:color w:themeColor="background1" w:val="FFFFFF"/>
+      <w:sz w:val="24"/>
+      <w:szCs w:val="24"/>
     </w:rPr>
     <w:tblPr>
       <w:tblStyleRowBandSize w:val="1"/>
@@ -52068,7 +52539,10 @@
       <w:spacing w:after="0" w:line="240" w:lineRule="auto"/>
     </w:pPr>
     <w:rPr>
+      <w:rFonts w:ascii="Lato" w:cs="Lato" w:eastAsia="Lato" w:hAnsi="Lato"/>
       <w:color w:themeColor="background1" w:val="FFFFFF"/>
+      <w:sz w:val="24"/>
+      <w:szCs w:val="24"/>
     </w:rPr>
     <w:tblPr>
       <w:tblStyleRowBandSize w:val="1"/>
@@ -52182,7 +52656,10 @@
       <w:spacing w:after="0" w:line="240" w:lineRule="auto"/>
     </w:pPr>
     <w:rPr>
+      <w:rFonts w:ascii="Lato" w:cs="Lato" w:eastAsia="Lato" w:hAnsi="Lato"/>
       <w:color w:themeColor="background1" w:val="FFFFFF"/>
+      <w:sz w:val="24"/>
+      <w:szCs w:val="24"/>
     </w:rPr>
     <w:tblPr>
       <w:tblStyleRowBandSize w:val="1"/>
@@ -52296,7 +52773,10 @@
       <w:spacing w:after="0" w:line="240" w:lineRule="auto"/>
     </w:pPr>
     <w:rPr>
+      <w:rFonts w:ascii="Lato" w:cs="Lato" w:eastAsia="Lato" w:hAnsi="Lato"/>
       <w:color w:themeColor="background1" w:val="FFFFFF"/>
+      <w:sz w:val="24"/>
+      <w:szCs w:val="24"/>
     </w:rPr>
     <w:tblPr>
       <w:tblStyleRowBandSize w:val="1"/>
@@ -52410,7 +52890,10 @@
       <w:spacing w:after="0" w:line="240" w:lineRule="auto"/>
     </w:pPr>
     <w:rPr>
+      <w:rFonts w:ascii="Lato" w:cs="Lato" w:eastAsia="Lato" w:hAnsi="Lato"/>
       <w:color w:themeColor="background1" w:val="FFFFFF"/>
+      <w:sz w:val="24"/>
+      <w:szCs w:val="24"/>
     </w:rPr>
     <w:tblPr>
       <w:tblStyleRowBandSize w:val="1"/>
@@ -52524,7 +53007,10 @@
       <w:spacing w:after="0" w:line="240" w:lineRule="auto"/>
     </w:pPr>
     <w:rPr>
+      <w:rFonts w:ascii="Lato" w:cs="Lato" w:eastAsia="Lato" w:hAnsi="Lato"/>
       <w:color w:themeColor="text1" w:val="000000"/>
+      <w:sz w:val="24"/>
+      <w:szCs w:val="24"/>
     </w:rPr>
     <w:tblPr>
       <w:tblStyleRowBandSize w:val="1"/>
@@ -52646,7 +53132,10 @@
       <w:spacing w:after="0" w:line="240" w:lineRule="auto"/>
     </w:pPr>
     <w:rPr>
+      <w:rFonts w:ascii="Lato" w:cs="Lato" w:eastAsia="Lato" w:hAnsi="Lato"/>
       <w:color w:themeColor="text1" w:val="000000"/>
+      <w:sz w:val="24"/>
+      <w:szCs w:val="24"/>
     </w:rPr>
     <w:tblPr>
       <w:tblStyleRowBandSize w:val="1"/>
@@ -52768,7 +53257,10 @@
       <w:spacing w:after="0" w:line="240" w:lineRule="auto"/>
     </w:pPr>
     <w:rPr>
+      <w:rFonts w:ascii="Lato" w:cs="Lato" w:eastAsia="Lato" w:hAnsi="Lato"/>
       <w:color w:themeColor="text1" w:val="000000"/>
+      <w:sz w:val="24"/>
+      <w:szCs w:val="24"/>
     </w:rPr>
     <w:tblPr>
       <w:tblStyleRowBandSize w:val="1"/>
@@ -52890,7 +53382,10 @@
       <w:spacing w:after="0" w:line="240" w:lineRule="auto"/>
     </w:pPr>
     <w:rPr>
+      <w:rFonts w:ascii="Lato" w:cs="Lato" w:eastAsia="Lato" w:hAnsi="Lato"/>
       <w:color w:themeColor="text1" w:val="000000"/>
+      <w:sz w:val="24"/>
+      <w:szCs w:val="24"/>
     </w:rPr>
     <w:tblPr>
       <w:tblStyleRowBandSize w:val="1"/>
@@ -53002,7 +53497,10 @@
       <w:spacing w:after="0" w:line="240" w:lineRule="auto"/>
     </w:pPr>
     <w:rPr>
+      <w:rFonts w:ascii="Lato" w:cs="Lato" w:eastAsia="Lato" w:hAnsi="Lato"/>
       <w:color w:themeColor="text1" w:val="000000"/>
+      <w:sz w:val="24"/>
+      <w:szCs w:val="24"/>
     </w:rPr>
     <w:tblPr>
       <w:tblStyleRowBandSize w:val="1"/>
@@ -53124,7 +53622,10 @@
       <w:spacing w:after="0" w:line="240" w:lineRule="auto"/>
     </w:pPr>
     <w:rPr>
+      <w:rFonts w:ascii="Lato" w:cs="Lato" w:eastAsia="Lato" w:hAnsi="Lato"/>
       <w:color w:themeColor="text1" w:val="000000"/>
+      <w:sz w:val="24"/>
+      <w:szCs w:val="24"/>
     </w:rPr>
     <w:tblPr>
       <w:tblStyleRowBandSize w:val="1"/>
@@ -53246,7 +53747,10 @@
       <w:spacing w:after="0" w:line="240" w:lineRule="auto"/>
     </w:pPr>
     <w:rPr>
+      <w:rFonts w:ascii="Lato" w:cs="Lato" w:eastAsia="Lato" w:hAnsi="Lato"/>
       <w:color w:themeColor="text1" w:val="000000"/>
+      <w:sz w:val="24"/>
+      <w:szCs w:val="24"/>
     </w:rPr>
     <w:tblPr>
       <w:tblStyleRowBandSize w:val="1"/>
@@ -53368,7 +53872,10 @@
       <w:spacing w:after="0" w:line="240" w:lineRule="auto"/>
     </w:pPr>
     <w:rPr>
+      <w:rFonts w:ascii="Lato" w:cs="Lato" w:eastAsia="Lato" w:hAnsi="Lato"/>
       <w:color w:themeColor="text1" w:val="000000"/>
+      <w:sz w:val="24"/>
+      <w:szCs w:val="24"/>
     </w:rPr>
     <w:tblPr>
       <w:tblStyleRowBandSize w:val="1"/>
@@ -53454,7 +53961,10 @@
       <w:spacing w:after="0" w:line="240" w:lineRule="auto"/>
     </w:pPr>
     <w:rPr>
+      <w:rFonts w:ascii="Lato" w:cs="Lato" w:eastAsia="Lato" w:hAnsi="Lato"/>
       <w:color w:themeColor="text1" w:val="000000"/>
+      <w:sz w:val="24"/>
+      <w:szCs w:val="24"/>
     </w:rPr>
     <w:tblPr>
       <w:tblStyleRowBandSize w:val="1"/>
@@ -53540,7 +54050,10 @@
       <w:spacing w:after="0" w:line="240" w:lineRule="auto"/>
     </w:pPr>
     <w:rPr>
+      <w:rFonts w:ascii="Lato" w:cs="Lato" w:eastAsia="Lato" w:hAnsi="Lato"/>
       <w:color w:themeColor="text1" w:val="000000"/>
+      <w:sz w:val="24"/>
+      <w:szCs w:val="24"/>
     </w:rPr>
     <w:tblPr>
       <w:tblStyleRowBandSize w:val="1"/>
@@ -53626,7 +54139,10 @@
       <w:spacing w:after="0" w:line="240" w:lineRule="auto"/>
     </w:pPr>
     <w:rPr>
+      <w:rFonts w:ascii="Lato" w:cs="Lato" w:eastAsia="Lato" w:hAnsi="Lato"/>
       <w:color w:themeColor="text1" w:val="000000"/>
+      <w:sz w:val="24"/>
+      <w:szCs w:val="24"/>
     </w:rPr>
     <w:tblPr>
       <w:tblStyleRowBandSize w:val="1"/>
@@ -53712,7 +54228,10 @@
       <w:spacing w:after="0" w:line="240" w:lineRule="auto"/>
     </w:pPr>
     <w:rPr>
+      <w:rFonts w:ascii="Lato" w:cs="Lato" w:eastAsia="Lato" w:hAnsi="Lato"/>
       <w:color w:themeColor="text1" w:val="000000"/>
+      <w:sz w:val="24"/>
+      <w:szCs w:val="24"/>
     </w:rPr>
     <w:tblPr>
       <w:tblStyleRowBandSize w:val="1"/>
@@ -53798,7 +54317,10 @@
       <w:spacing w:after="0" w:line="240" w:lineRule="auto"/>
     </w:pPr>
     <w:rPr>
+      <w:rFonts w:ascii="Lato" w:cs="Lato" w:eastAsia="Lato" w:hAnsi="Lato"/>
       <w:color w:themeColor="text1" w:val="000000"/>
+      <w:sz w:val="24"/>
+      <w:szCs w:val="24"/>
     </w:rPr>
     <w:tblPr>
       <w:tblStyleRowBandSize w:val="1"/>
@@ -53884,7 +54406,10 @@
       <w:spacing w:after="0" w:line="240" w:lineRule="auto"/>
     </w:pPr>
     <w:rPr>
+      <w:rFonts w:ascii="Lato" w:cs="Lato" w:eastAsia="Lato" w:hAnsi="Lato"/>
       <w:color w:themeColor="text1" w:val="000000"/>
+      <w:sz w:val="24"/>
+      <w:szCs w:val="24"/>
     </w:rPr>
     <w:tblPr>
       <w:tblStyleRowBandSize w:val="1"/>
@@ -53970,7 +54495,10 @@
       <w:spacing w:after="0" w:line="240" w:lineRule="auto"/>
     </w:pPr>
     <w:rPr>
+      <w:rFonts w:ascii="Lato" w:cs="Lato" w:eastAsia="Lato" w:hAnsi="Lato"/>
       <w:color w:themeColor="text1" w:val="000000"/>
+      <w:sz w:val="24"/>
+      <w:szCs w:val="24"/>
     </w:rPr>
     <w:tblPr>
       <w:tblStyleRowBandSize w:val="1"/>
@@ -54050,7 +54578,10 @@
       <w:spacing w:after="0" w:line="240" w:lineRule="auto"/>
     </w:pPr>
     <w:rPr>
+      <w:rFonts w:ascii="Lato" w:cs="Lato" w:eastAsia="Lato" w:hAnsi="Lato"/>
       <w:color w:themeColor="text1" w:val="000000"/>
+      <w:sz w:val="24"/>
+      <w:szCs w:val="24"/>
     </w:rPr>
     <w:tblPr>
       <w:tblStyleRowBandSize w:val="1"/>
@@ -54130,7 +54661,10 @@
       <w:spacing w:after="0" w:line="240" w:lineRule="auto"/>
     </w:pPr>
     <w:rPr>
+      <w:rFonts w:ascii="Lato" w:cs="Lato" w:eastAsia="Lato" w:hAnsi="Lato"/>
       <w:color w:themeColor="text1" w:val="000000"/>
+      <w:sz w:val="24"/>
+      <w:szCs w:val="24"/>
     </w:rPr>
     <w:tblPr>
       <w:tblStyleRowBandSize w:val="1"/>
@@ -54210,7 +54744,10 @@
       <w:spacing w:after="0" w:line="240" w:lineRule="auto"/>
     </w:pPr>
     <w:rPr>
+      <w:rFonts w:ascii="Lato" w:cs="Lato" w:eastAsia="Lato" w:hAnsi="Lato"/>
       <w:color w:themeColor="text1" w:val="000000"/>
+      <w:sz w:val="24"/>
+      <w:szCs w:val="24"/>
     </w:rPr>
     <w:tblPr>
       <w:tblStyleRowBandSize w:val="1"/>
@@ -54290,7 +54827,10 @@
       <w:spacing w:after="0" w:line="240" w:lineRule="auto"/>
     </w:pPr>
     <w:rPr>
+      <w:rFonts w:ascii="Lato" w:cs="Lato" w:eastAsia="Lato" w:hAnsi="Lato"/>
       <w:color w:themeColor="text1" w:val="000000"/>
+      <w:sz w:val="24"/>
+      <w:szCs w:val="24"/>
     </w:rPr>
     <w:tblPr>
       <w:tblStyleRowBandSize w:val="1"/>
@@ -54370,7 +54910,10 @@
       <w:spacing w:after="0" w:line="240" w:lineRule="auto"/>
     </w:pPr>
     <w:rPr>
+      <w:rFonts w:ascii="Lato" w:cs="Lato" w:eastAsia="Lato" w:hAnsi="Lato"/>
       <w:color w:themeColor="text1" w:val="000000"/>
+      <w:sz w:val="24"/>
+      <w:szCs w:val="24"/>
     </w:rPr>
     <w:tblPr>
       <w:tblStyleRowBandSize w:val="1"/>
@@ -54450,7 +54993,10 @@
       <w:spacing w:after="0" w:line="240" w:lineRule="auto"/>
     </w:pPr>
     <w:rPr>
+      <w:rFonts w:ascii="Lato" w:cs="Lato" w:eastAsia="Lato" w:hAnsi="Lato"/>
       <w:color w:themeColor="text1" w:val="000000"/>
+      <w:sz w:val="24"/>
+      <w:szCs w:val="24"/>
     </w:rPr>
     <w:tblPr>
       <w:tblStyleRowBandSize w:val="1"/>
@@ -54535,233 +55081,330 @@
       <w:rFonts w:ascii="Lato" w:hAnsi="Lato" w:eastAsia="Lato" w:cs="Lato"/>
       <w:color w:val="1F2937"/>
       <w:sz w:val="24"/>
+      <w:szCs w:val="24"/>
     </w:rPr>
   </w:style>
   <w:style w:type="character" w:customStyle="1" w:styleId="KeywordTok">
     <w:name w:val="KeywordTok"/>
     <w:basedOn w:val="VerbatimChar"/>
     <w:rPr>
+      <w:rFonts w:ascii="Lato" w:hAnsi="Lato" w:eastAsia="Lato" w:cs="Lato"/>
       <w:b/>
       <w:color w:val="007020"/>
+      <w:sz w:val="24"/>
+      <w:szCs w:val="24"/>
     </w:rPr>
   </w:style>
   <w:style w:type="character" w:customStyle="1" w:styleId="DataTypeTok">
     <w:name w:val="DataTypeTok"/>
     <w:basedOn w:val="VerbatimChar"/>
     <w:rPr>
+      <w:rFonts w:ascii="Lato" w:hAnsi="Lato" w:eastAsia="Lato" w:cs="Lato"/>
       <w:color w:val="902000"/>
+      <w:sz w:val="24"/>
+      <w:szCs w:val="24"/>
     </w:rPr>
   </w:style>
   <w:style w:type="character" w:customStyle="1" w:styleId="DecValTok">
     <w:name w:val="DecValTok"/>
     <w:basedOn w:val="VerbatimChar"/>
     <w:rPr>
+      <w:rFonts w:ascii="Lato" w:hAnsi="Lato" w:eastAsia="Lato" w:cs="Lato"/>
       <w:color w:val="40a070"/>
+      <w:sz w:val="24"/>
+      <w:szCs w:val="24"/>
     </w:rPr>
   </w:style>
   <w:style w:type="character" w:customStyle="1" w:styleId="BaseNTok">
     <w:name w:val="BaseNTok"/>
     <w:basedOn w:val="VerbatimChar"/>
     <w:rPr>
+      <w:rFonts w:ascii="Lato" w:hAnsi="Lato" w:eastAsia="Lato" w:cs="Lato"/>
       <w:color w:val="40a070"/>
+      <w:sz w:val="24"/>
+      <w:szCs w:val="24"/>
     </w:rPr>
   </w:style>
   <w:style w:type="character" w:customStyle="1" w:styleId="FloatTok">
     <w:name w:val="FloatTok"/>
     <w:basedOn w:val="VerbatimChar"/>
     <w:rPr>
+      <w:rFonts w:ascii="Lato" w:hAnsi="Lato" w:eastAsia="Lato" w:cs="Lato"/>
       <w:color w:val="40a070"/>
+      <w:sz w:val="24"/>
+      <w:szCs w:val="24"/>
     </w:rPr>
   </w:style>
   <w:style w:type="character" w:customStyle="1" w:styleId="ConstantTok">
     <w:name w:val="ConstantTok"/>
     <w:basedOn w:val="VerbatimChar"/>
     <w:rPr>
+      <w:rFonts w:ascii="Lato" w:hAnsi="Lato" w:eastAsia="Lato" w:cs="Lato"/>
       <w:color w:val="880000"/>
+      <w:sz w:val="24"/>
+      <w:szCs w:val="24"/>
     </w:rPr>
   </w:style>
   <w:style w:type="character" w:customStyle="1" w:styleId="CharTok">
     <w:name w:val="CharTok"/>
     <w:basedOn w:val="VerbatimChar"/>
     <w:rPr>
+      <w:rFonts w:ascii="Lato" w:hAnsi="Lato" w:eastAsia="Lato" w:cs="Lato"/>
       <w:color w:val="4070a0"/>
+      <w:sz w:val="24"/>
+      <w:szCs w:val="24"/>
     </w:rPr>
   </w:style>
   <w:style w:type="character" w:customStyle="1" w:styleId="SpecialCharTok">
     <w:name w:val="SpecialCharTok"/>
     <w:basedOn w:val="VerbatimChar"/>
     <w:rPr>
+      <w:rFonts w:ascii="Lato" w:hAnsi="Lato" w:eastAsia="Lato" w:cs="Lato"/>
       <w:color w:val="4070a0"/>
+      <w:sz w:val="24"/>
+      <w:szCs w:val="24"/>
     </w:rPr>
   </w:style>
   <w:style w:type="character" w:customStyle="1" w:styleId="StringTok">
     <w:name w:val="StringTok"/>
     <w:basedOn w:val="VerbatimChar"/>
     <w:rPr>
+      <w:rFonts w:ascii="Lato" w:hAnsi="Lato" w:eastAsia="Lato" w:cs="Lato"/>
       <w:color w:val="4070a0"/>
+      <w:sz w:val="24"/>
+      <w:szCs w:val="24"/>
     </w:rPr>
   </w:style>
   <w:style w:type="character" w:customStyle="1" w:styleId="VerbatimStringTok">
     <w:name w:val="VerbatimStringTok"/>
     <w:basedOn w:val="VerbatimChar"/>
     <w:rPr>
+      <w:rFonts w:ascii="Lato" w:hAnsi="Lato" w:eastAsia="Lato" w:cs="Lato"/>
       <w:color w:val="4070a0"/>
+      <w:sz w:val="24"/>
+      <w:szCs w:val="24"/>
     </w:rPr>
   </w:style>
   <w:style w:type="character" w:customStyle="1" w:styleId="SpecialStringTok">
     <w:name w:val="SpecialStringTok"/>
     <w:basedOn w:val="VerbatimChar"/>
     <w:rPr>
+      <w:rFonts w:ascii="Lato" w:hAnsi="Lato" w:eastAsia="Lato" w:cs="Lato"/>
       <w:color w:val="bb6688"/>
+      <w:sz w:val="24"/>
+      <w:szCs w:val="24"/>
     </w:rPr>
   </w:style>
   <w:style w:type="character" w:customStyle="1" w:styleId="ImportTok">
     <w:name w:val="ImportTok"/>
     <w:basedOn w:val="VerbatimChar"/>
     <w:rPr>
+      <w:rFonts w:ascii="Lato" w:hAnsi="Lato" w:eastAsia="Lato" w:cs="Lato"/>
       <w:b/>
       <w:color w:val="008000"/>
+      <w:sz w:val="24"/>
+      <w:szCs w:val="24"/>
     </w:rPr>
   </w:style>
   <w:style w:type="character" w:customStyle="1" w:styleId="CommentTok">
     <w:name w:val="CommentTok"/>
     <w:basedOn w:val="VerbatimChar"/>
     <w:rPr>
+      <w:rFonts w:ascii="Lato" w:hAnsi="Lato" w:eastAsia="Lato" w:cs="Lato"/>
       <w:i/>
       <w:color w:val="60a0b0"/>
+      <w:sz w:val="24"/>
+      <w:szCs w:val="24"/>
     </w:rPr>
   </w:style>
   <w:style w:type="character" w:customStyle="1" w:styleId="DocumentationTok">
     <w:name w:val="DocumentationTok"/>
     <w:basedOn w:val="VerbatimChar"/>
     <w:rPr>
+      <w:rFonts w:ascii="Lato" w:hAnsi="Lato" w:eastAsia="Lato" w:cs="Lato"/>
       <w:i/>
       <w:color w:val="ba2121"/>
+      <w:sz w:val="24"/>
+      <w:szCs w:val="24"/>
     </w:rPr>
   </w:style>
   <w:style w:type="character" w:customStyle="1" w:styleId="AnnotationTok">
     <w:name w:val="AnnotationTok"/>
     <w:basedOn w:val="VerbatimChar"/>
     <w:rPr>
+      <w:rFonts w:ascii="Lato" w:hAnsi="Lato" w:eastAsia="Lato" w:cs="Lato"/>
       <w:b/>
       <w:i/>
       <w:color w:val="60a0b0"/>
+      <w:sz w:val="24"/>
+      <w:szCs w:val="24"/>
     </w:rPr>
   </w:style>
   <w:style w:type="character" w:customStyle="1" w:styleId="CommentVarTok">
     <w:name w:val="CommentVarTok"/>
     <w:basedOn w:val="VerbatimChar"/>
     <w:rPr>
+      <w:rFonts w:ascii="Lato" w:hAnsi="Lato" w:eastAsia="Lato" w:cs="Lato"/>
       <w:b/>
       <w:i/>
       <w:color w:val="60a0b0"/>
+      <w:sz w:val="24"/>
+      <w:szCs w:val="24"/>
     </w:rPr>
   </w:style>
   <w:style w:type="character" w:customStyle="1" w:styleId="OtherTok">
     <w:name w:val="OtherTok"/>
     <w:basedOn w:val="VerbatimChar"/>
     <w:rPr>
+      <w:rFonts w:ascii="Lato" w:hAnsi="Lato" w:eastAsia="Lato" w:cs="Lato"/>
       <w:color w:val="007020"/>
+      <w:sz w:val="24"/>
+      <w:szCs w:val="24"/>
     </w:rPr>
   </w:style>
   <w:style w:type="character" w:customStyle="1" w:styleId="FunctionTok">
     <w:name w:val="FunctionTok"/>
     <w:basedOn w:val="VerbatimChar"/>
     <w:rPr>
+      <w:rFonts w:ascii="Lato" w:hAnsi="Lato" w:eastAsia="Lato" w:cs="Lato"/>
       <w:color w:val="06287e"/>
+      <w:sz w:val="24"/>
+      <w:szCs w:val="24"/>
     </w:rPr>
   </w:style>
   <w:style w:type="character" w:customStyle="1" w:styleId="VariableTok">
     <w:name w:val="VariableTok"/>
     <w:basedOn w:val="VerbatimChar"/>
     <w:rPr>
+      <w:rFonts w:ascii="Lato" w:hAnsi="Lato" w:eastAsia="Lato" w:cs="Lato"/>
       <w:color w:val="19177c"/>
+      <w:sz w:val="24"/>
+      <w:szCs w:val="24"/>
     </w:rPr>
   </w:style>
   <w:style w:type="character" w:customStyle="1" w:styleId="ControlFlowTok">
     <w:name w:val="ControlFlowTok"/>
     <w:basedOn w:val="VerbatimChar"/>
     <w:rPr>
+      <w:rFonts w:ascii="Lato" w:hAnsi="Lato" w:eastAsia="Lato" w:cs="Lato"/>
       <w:b/>
       <w:color w:val="007020"/>
+      <w:sz w:val="24"/>
+      <w:szCs w:val="24"/>
     </w:rPr>
   </w:style>
   <w:style w:type="character" w:customStyle="1" w:styleId="OperatorTok">
     <w:name w:val="OperatorTok"/>
     <w:basedOn w:val="VerbatimChar"/>
     <w:rPr>
+      <w:rFonts w:ascii="Lato" w:hAnsi="Lato" w:eastAsia="Lato" w:cs="Lato"/>
       <w:color w:val="666666"/>
+      <w:sz w:val="24"/>
+      <w:szCs w:val="24"/>
     </w:rPr>
   </w:style>
   <w:style w:type="character" w:customStyle="1" w:styleId="BuiltInTok">
     <w:name w:val="BuiltInTok"/>
     <w:basedOn w:val="VerbatimChar"/>
     <w:rPr>
+      <w:rFonts w:ascii="Lato" w:hAnsi="Lato" w:eastAsia="Lato" w:cs="Lato"/>
       <w:color w:val="008000"/>
+      <w:sz w:val="24"/>
+      <w:szCs w:val="24"/>
     </w:rPr>
   </w:style>
   <w:style w:type="character" w:customStyle="1" w:styleId="ExtensionTok">
     <w:name w:val="ExtensionTok"/>
     <w:basedOn w:val="VerbatimChar"/>
-    <w:rPr/>
+    <w:rPr>
+      <w:rFonts w:ascii="Lato" w:hAnsi="Lato" w:eastAsia="Lato" w:cs="Lato"/>
+      <w:sz w:val="24"/>
+      <w:szCs w:val="24"/>
+    </w:rPr>
   </w:style>
   <w:style w:type="character" w:customStyle="1" w:styleId="PreprocessorTok">
     <w:name w:val="PreprocessorTok"/>
     <w:basedOn w:val="VerbatimChar"/>
     <w:rPr>
+      <w:rFonts w:ascii="Lato" w:hAnsi="Lato" w:eastAsia="Lato" w:cs="Lato"/>
       <w:color w:val="bc7a00"/>
+      <w:sz w:val="24"/>
+      <w:szCs w:val="24"/>
     </w:rPr>
   </w:style>
   <w:style w:type="character" w:customStyle="1" w:styleId="AttributeTok">
     <w:name w:val="AttributeTok"/>
     <w:basedOn w:val="VerbatimChar"/>
     <w:rPr>
+      <w:rFonts w:ascii="Lato" w:hAnsi="Lato" w:eastAsia="Lato" w:cs="Lato"/>
       <w:color w:val="7d9029"/>
+      <w:sz w:val="24"/>
+      <w:szCs w:val="24"/>
     </w:rPr>
   </w:style>
   <w:style w:type="character" w:customStyle="1" w:styleId="RegionMarkerTok">
     <w:name w:val="RegionMarkerTok"/>
     <w:basedOn w:val="VerbatimChar"/>
-    <w:rPr/>
+    <w:rPr>
+      <w:rFonts w:ascii="Lato" w:hAnsi="Lato" w:eastAsia="Lato" w:cs="Lato"/>
+      <w:sz w:val="24"/>
+      <w:szCs w:val="24"/>
+    </w:rPr>
   </w:style>
   <w:style w:type="character" w:customStyle="1" w:styleId="InformationTok">
     <w:name w:val="InformationTok"/>
     <w:basedOn w:val="VerbatimChar"/>
     <w:rPr>
+      <w:rFonts w:ascii="Lato" w:hAnsi="Lato" w:eastAsia="Lato" w:cs="Lato"/>
       <w:b/>
       <w:i/>
       <w:color w:val="60a0b0"/>
+      <w:sz w:val="24"/>
+      <w:szCs w:val="24"/>
     </w:rPr>
   </w:style>
   <w:style w:type="character" w:customStyle="1" w:styleId="WarningTok">
     <w:name w:val="WarningTok"/>
     <w:basedOn w:val="VerbatimChar"/>
     <w:rPr>
+      <w:rFonts w:ascii="Lato" w:hAnsi="Lato" w:eastAsia="Lato" w:cs="Lato"/>
       <w:b/>
       <w:i/>
       <w:color w:val="60a0b0"/>
+      <w:sz w:val="24"/>
+      <w:szCs w:val="24"/>
     </w:rPr>
   </w:style>
   <w:style w:type="character" w:customStyle="1" w:styleId="AlertTok">
     <w:name w:val="AlertTok"/>
     <w:basedOn w:val="VerbatimChar"/>
     <w:rPr>
+      <w:rFonts w:ascii="Lato" w:hAnsi="Lato" w:eastAsia="Lato" w:cs="Lato"/>
       <w:b/>
       <w:color w:val="ff0000"/>
+      <w:sz w:val="24"/>
+      <w:szCs w:val="24"/>
     </w:rPr>
   </w:style>
   <w:style w:type="character" w:customStyle="1" w:styleId="ErrorTok">
     <w:name w:val="ErrorTok"/>
     <w:basedOn w:val="VerbatimChar"/>
     <w:rPr>
+      <w:rFonts w:ascii="Lato" w:hAnsi="Lato" w:eastAsia="Lato" w:cs="Lato"/>
       <w:b/>
       <w:color w:val="ff0000"/>
+      <w:sz w:val="24"/>
+      <w:szCs w:val="24"/>
     </w:rPr>
   </w:style>
   <w:style w:type="character" w:customStyle="1" w:styleId="NormalTok">
     <w:name w:val="NormalTok"/>
     <w:basedOn w:val="VerbatimChar"/>
-    <w:rPr/>
+    <w:rPr>
+      <w:rFonts w:ascii="Lato" w:hAnsi="Lato" w:eastAsia="Lato" w:cs="Lato"/>
+      <w:sz w:val="24"/>
+      <w:szCs w:val="24"/>
+    </w:rPr>
   </w:style>
 </w:styles>
 </file>

</xml_diff>

<commit_message>
feat: release multiagent mesh 1.10.0
</commit_message>
<xml_diff>
--- a/assets/Manual-completo-comandos-multiagente.docx
+++ b/assets/Manual-completo-comandos-multiagente.docx
@@ -680,39 +680,39 @@
           <w:sz w:val="24"/>
           <w:szCs w:val="24"/>
         </w:rPr>
-        <w:t xml:space="preserve">Codex CLI, Gemini CLI, Antigravity, Kimi Code, OpenCode e Cursor CLI. O Grok é</w:t>
-      </w:r>
-      <w:r>
-        <w:rPr>
-          <w:rFonts w:ascii="Lato" w:hAnsi="Lato" w:eastAsia="Lato" w:cs="Lato"/>
-          <w:sz w:val="24"/>
-          <w:szCs w:val="24"/>
-        </w:rPr>
-        <w:t xml:space="preserve"> </w:t>
-      </w:r>
-      <w:r>
-        <w:rPr>
-          <w:rFonts w:ascii="Lato" w:hAnsi="Lato" w:eastAsia="Lato" w:cs="Lato"/>
-          <w:sz w:val="24"/>
-          <w:szCs w:val="24"/>
-        </w:rPr>
-        <w:t xml:space="preserve">acionado canonicamente pelo Cursor; a instalação no Grok CLI direto é mantida</w:t>
-      </w:r>
-      <w:r>
-        <w:rPr>
-          <w:rFonts w:ascii="Lato" w:hAnsi="Lato" w:eastAsia="Lato" w:cs="Lato"/>
-          <w:sz w:val="24"/>
-          <w:szCs w:val="24"/>
-        </w:rPr>
-        <w:t xml:space="preserve"> </w:t>
-      </w:r>
-      <w:r>
-        <w:rPr>
-          <w:rFonts w:ascii="Lato" w:hAnsi="Lato" w:eastAsia="Lato" w:cs="Lato"/>
-          <w:sz w:val="24"/>
-          <w:szCs w:val="24"/>
-        </w:rPr>
-        <w:t xml:space="preserve">apenas como compatibilidade legada. O objetivo é</w:t>
+        <w:t xml:space="preserve">Codex CLI, Gemini CLI, Antigravity, Kimi Code, OpenCode, Cursor CLI e a CLI oficial</w:t>
+      </w:r>
+      <w:r>
+        <w:rPr>
+          <w:rFonts w:ascii="Lato" w:hAnsi="Lato" w:eastAsia="Lato" w:cs="Lato"/>
+          <w:sz w:val="24"/>
+          <w:szCs w:val="24"/>
+        </w:rPr>
+        <w:t xml:space="preserve"> </w:t>
+      </w:r>
+      <w:r>
+        <w:rPr>
+          <w:rFonts w:ascii="Lato" w:hAnsi="Lato" w:eastAsia="Lato" w:cs="Lato"/>
+          <w:sz w:val="24"/>
+          <w:szCs w:val="24"/>
+        </w:rPr>
+        <w:t xml:space="preserve">do Grok. O Grok usa o Cursor por padrão, mas o painel permite escolher explicitamente</w:t>
+      </w:r>
+      <w:r>
+        <w:rPr>
+          <w:rFonts w:ascii="Lato" w:hAnsi="Lato" w:eastAsia="Lato" w:cs="Lato"/>
+          <w:sz w:val="24"/>
+          <w:szCs w:val="24"/>
+        </w:rPr>
+        <w:t xml:space="preserve"> </w:t>
+      </w:r>
+      <w:r>
+        <w:rPr>
+          <w:rFonts w:ascii="Lato" w:hAnsi="Lato" w:eastAsia="Lato" w:cs="Lato"/>
+          <w:sz w:val="24"/>
+          <w:szCs w:val="24"/>
+        </w:rPr>
+        <w:t xml:space="preserve">a rota oficial da xAI, sem fallback silencioso. O objetivo é</w:t>
       </w:r>
       <w:r>
         <w:rPr>
@@ -4223,23 +4223,39 @@
           <w:sz w:val="24"/>
           <w:szCs w:val="24"/>
         </w:rPr>
-        <w:t xml:space="preserve">As rotas obrigatórias são Claude pelo Claude Code, Grok pelo Cursor no modelo</w:t>
-      </w:r>
-      <w:r>
-        <w:rPr>
-          <w:rFonts w:ascii="Lato" w:hAnsi="Lato" w:eastAsia="Lato" w:cs="Lato"/>
-          <w:sz w:val="24"/>
-          <w:szCs w:val="24"/>
-        </w:rPr>
-        <w:t xml:space="preserve"> </w:t>
-      </w:r>
-      <w:r>
-        <w:rPr>
-          <w:rFonts w:ascii="Lato" w:hAnsi="Lato" w:eastAsia="Lato" w:cs="Lato"/>
-          <w:sz w:val="24"/>
-          <w:szCs w:val="24"/>
-        </w:rPr>
-        <w:t xml:space="preserve">fixo</w:t>
+        <w:t xml:space="preserve">As rotas obrigatórias são Claude pelo Claude Code, Kimi K3 pelo Kimi Code e Gemini</w:t>
+      </w:r>
+      <w:r>
+        <w:rPr>
+          <w:rFonts w:ascii="Lato" w:hAnsi="Lato" w:eastAsia="Lato" w:cs="Lato"/>
+          <w:sz w:val="24"/>
+          <w:szCs w:val="24"/>
+        </w:rPr>
+        <w:t xml:space="preserve"> </w:t>
+      </w:r>
+      <w:r>
+        <w:rPr>
+          <w:rFonts w:ascii="Lato" w:hAnsi="Lato" w:eastAsia="Lato" w:cs="Lato"/>
+          <w:sz w:val="24"/>
+          <w:szCs w:val="24"/>
+        </w:rPr>
+        <w:t xml:space="preserve">3.7 Flash High pelo Antigravity. O Grok oferece duas rotas fixas e identificadas:</w:t>
+      </w:r>
+      <w:r>
+        <w:rPr>
+          <w:rFonts w:ascii="Lato" w:hAnsi="Lato" w:eastAsia="Lato" w:cs="Lato"/>
+          <w:sz w:val="24"/>
+          <w:szCs w:val="24"/>
+        </w:rPr>
+        <w:t xml:space="preserve"> </w:t>
+      </w:r>
+      <w:r>
+        <w:rPr>
+          <w:rFonts w:ascii="Lato" w:hAnsi="Lato" w:eastAsia="Lato" w:cs="Lato"/>
+          <w:sz w:val="24"/>
+          <w:szCs w:val="24"/>
+        </w:rPr>
+        <w:t xml:space="preserve">Cursor com</w:t>
       </w:r>
       <w:r>
         <w:rPr>
@@ -4264,23 +4280,73 @@
           <w:sz w:val="24"/>
           <w:szCs w:val="24"/>
         </w:rPr>
-        <w:t xml:space="preserve">, Kimi K3 pelo Kimi Code e Gemini 3.7 Flash High</w:t>
-      </w:r>
-      <w:r>
-        <w:rPr>
-          <w:rFonts w:ascii="Lato" w:hAnsi="Lato" w:eastAsia="Lato" w:cs="Lato"/>
-          <w:sz w:val="24"/>
-          <w:szCs w:val="24"/>
-        </w:rPr>
-        <w:t xml:space="preserve"> </w:t>
-      </w:r>
-      <w:r>
-        <w:rPr>
-          <w:rFonts w:ascii="Lato" w:hAnsi="Lato" w:eastAsia="Lato" w:cs="Lato"/>
-          <w:sz w:val="24"/>
-          <w:szCs w:val="24"/>
-        </w:rPr>
-        <w:t xml:space="preserve">pelo Antigravity.</w:t>
+        <w:t xml:space="preserve"> </w:t>
+      </w:r>
+      <w:r>
+        <w:rPr>
+          <w:rFonts w:ascii="Lato" w:hAnsi="Lato" w:eastAsia="Lato" w:cs="Lato"/>
+          <w:sz w:val="24"/>
+          <w:szCs w:val="24"/>
+        </w:rPr>
+        <w:t xml:space="preserve">ou CLI oficial da xAI com</w:t>
+      </w:r>
+      <w:r>
+        <w:rPr>
+          <w:rFonts w:ascii="Lato" w:hAnsi="Lato" w:eastAsia="Lato" w:cs="Lato"/>
+          <w:sz w:val="24"/>
+          <w:szCs w:val="24"/>
+        </w:rPr>
+        <w:t xml:space="preserve"> </w:t>
+      </w:r>
+      <w:r>
+        <w:rPr>
+          <w:rFonts w:ascii="Lato" w:hAnsi="Lato" w:eastAsia="Lato" w:cs="Lato"/>
+          <w:rStyle w:val="VerbatimChar"/>
+          <w:sz w:val="24"/>
+          <w:szCs w:val="24"/>
+        </w:rPr>
+        <w:t xml:space="preserve">grok-4.6</w:t>
+      </w:r>
+      <w:r>
+        <w:rPr>
+          <w:rFonts w:ascii="Lato" w:hAnsi="Lato" w:eastAsia="Lato" w:cs="Lato"/>
+          <w:sz w:val="24"/>
+          <w:szCs w:val="24"/>
+        </w:rPr>
+        <w:t xml:space="preserve"> </w:t>
+      </w:r>
+      <w:r>
+        <w:rPr>
+          <w:rFonts w:ascii="Lato" w:hAnsi="Lato" w:eastAsia="Lato" w:cs="Lato"/>
+          <w:sz w:val="24"/>
+          <w:szCs w:val="24"/>
+        </w:rPr>
+        <w:t xml:space="preserve">e esforço</w:t>
+      </w:r>
+      <w:r>
+        <w:rPr>
+          <w:rFonts w:ascii="Lato" w:hAnsi="Lato" w:eastAsia="Lato" w:cs="Lato"/>
+          <w:sz w:val="24"/>
+          <w:szCs w:val="24"/>
+        </w:rPr>
+        <w:t xml:space="preserve"> </w:t>
+      </w:r>
+      <w:r>
+        <w:rPr>
+          <w:rFonts w:ascii="Lato" w:hAnsi="Lato" w:eastAsia="Lato" w:cs="Lato"/>
+          <w:rStyle w:val="VerbatimChar"/>
+          <w:sz w:val="24"/>
+          <w:szCs w:val="24"/>
+        </w:rPr>
+        <w:t xml:space="preserve">xhigh</w:t>
+      </w:r>
+      <w:r>
+        <w:rPr>
+          <w:rFonts w:ascii="Lato" w:hAnsi="Lato" w:eastAsia="Lato" w:cs="Lato"/>
+          <w:sz w:val="24"/>
+          <w:szCs w:val="24"/>
+        </w:rPr>
+        <w:t xml:space="preserve">.</w:t>
       </w:r>
     </w:p>
     <w:p>
@@ -4296,23 +4362,23 @@
           <w:sz w:val="24"/>
           <w:szCs w:val="24"/>
         </w:rPr>
-        <w:t xml:space="preserve">Para novas chamadas, outro modelo Grok é rejeitado; runs históricos já congelados preservam o modelo</w:t>
-      </w:r>
-      <w:r>
-        <w:rPr>
-          <w:rFonts w:ascii="Lato" w:hAnsi="Lato" w:eastAsia="Lato" w:cs="Lato"/>
-          <w:sz w:val="24"/>
-          <w:szCs w:val="24"/>
-        </w:rPr>
-        <w:t xml:space="preserve"> </w:t>
-      </w:r>
-      <w:r>
-        <w:rPr>
-          <w:rFonts w:ascii="Lato" w:hAnsi="Lato" w:eastAsia="Lato" w:cs="Lato"/>
-          <w:sz w:val="24"/>
-          <w:szCs w:val="24"/>
-        </w:rPr>
-        <w:t xml:space="preserve">registrado.</w:t>
+        <w:t xml:space="preserve">Para novas chamadas, modelos Grok fora dessas rotas são rejeitados; runs históricos já congelados</w:t>
+      </w:r>
+      <w:r>
+        <w:rPr>
+          <w:rFonts w:ascii="Lato" w:hAnsi="Lato" w:eastAsia="Lato" w:cs="Lato"/>
+          <w:sz w:val="24"/>
+          <w:szCs w:val="24"/>
+        </w:rPr>
+        <w:t xml:space="preserve"> </w:t>
+      </w:r>
+      <w:r>
+        <w:rPr>
+          <w:rFonts w:ascii="Lato" w:hAnsi="Lato" w:eastAsia="Lato" w:cs="Lato"/>
+          <w:sz w:val="24"/>
+          <w:szCs w:val="24"/>
+        </w:rPr>
+        <w:t xml:space="preserve">preservam o modelo registrado.</w:t>
       </w:r>
       <w:r>
         <w:rPr>
@@ -13116,23 +13182,23 @@
           <w:sz w:val="24"/>
           <w:szCs w:val="24"/>
         </w:rPr>
-        <w:t xml:space="preserve">Grok 4.6 High, GLM 5.3, DeepSeek V4 Pro, Kimi K3 e Qwen 3.8 Max. O Grok usa</w:t>
-      </w:r>
-      <w:r>
-        <w:rPr>
-          <w:rFonts w:ascii="Lato" w:hAnsi="Lato" w:eastAsia="Lato" w:cs="Lato"/>
-          <w:sz w:val="24"/>
-          <w:szCs w:val="24"/>
-        </w:rPr>
-        <w:t xml:space="preserve"> </w:t>
-      </w:r>
-      <w:r>
-        <w:rPr>
-          <w:rFonts w:ascii="Lato" w:hAnsi="Lato" w:eastAsia="Lato" w:cs="Lato"/>
-          <w:sz w:val="24"/>
-          <w:szCs w:val="24"/>
-        </w:rPr>
-        <w:t xml:space="preserve">exclusivamente o Cursor CLI na porta 3144; GLM, DeepSeek e Qwen usam o OpenCode Go</w:t>
+        <w:t xml:space="preserve">Grok 4.6, GLM 5.3, DeepSeek V4 Pro, Kimi K3 e Qwen 3.8 Max. Na porta 3144,</w:t>
+      </w:r>
+      <w:r>
+        <w:rPr>
+          <w:rFonts w:ascii="Lato" w:hAnsi="Lato" w:eastAsia="Lato" w:cs="Lato"/>
+          <w:sz w:val="24"/>
+          <w:szCs w:val="24"/>
+        </w:rPr>
+        <w:t xml:space="preserve"> </w:t>
+      </w:r>
+      <w:r>
+        <w:rPr>
+          <w:rFonts w:ascii="Lato" w:hAnsi="Lato" w:eastAsia="Lato" w:cs="Lato"/>
+          <w:sz w:val="24"/>
+          <w:szCs w:val="24"/>
+        </w:rPr>
+        <w:t xml:space="preserve">o Grok pode usar Cursor CLI ou a CLI oficial da xAI; GLM, DeepSeek e Qwen usam o OpenCode Go</w:t>
       </w:r>
       <w:r>
         <w:rPr>
@@ -13189,23 +13255,39 @@
           <w:sz w:val="24"/>
           <w:szCs w:val="24"/>
         </w:rPr>
-        <w:t xml:space="preserve">Code na porta 3147.</w:t>
-      </w:r>
-      <w:r>
-        <w:rPr>
-          <w:rFonts w:ascii="Lato" w:hAnsi="Lato" w:eastAsia="Lato" w:cs="Lato"/>
-          <w:sz w:val="24"/>
-          <w:szCs w:val="24"/>
-        </w:rPr>
-        <w:t xml:space="preserve"> </w:t>
-      </w:r>
-      <w:r>
-        <w:rPr>
-          <w:rFonts w:ascii="Lato" w:hAnsi="Lato" w:eastAsia="Lato" w:cs="Lato"/>
-          <w:sz w:val="24"/>
-          <w:szCs w:val="24"/>
-        </w:rPr>
-        <w:t xml:space="preserve">Os modelos são fixos e não há fallback silencioso.</w:t>
+        <w:t xml:space="preserve">Code na porta 3147. Pelo painel, os modelos podem ser escolhidos nos catálogos reais do</w:t>
+      </w:r>
+      <w:r>
+        <w:rPr>
+          <w:rFonts w:ascii="Lato" w:hAnsi="Lato" w:eastAsia="Lato" w:cs="Lato"/>
+          <w:sz w:val="24"/>
+          <w:szCs w:val="24"/>
+        </w:rPr>
+        <w:t xml:space="preserve"> </w:t>
+      </w:r>
+      <w:r>
+        <w:rPr>
+          <w:rFonts w:ascii="Lato" w:hAnsi="Lato" w:eastAsia="Lato" w:cs="Lato"/>
+          <w:sz w:val="24"/>
+          <w:szCs w:val="24"/>
+        </w:rPr>
+        <w:t xml:space="preserve">OpenCode, Cursor e Antigravity. Claude, Codex, Kimi e a rota oficial do Grok permanecem</w:t>
+      </w:r>
+      <w:r>
+        <w:rPr>
+          <w:rFonts w:ascii="Lato" w:hAnsi="Lato" w:eastAsia="Lato" w:cs="Lato"/>
+          <w:sz w:val="24"/>
+          <w:szCs w:val="24"/>
+        </w:rPr>
+        <w:t xml:space="preserve"> </w:t>
+      </w:r>
+      <w:r>
+        <w:rPr>
+          <w:rFonts w:ascii="Lato" w:hAnsi="Lato" w:eastAsia="Lato" w:cs="Lato"/>
+          <w:sz w:val="24"/>
+          <w:szCs w:val="24"/>
+        </w:rPr>
+        <w:t xml:space="preserve">fixos. Nenhuma rota usa fallback silencioso.</w:t>
       </w:r>
     </w:p>
     <w:p>
@@ -13355,6 +13437,575 @@
           <w:szCs w:val="24"/>
         </w:rPr>
         <w:t xml:space="preserve">substitui a seleção apenas na execução atual.</w:t>
+      </w:r>
+    </w:p>
+    <w:p>
+      <w:pPr>
+        <w:pStyle w:val="BodyText"/>
+        <w:spacing w:line="360" w:lineRule="auto" w:after="100"/>
+        <w:ind w:firstLine="504"/>
+        <w:jc w:val="both"/>
+      </w:pPr>
+      <w:r>
+        <w:rPr>
+          <w:rFonts w:ascii="Lato" w:hAnsi="Lato" w:eastAsia="Lato" w:cs="Lato"/>
+          <w:sz w:val="24"/>
+          <w:szCs w:val="24"/>
+        </w:rPr>
+        <w:t xml:space="preserve">O botão</w:t>
+      </w:r>
+      <w:r>
+        <w:rPr>
+          <w:rFonts w:ascii="Lato" w:hAnsi="Lato" w:eastAsia="Lato" w:cs="Lato"/>
+          <w:sz w:val="24"/>
+          <w:szCs w:val="24"/>
+        </w:rPr>
+        <w:t xml:space="preserve"> </w:t>
+      </w:r>
+      <w:r>
+        <w:rPr>
+          <w:rFonts w:ascii="Lato" w:hAnsi="Lato" w:eastAsia="Lato" w:cs="Lato"/>
+          <w:b/>
+          <w:bCs/>
+          <w:sz w:val="24"/>
+          <w:szCs w:val="24"/>
+        </w:rPr>
+        <w:t xml:space="preserve">Modelos e CLIs</w:t>
+      </w:r>
+      <w:r>
+        <w:rPr>
+          <w:rFonts w:ascii="Lato" w:hAnsi="Lato" w:eastAsia="Lato" w:cs="Lato"/>
+          <w:sz w:val="24"/>
+          <w:szCs w:val="24"/>
+        </w:rPr>
+        <w:t xml:space="preserve"> </w:t>
+      </w:r>
+      <w:r>
+        <w:rPr>
+          <w:rFonts w:ascii="Lato" w:hAnsi="Lato" w:eastAsia="Lato" w:cs="Lato"/>
+          <w:sz w:val="24"/>
+          <w:szCs w:val="24"/>
+        </w:rPr>
+        <w:t xml:space="preserve">abre um quadro com agente, CLI, rota, modelo configurado,</w:t>
+      </w:r>
+      <w:r>
+        <w:rPr>
+          <w:rFonts w:ascii="Lato" w:hAnsi="Lato" w:eastAsia="Lato" w:cs="Lato"/>
+          <w:sz w:val="24"/>
+          <w:szCs w:val="24"/>
+        </w:rPr>
+        <w:t xml:space="preserve"> </w:t>
+      </w:r>
+      <w:r>
+        <w:rPr>
+          <w:rFonts w:ascii="Lato" w:hAnsi="Lato" w:eastAsia="Lato" w:cs="Lato"/>
+          <w:sz w:val="24"/>
+          <w:szCs w:val="24"/>
+        </w:rPr>
+        <w:t xml:space="preserve">modelo observado, provedor, esforço e estado. Os seletores são preenchidos por</w:t>
+      </w:r>
+      <w:r>
+        <w:rPr>
+          <w:rFonts w:ascii="Lato" w:hAnsi="Lato" w:eastAsia="Lato" w:cs="Lato"/>
+          <w:sz w:val="24"/>
+          <w:szCs w:val="24"/>
+        </w:rPr>
+        <w:t xml:space="preserve"> </w:t>
+      </w:r>
+      <w:r>
+        <w:rPr>
+          <w:rFonts w:ascii="Lato" w:hAnsi="Lato" w:eastAsia="Lato" w:cs="Lato"/>
+          <w:rStyle w:val="VerbatimChar"/>
+          <w:sz w:val="24"/>
+          <w:szCs w:val="24"/>
+        </w:rPr>
+        <w:t xml:space="preserve">opencode models</w:t>
+      </w:r>
+      <w:r>
+        <w:rPr>
+          <w:rFonts w:ascii="Lato" w:hAnsi="Lato" w:eastAsia="Lato" w:cs="Lato"/>
+          <w:sz w:val="24"/>
+          <w:szCs w:val="24"/>
+        </w:rPr>
+        <w:t xml:space="preserve">,</w:t>
+      </w:r>
+      <w:r>
+        <w:rPr>
+          <w:rFonts w:ascii="Lato" w:hAnsi="Lato" w:eastAsia="Lato" w:cs="Lato"/>
+          <w:sz w:val="24"/>
+          <w:szCs w:val="24"/>
+        </w:rPr>
+        <w:t xml:space="preserve"> </w:t>
+      </w:r>
+      <w:r>
+        <w:rPr>
+          <w:rFonts w:ascii="Lato" w:hAnsi="Lato" w:eastAsia="Lato" w:cs="Lato"/>
+          <w:rStyle w:val="VerbatimChar"/>
+          <w:sz w:val="24"/>
+          <w:szCs w:val="24"/>
+        </w:rPr>
+        <w:t xml:space="preserve">cursor-agent --list-models</w:t>
+      </w:r>
+      <w:r>
+        <w:rPr>
+          <w:rFonts w:ascii="Lato" w:hAnsi="Lato" w:eastAsia="Lato" w:cs="Lato"/>
+          <w:sz w:val="24"/>
+          <w:szCs w:val="24"/>
+        </w:rPr>
+        <w:t xml:space="preserve"> </w:t>
+      </w:r>
+      <w:r>
+        <w:rPr>
+          <w:rFonts w:ascii="Lato" w:hAnsi="Lato" w:eastAsia="Lato" w:cs="Lato"/>
+          <w:sz w:val="24"/>
+          <w:szCs w:val="24"/>
+        </w:rPr>
+        <w:t xml:space="preserve">e</w:t>
+      </w:r>
+      <w:r>
+        <w:rPr>
+          <w:rFonts w:ascii="Lato" w:hAnsi="Lato" w:eastAsia="Lato" w:cs="Lato"/>
+          <w:sz w:val="24"/>
+          <w:szCs w:val="24"/>
+        </w:rPr>
+        <w:t xml:space="preserve"> </w:t>
+      </w:r>
+      <w:r>
+        <w:rPr>
+          <w:rFonts w:ascii="Lato" w:hAnsi="Lato" w:eastAsia="Lato" w:cs="Lato"/>
+          <w:rStyle w:val="VerbatimChar"/>
+          <w:sz w:val="24"/>
+          <w:szCs w:val="24"/>
+        </w:rPr>
+        <w:t xml:space="preserve">agy models</w:t>
+      </w:r>
+      <w:r>
+        <w:rPr>
+          <w:rFonts w:ascii="Lato" w:hAnsi="Lato" w:eastAsia="Lato" w:cs="Lato"/>
+          <w:sz w:val="24"/>
+          <w:szCs w:val="24"/>
+        </w:rPr>
+        <w:t xml:space="preserve">. Assim, cada cadeira</w:t>
+      </w:r>
+      <w:r>
+        <w:rPr>
+          <w:rFonts w:ascii="Lato" w:hAnsi="Lato" w:eastAsia="Lato" w:cs="Lato"/>
+          <w:sz w:val="24"/>
+          <w:szCs w:val="24"/>
+        </w:rPr>
+        <w:t xml:space="preserve"> </w:t>
+      </w:r>
+      <w:r>
+        <w:rPr>
+          <w:rFonts w:ascii="Lato" w:hAnsi="Lato" w:eastAsia="Lato" w:cs="Lato"/>
+          <w:sz w:val="24"/>
+          <w:szCs w:val="24"/>
+        </w:rPr>
+        <w:t xml:space="preserve">OpenCode, o Gemini/Antigravity e o Grok na rota Cursor podem receber outro modelo</w:t>
+      </w:r>
+      <w:r>
+        <w:rPr>
+          <w:rFonts w:ascii="Lato" w:hAnsi="Lato" w:eastAsia="Lato" w:cs="Lato"/>
+          <w:sz w:val="24"/>
+          <w:szCs w:val="24"/>
+        </w:rPr>
+        <w:t xml:space="preserve"> </w:t>
+      </w:r>
+      <w:r>
+        <w:rPr>
+          <w:rFonts w:ascii="Lato" w:hAnsi="Lato" w:eastAsia="Lato" w:cs="Lato"/>
+          <w:sz w:val="24"/>
+          <w:szCs w:val="24"/>
+        </w:rPr>
+        <w:t xml:space="preserve">disponível. Na linha do Grok, também selecione</w:t>
+      </w:r>
+      <w:r>
+        <w:rPr>
+          <w:rFonts w:ascii="Lato" w:hAnsi="Lato" w:eastAsia="Lato" w:cs="Lato"/>
+          <w:sz w:val="24"/>
+          <w:szCs w:val="24"/>
+        </w:rPr>
+        <w:t xml:space="preserve"> </w:t>
+      </w:r>
+      <w:r>
+        <w:rPr>
+          <w:rFonts w:ascii="Lato" w:hAnsi="Lato" w:eastAsia="Lato" w:cs="Lato"/>
+          <w:b/>
+          <w:bCs/>
+          <w:sz w:val="24"/>
+          <w:szCs w:val="24"/>
+        </w:rPr>
+        <w:t xml:space="preserve">Cursor CLI</w:t>
+      </w:r>
+      <w:r>
+        <w:rPr>
+          <w:rFonts w:ascii="Lato" w:hAnsi="Lato" w:eastAsia="Lato" w:cs="Lato"/>
+          <w:sz w:val="24"/>
+          <w:szCs w:val="24"/>
+        </w:rPr>
+        <w:t xml:space="preserve"> </w:t>
+      </w:r>
+      <w:r>
+        <w:rPr>
+          <w:rFonts w:ascii="Lato" w:hAnsi="Lato" w:eastAsia="Lato" w:cs="Lato"/>
+          <w:sz w:val="24"/>
+          <w:szCs w:val="24"/>
+        </w:rPr>
+        <w:t xml:space="preserve">ou</w:t>
+      </w:r>
+      <w:r>
+        <w:rPr>
+          <w:rFonts w:ascii="Lato" w:hAnsi="Lato" w:eastAsia="Lato" w:cs="Lato"/>
+          <w:sz w:val="24"/>
+          <w:szCs w:val="24"/>
+        </w:rPr>
+        <w:t xml:space="preserve"> </w:t>
+      </w:r>
+      <w:r>
+        <w:rPr>
+          <w:rFonts w:ascii="Lato" w:hAnsi="Lato" w:eastAsia="Lato" w:cs="Lato"/>
+          <w:b/>
+          <w:bCs/>
+          <w:sz w:val="24"/>
+          <w:szCs w:val="24"/>
+        </w:rPr>
+        <w:t xml:space="preserve">xAI CLI oficial</w:t>
+      </w:r>
+      <w:r>
+        <w:rPr>
+          <w:rFonts w:ascii="Lato" w:hAnsi="Lato" w:eastAsia="Lato" w:cs="Lato"/>
+          <w:sz w:val="24"/>
+          <w:szCs w:val="24"/>
+        </w:rPr>
+        <w:t xml:space="preserve">.</w:t>
+      </w:r>
+      <w:r>
+        <w:rPr>
+          <w:rFonts w:ascii="Lato" w:hAnsi="Lato" w:eastAsia="Lato" w:cs="Lato"/>
+          <w:sz w:val="24"/>
+          <w:szCs w:val="24"/>
+        </w:rPr>
+        <w:t xml:space="preserve"> </w:t>
+      </w:r>
+      <w:r>
+        <w:rPr>
+          <w:rFonts w:ascii="Lato" w:hAnsi="Lato" w:eastAsia="Lato" w:cs="Lato"/>
+          <w:sz w:val="24"/>
+          <w:szCs w:val="24"/>
+        </w:rPr>
+        <w:t xml:space="preserve">As preferências ficam no navegador e são reaplicadas após reinício. Modelo ausente</w:t>
+      </w:r>
+      <w:r>
+        <w:rPr>
+          <w:rFonts w:ascii="Lato" w:hAnsi="Lato" w:eastAsia="Lato" w:cs="Lato"/>
+          <w:sz w:val="24"/>
+          <w:szCs w:val="24"/>
+        </w:rPr>
+        <w:t xml:space="preserve"> </w:t>
+      </w:r>
+      <w:r>
+        <w:rPr>
+          <w:rFonts w:ascii="Lato" w:hAnsi="Lato" w:eastAsia="Lato" w:cs="Lato"/>
+          <w:sz w:val="24"/>
+          <w:szCs w:val="24"/>
+        </w:rPr>
+        <w:t xml:space="preserve">é recusado e a troca aguarda tarefas ativas terminarem. A rota oficial exige</w:t>
+      </w:r>
+      <w:r>
+        <w:rPr>
+          <w:rFonts w:ascii="Lato" w:hAnsi="Lato" w:eastAsia="Lato" w:cs="Lato"/>
+          <w:sz w:val="24"/>
+          <w:szCs w:val="24"/>
+        </w:rPr>
+        <w:t xml:space="preserve"> </w:t>
+      </w:r>
+      <w:r>
+        <w:rPr>
+          <w:rFonts w:ascii="Lato" w:hAnsi="Lato" w:eastAsia="Lato" w:cs="Lato"/>
+          <w:rStyle w:val="VerbatimChar"/>
+          <w:sz w:val="24"/>
+          <w:szCs w:val="24"/>
+        </w:rPr>
+        <w:t xml:space="preserve">grok login</w:t>
+      </w:r>
+      <w:r>
+        <w:rPr>
+          <w:rFonts w:ascii="Lato" w:hAnsi="Lato" w:eastAsia="Lato" w:cs="Lato"/>
+          <w:sz w:val="24"/>
+          <w:szCs w:val="24"/>
+        </w:rPr>
+        <w:t xml:space="preserve">; se a sessão não estiver autenticada, o painel informa</w:t>
+      </w:r>
+      <w:r>
+        <w:rPr>
+          <w:rFonts w:ascii="Lato" w:hAnsi="Lato" w:eastAsia="Lato" w:cs="Lato"/>
+          <w:sz w:val="24"/>
+          <w:szCs w:val="24"/>
+        </w:rPr>
+        <w:t xml:space="preserve"> </w:t>
+      </w:r>
+      <w:r>
+        <w:rPr>
+          <w:rFonts w:ascii="Lato" w:hAnsi="Lato" w:eastAsia="Lato" w:cs="Lato"/>
+          <w:rStyle w:val="VerbatimChar"/>
+          <w:sz w:val="24"/>
+          <w:szCs w:val="24"/>
+        </w:rPr>
+        <w:t xml:space="preserve">login necessário</w:t>
+      </w:r>
+      <w:r>
+        <w:rPr>
+          <w:rFonts w:ascii="Lato" w:hAnsi="Lato" w:eastAsia="Lato" w:cs="Lato"/>
+          <w:sz w:val="24"/>
+          <w:szCs w:val="24"/>
+        </w:rPr>
+        <w:t xml:space="preserve"> </w:t>
+      </w:r>
+      <w:r>
+        <w:rPr>
+          <w:rFonts w:ascii="Lato" w:hAnsi="Lato" w:eastAsia="Lato" w:cs="Lato"/>
+          <w:sz w:val="24"/>
+          <w:szCs w:val="24"/>
+        </w:rPr>
+        <w:t xml:space="preserve">e não recorre ao Cursor.</w:t>
+      </w:r>
+    </w:p>
+    <w:p>
+      <w:pPr>
+        <w:pStyle w:val="BodyText"/>
+        <w:spacing w:line="360" w:lineRule="auto" w:after="100"/>
+        <w:ind w:firstLine="504"/>
+        <w:jc w:val="both"/>
+      </w:pPr>
+      <w:r>
+        <w:rPr>
+          <w:rFonts w:ascii="Lato" w:hAnsi="Lato" w:eastAsia="Lato" w:cs="Lato"/>
+          <w:sz w:val="24"/>
+          <w:szCs w:val="24"/>
+        </w:rPr>
+        <w:t xml:space="preserve">O botão</w:t>
+      </w:r>
+      <w:r>
+        <w:rPr>
+          <w:rFonts w:ascii="Lato" w:hAnsi="Lato" w:eastAsia="Lato" w:cs="Lato"/>
+          <w:sz w:val="24"/>
+          <w:szCs w:val="24"/>
+        </w:rPr>
+        <w:t xml:space="preserve"> </w:t>
+      </w:r>
+      <w:r>
+        <w:rPr>
+          <w:rFonts w:ascii="Lato" w:hAnsi="Lato" w:eastAsia="Lato" w:cs="Lato"/>
+          <w:b/>
+          <w:bCs/>
+          <w:sz w:val="24"/>
+          <w:szCs w:val="24"/>
+        </w:rPr>
+        <w:t xml:space="preserve">Artefatos</w:t>
+      </w:r>
+      <w:r>
+        <w:rPr>
+          <w:rFonts w:ascii="Lato" w:hAnsi="Lato" w:eastAsia="Lato" w:cs="Lato"/>
+          <w:sz w:val="24"/>
+          <w:szCs w:val="24"/>
+        </w:rPr>
+        <w:t xml:space="preserve"> </w:t>
+      </w:r>
+      <w:r>
+        <w:rPr>
+          <w:rFonts w:ascii="Lato" w:hAnsi="Lato" w:eastAsia="Lato" w:cs="Lato"/>
+          <w:sz w:val="24"/>
+          <w:szCs w:val="24"/>
+        </w:rPr>
+        <w:t xml:space="preserve">reúne, fora do feed, os resultados materiais preservados nas tarefas</w:t>
+      </w:r>
+      <w:r>
+        <w:rPr>
+          <w:rFonts w:ascii="Lato" w:hAnsi="Lato" w:eastAsia="Lato" w:cs="Lato"/>
+          <w:sz w:val="24"/>
+          <w:szCs w:val="24"/>
+        </w:rPr>
+        <w:t xml:space="preserve"> </w:t>
+      </w:r>
+      <w:r>
+        <w:rPr>
+          <w:rFonts w:ascii="Lato" w:hAnsi="Lato" w:eastAsia="Lato" w:cs="Lato"/>
+          <w:sz w:val="24"/>
+          <w:szCs w:val="24"/>
+        </w:rPr>
+        <w:t xml:space="preserve">recentes. Cada cartão identifica a tarefa e a versão de origem e oferece nome, descrição,</w:t>
+      </w:r>
+      <w:r>
+        <w:rPr>
+          <w:rFonts w:ascii="Lato" w:hAnsi="Lato" w:eastAsia="Lato" w:cs="Lato"/>
+          <w:sz w:val="24"/>
+          <w:szCs w:val="24"/>
+        </w:rPr>
+        <w:t xml:space="preserve"> </w:t>
+      </w:r>
+      <w:r>
+        <w:rPr>
+          <w:rFonts w:ascii="Lato" w:hAnsi="Lato" w:eastAsia="Lato" w:cs="Lato"/>
+          <w:sz w:val="24"/>
+          <w:szCs w:val="24"/>
+        </w:rPr>
+        <w:t xml:space="preserve">tamanho, hash SHA-256, pré-visualização e download individual. A lista inclui Markdown,</w:t>
+      </w:r>
+      <w:r>
+        <w:rPr>
+          <w:rFonts w:ascii="Lato" w:hAnsi="Lato" w:eastAsia="Lato" w:cs="Lato"/>
+          <w:sz w:val="24"/>
+          <w:szCs w:val="24"/>
+        </w:rPr>
+        <w:t xml:space="preserve"> </w:t>
+      </w:r>
+      <w:r>
+        <w:rPr>
+          <w:rFonts w:ascii="Lato" w:hAnsi="Lato" w:eastAsia="Lato" w:cs="Lato"/>
+          <w:sz w:val="24"/>
+          <w:szCs w:val="24"/>
+        </w:rPr>
+        <w:t xml:space="preserve">Word, PDF, código, arquivos A2A e</w:t>
+      </w:r>
+      <w:r>
+        <w:rPr>
+          <w:rFonts w:ascii="Lato" w:hAnsi="Lato" w:eastAsia="Lato" w:cs="Lato"/>
+          <w:sz w:val="24"/>
+          <w:szCs w:val="24"/>
+        </w:rPr>
+        <w:t xml:space="preserve"> </w:t>
+      </w:r>
+      <w:r>
+        <w:rPr>
+          <w:rFonts w:ascii="Lato" w:hAnsi="Lato" w:eastAsia="Lato" w:cs="Lato"/>
+          <w:rStyle w:val="VerbatimChar"/>
+          <w:sz w:val="24"/>
+          <w:szCs w:val="24"/>
+        </w:rPr>
+        <w:t xml:space="preserve">partial-output.md</w:t>
+      </w:r>
+      <w:r>
+        <w:rPr>
+          <w:rFonts w:ascii="Lato" w:hAnsi="Lato" w:eastAsia="Lato" w:cs="Lato"/>
+          <w:sz w:val="24"/>
+          <w:szCs w:val="24"/>
+        </w:rPr>
+        <w:t xml:space="preserve">; limpar o feed não a apaga. Arquivos</w:t>
+      </w:r>
+      <w:r>
+        <w:rPr>
+          <w:rFonts w:ascii="Lato" w:hAnsi="Lato" w:eastAsia="Lato" w:cs="Lato"/>
+          <w:sz w:val="24"/>
+          <w:szCs w:val="24"/>
+        </w:rPr>
+        <w:t xml:space="preserve"> </w:t>
+      </w:r>
+      <w:r>
+        <w:rPr>
+          <w:rFonts w:ascii="Lato" w:hAnsi="Lato" w:eastAsia="Lato" w:cs="Lato"/>
+          <w:sz w:val="24"/>
+          <w:szCs w:val="24"/>
+        </w:rPr>
+        <w:t xml:space="preserve">criados por</w:t>
+      </w:r>
+      <w:r>
+        <w:rPr>
+          <w:rFonts w:ascii="Lato" w:hAnsi="Lato" w:eastAsia="Lato" w:cs="Lato"/>
+          <w:sz w:val="24"/>
+          <w:szCs w:val="24"/>
+        </w:rPr>
+        <w:t xml:space="preserve"> </w:t>
+      </w:r>
+      <w:r>
+        <w:rPr>
+          <w:rFonts w:ascii="Lato" w:hAnsi="Lato" w:eastAsia="Lato" w:cs="Lato"/>
+          <w:rStyle w:val="VerbatimChar"/>
+          <w:sz w:val="24"/>
+          <w:szCs w:val="24"/>
+        </w:rPr>
+        <w:t xml:space="preserve">write_file</w:t>
+      </w:r>
+      <w:r>
+        <w:rPr>
+          <w:rFonts w:ascii="Lato" w:hAnsi="Lato" w:eastAsia="Lato" w:cs="Lato"/>
+          <w:sz w:val="24"/>
+          <w:szCs w:val="24"/>
+        </w:rPr>
+        <w:t xml:space="preserve"> </w:t>
+      </w:r>
+      <w:r>
+        <w:rPr>
+          <w:rFonts w:ascii="Lato" w:hAnsi="Lato" w:eastAsia="Lato" w:cs="Lato"/>
+          <w:sz w:val="24"/>
+          <w:szCs w:val="24"/>
+        </w:rPr>
+        <w:t xml:space="preserve">são registrados automaticamente. Nas CLIs nativas, o agente declara</w:t>
+      </w:r>
+      <w:r>
+        <w:rPr>
+          <w:rFonts w:ascii="Lato" w:hAnsi="Lato" w:eastAsia="Lato" w:cs="Lato"/>
+          <w:sz w:val="24"/>
+          <w:szCs w:val="24"/>
+        </w:rPr>
+        <w:t xml:space="preserve"> </w:t>
+      </w:r>
+      <w:r>
+        <w:rPr>
+          <w:rFonts w:ascii="Lato" w:hAnsi="Lato" w:eastAsia="Lato" w:cs="Lato"/>
+          <w:sz w:val="24"/>
+          <w:szCs w:val="24"/>
+        </w:rPr>
+        <w:t xml:space="preserve">os arquivos que efetivamente criou ou modificou; o runtime copia cada versão para o depósito</w:t>
+      </w:r>
+      <w:r>
+        <w:rPr>
+          <w:rFonts w:ascii="Lato" w:hAnsi="Lato" w:eastAsia="Lato" w:cs="Lato"/>
+          <w:sz w:val="24"/>
+          <w:szCs w:val="24"/>
+        </w:rPr>
+        <w:t xml:space="preserve"> </w:t>
+      </w:r>
+      <w:r>
+        <w:rPr>
+          <w:rFonts w:ascii="Lato" w:hAnsi="Lato" w:eastAsia="Lato" w:cs="Lato"/>
+          <w:sz w:val="24"/>
+          <w:szCs w:val="24"/>
+        </w:rPr>
+        <w:t xml:space="preserve">imutável do Mesh antes da conclusão. O limite padrão é 100 MB por arquivo. O botão</w:t>
+      </w:r>
+      <w:r>
+        <w:rPr>
+          <w:rFonts w:ascii="Lato" w:hAnsi="Lato" w:eastAsia="Lato" w:cs="Lato"/>
+          <w:sz w:val="24"/>
+          <w:szCs w:val="24"/>
+        </w:rPr>
+        <w:t xml:space="preserve"> </w:t>
+      </w:r>
+      <w:r>
+        <w:rPr>
+          <w:rFonts w:ascii="Lato" w:hAnsi="Lato" w:eastAsia="Lato" w:cs="Lato"/>
+          <w:b/>
+          <w:bCs/>
+          <w:sz w:val="24"/>
+          <w:szCs w:val="24"/>
+        </w:rPr>
+        <w:t xml:space="preserve">Claro/Escuro</w:t>
+      </w:r>
+      <w:r>
+        <w:rPr>
+          <w:rFonts w:ascii="Lato" w:hAnsi="Lato" w:eastAsia="Lato" w:cs="Lato"/>
+          <w:sz w:val="24"/>
+          <w:szCs w:val="24"/>
+        </w:rPr>
+        <w:t xml:space="preserve"> </w:t>
+      </w:r>
+      <w:r>
+        <w:rPr>
+          <w:rFonts w:ascii="Lato" w:hAnsi="Lato" w:eastAsia="Lato" w:cs="Lato"/>
+          <w:sz w:val="24"/>
+          <w:szCs w:val="24"/>
+        </w:rPr>
+        <w:t xml:space="preserve">alterna a paleta do painel e persiste a preferência no navegador.</w:t>
       </w:r>
     </w:p>
     <w:p>
@@ -28617,7 +29268,7 @@
                 <w:sz w:val="24"/>
                 <w:szCs w:val="24"/>
               </w:rPr>
-              <w:t>ponte para Cursor CLI · cursor-grok-4.6-high</w:t>
+              <w:t>ponte para a rota Grok selecionada: Cursor · cursor-grok-4.6-high ou xAI CLI oficial · grok-4.6</w:t>
             </w:r>
           </w:p>
         </w:tc>
@@ -29171,40 +29822,23 @@
           <w:sz w:val="24"/>
           <w:szCs w:val="24"/>
         </w:rPr>
-        <w:t xml:space="preserve">OpenCode são pontes para</w:t>
-      </w:r>
-      <w:r>
-        <w:rPr>
-          <w:rFonts w:ascii="Lato" w:hAnsi="Lato" w:eastAsia="Lato" w:cs="Lato"/>
-          <w:sz w:val="24"/>
-          <w:szCs w:val="24"/>
-        </w:rPr>
-        <w:t xml:space="preserve"> </w:t>
-      </w:r>
-      <w:r>
-        <w:rPr>
-          <w:rFonts w:ascii="Lato" w:hAnsi="Lato" w:eastAsia="Lato" w:cs="Lato"/>
-          <w:rStyle w:val="VerbatimChar"/>
-          <w:sz w:val="24"/>
-          <w:szCs w:val="24"/>
-        </w:rPr>
-        <w:t xml:space="preserve">cursor-grok-4.6-high</w:t>
-      </w:r>
-      <w:r>
-        <w:rPr>
-          <w:rFonts w:ascii="Lato" w:hAnsi="Lato" w:eastAsia="Lato" w:cs="Lato"/>
-          <w:sz w:val="24"/>
-          <w:szCs w:val="24"/>
-        </w:rPr>
-        <w:t xml:space="preserve"> </w:t>
-      </w:r>
-      <w:r>
-        <w:rPr>
-          <w:rFonts w:ascii="Lato" w:hAnsi="Lato" w:eastAsia="Lato" w:cs="Lato"/>
-          <w:sz w:val="24"/>
-          <w:szCs w:val="24"/>
-        </w:rPr>
-        <w:t xml:space="preserve">no Cursor.</w:t>
+        <w:t xml:space="preserve">OpenCode são pontes para a rota ativa no Mesh, preservando no recibo se a execução</w:t>
+      </w:r>
+      <w:r>
+        <w:rPr>
+          <w:rFonts w:ascii="Lato" w:hAnsi="Lato" w:eastAsia="Lato" w:cs="Lato"/>
+          <w:sz w:val="24"/>
+          <w:szCs w:val="24"/>
+        </w:rPr>
+        <w:t xml:space="preserve"> </w:t>
+      </w:r>
+      <w:r>
+        <w:rPr>
+          <w:rFonts w:ascii="Lato" w:hAnsi="Lato" w:eastAsia="Lato" w:cs="Lato"/>
+          <w:sz w:val="24"/>
+          <w:szCs w:val="24"/>
+        </w:rPr>
+        <w:t xml:space="preserve">usou Cursor ou a CLI oficial da xAI.</w:t>
       </w:r>
     </w:p>
     <w:p>

</xml_diff>